<commit_message>
5.11 analysis for reporting and interpretive claims
</commit_message>
<xml_diff>
--- a/outputs/tables_methods_synthesis_simpler.docx
+++ b/outputs/tables_methods_synthesis_simpler.docx
@@ -21563,6 +21563,991 @@
     </w:p>
     <w:p>
       <w:pPr>
+        <w:pStyle w:val="Normal"/>
+      </w:pPr>
+      <w:r>
+        <w:rPr/>
+        <w:drawing>
+          <wp:inline distT="0" distB="0" distL="0" distR="0">
+            <wp:extent cx="5669280" cy="4754880"/>
+            <wp:docPr id="1" name="" descr=""/>
+            <wp:cNvGraphicFramePr>
+              <a:graphicFrameLocks xmlns:a="http://schemas.openxmlformats.org/drawingml/2006/main" noChangeAspect="1"/>
+            </wp:cNvGraphicFramePr>
+            <a:graphic xmlns:a="http://schemas.openxmlformats.org/drawingml/2006/main">
+              <a:graphicData uri="http://schemas.openxmlformats.org/drawingml/2006/picture">
+                <pic:pic xmlns:pic="http://schemas.openxmlformats.org/drawingml/2006/picture">
+                  <pic:nvPicPr>
+                    <pic:cNvPr id="2" name=""/>
+                    <pic:cNvPicPr>
+                      <a:picLocks noChangeAspect="1" noChangeArrowheads="1"/>
+                    </pic:cNvPicPr>
+                  </pic:nvPicPr>
+                  <pic:blipFill>
+                    <a:blip r:embed="rId7"/>
+                    <a:stretch>
+                      <a:fillRect/>
+                    </a:stretch>
+                  </pic:blipFill>
+                  <pic:spPr bwMode="auto">
+                    <a:xfrm>
+                      <a:off x="0" y="0"/>
+                      <a:ext cx="5669280" cy="4754880"/>
+                    </a:xfrm>
+                    <a:prstGeom prst="rect">
+                      <a:avLst/>
+                    </a:prstGeom>
+                    <a:noFill/>
+                  </pic:spPr>
+                </pic:pic>
+              </a:graphicData>
+            </a:graphic>
+          </wp:inline>
+        </w:drawing>
+      </w:r>
+    </w:p>
+    <w:p>
+      <w:pPr>
+        <w:pStyle w:val="Normal"/>
+      </w:pPr>
+      <w:r>
+        <w:t xml:space="preserve"/>
+      </w:r>
+    </w:p>
+    <w:p>
+      <w:pPr>
+        <w:pStyle w:val="TableCaption"/>
+        <w:jc w:val="center"/>
+        <w:keepNext/>
+        <w:pBdr>
+          <w:bottom w:val="none" w:sz="0" w:space="0" w:color="000000"/>
+          <w:top w:val="none" w:sz="0" w:space="0" w:color="000000"/>
+          <w:left w:val="none" w:sz="0" w:space="0" w:color="000000"/>
+          <w:right w:val="none" w:sz="0" w:space="0" w:color="000000"/>
+        </w:pBdr>
+        <w:spacing w:after="60" w:before="60" w:line="240"/>
+        <w:ind w:left="60" w:right="60" w:firstLine="0" w:firstLineChars="0"/>
+      </w:pPr>
+      <w:r>
+        <w:t xml:space="preserve">Coding reliability indicators</w:t>
+      </w:r>
+    </w:p>
+    <w:tbl xmlns:a="http://schemas.openxmlformats.org/drawingml/2006/main" xmlns:pic="http://schemas.openxmlformats.org/drawingml/2006/picture">
+      <w:tblPr>
+        <w:tblLayout w:type="fixed"/>
+        <w:jc w:val="center"/>
+        <w:tblLook w:firstRow="1" w:lastRow="0" w:firstColumn="0" w:lastColumn="0" w:noHBand="0" w:noVBand="1"/>
+      </w:tblPr>
+      <w:tblGrid>
+        <w:gridCol w:w="4263"/>
+        <w:gridCol w:w="1474"/>
+        <w:gridCol w:w="1976"/>
+        <w:gridCol w:w="1169"/>
+      </w:tblGrid>
+      <w:tr>
+        <w:trPr>
+          <w:trHeight w:val="617" w:hRule="auto"/>
+          <w:tblHeader/>
+        </w:trPr>
+        <w:tc>
+          <w:tcPr>
+            <w:tcBorders>
+              <w:bottom w:val="single" w:sz="12" w:space="0" w:color="666666"/>
+              <w:top w:val="single" w:sz="12" w:space="0" w:color="666666"/>
+              <w:left w:val="none" w:sz="0" w:space="0" w:color="000000"/>
+              <w:right w:val="none" w:sz="0" w:space="0" w:color="000000"/>
+            </w:tcBorders>
+            <w:shd w:val="clear" w:color="auto" w:fill="FFFFFF"/>
+            <w:tcMar>
+              <w:top w:w="0" w:type="dxa"/>
+              <w:bottom w:w="0" w:type="dxa"/>
+              <w:left w:w="0" w:type="dxa"/>
+              <w:right w:w="0" w:type="dxa"/>
+            </w:tcMar>
+            <w:vAlign w:val="top"/>
+          </w:tcPr>
+          <w:p>
+            <w:pPr>
+              <w:pStyle w:val="Normal"/>
+              <w:jc w:val="left"/>
+              <w:pBdr>
+                <w:bottom w:val="none" w:sz="0" w:space="0" w:color="000000"/>
+                <w:top w:val="none" w:sz="0" w:space="0" w:color="000000"/>
+                <w:left w:val="none" w:sz="0" w:space="0" w:color="000000"/>
+                <w:right w:val="none" w:sz="0" w:space="0" w:color="000000"/>
+              </w:pBdr>
+              <w:spacing w:after="100" w:before="100" w:line="240"/>
+              <w:ind w:left="100" w:right="100" w:firstLine="0" w:firstLineChars="0"/>
+              <w:rPr>
+                <w:rFonts w:ascii="Arial" w:hAnsi="Arial" w:eastAsia="Arial" w:cs="Arial"/>
+                <w:i w:val="false"/>
+                <w:b w:val="false"/>
+                <w:u w:val="none"/>
+                <w:strike w:val="false"/>
+                <w:sz w:val="20"/>
+                <w:szCs w:val="20"/>
+                <w:color w:val="000000"/>
+              </w:rPr>
+            </w:pPr>
+            <w:r>
+              <w:rPr>
+                <w:rFonts w:ascii="Arial" w:hAnsi="Arial" w:eastAsia="Arial" w:cs="Arial"/>
+                <w:i w:val="false"/>
+                <w:b w:val="false"/>
+                <w:u w:val="none"/>
+                <w:strike w:val="false"/>
+                <w:sz w:val="20"/>
+                <w:szCs w:val="20"/>
+                <w:color w:val="000000"/>
+              </w:rPr>
+              <w:t xml:space="preserve">Indicator</w:t>
+            </w:r>
+          </w:p>
+        </w:tc>
+        <w:tc>
+          <w:tcPr>
+            <w:tcBorders>
+              <w:bottom w:val="single" w:sz="12" w:space="0" w:color="666666"/>
+              <w:top w:val="single" w:sz="12" w:space="0" w:color="666666"/>
+              <w:left w:val="none" w:sz="0" w:space="0" w:color="000000"/>
+              <w:right w:val="none" w:sz="0" w:space="0" w:color="000000"/>
+            </w:tcBorders>
+            <w:shd w:val="clear" w:color="auto" w:fill="FFFFFF"/>
+            <w:tcMar>
+              <w:top w:w="0" w:type="dxa"/>
+              <w:bottom w:w="0" w:type="dxa"/>
+              <w:left w:w="0" w:type="dxa"/>
+              <w:right w:w="0" w:type="dxa"/>
+            </w:tcMar>
+            <w:vAlign w:val="top"/>
+          </w:tcPr>
+          <w:p>
+            <w:pPr>
+              <w:pStyle w:val="Normal"/>
+              <w:jc w:val="left"/>
+              <w:pBdr>
+                <w:bottom w:val="none" w:sz="0" w:space="0" w:color="000000"/>
+                <w:top w:val="none" w:sz="0" w:space="0" w:color="000000"/>
+                <w:left w:val="none" w:sz="0" w:space="0" w:color="000000"/>
+                <w:right w:val="none" w:sz="0" w:space="0" w:color="000000"/>
+              </w:pBdr>
+              <w:spacing w:after="100" w:before="100" w:line="240"/>
+              <w:ind w:left="100" w:right="100" w:firstLine="0" w:firstLineChars="0"/>
+              <w:rPr>
+                <w:rFonts w:ascii="Arial" w:hAnsi="Arial" w:eastAsia="Arial" w:cs="Arial"/>
+                <w:i w:val="false"/>
+                <w:b w:val="false"/>
+                <w:u w:val="none"/>
+                <w:strike w:val="false"/>
+                <w:sz w:val="20"/>
+                <w:szCs w:val="20"/>
+                <w:color w:val="000000"/>
+              </w:rPr>
+            </w:pPr>
+            <w:r>
+              <w:rPr>
+                <w:rFonts w:ascii="Arial" w:hAnsi="Arial" w:eastAsia="Arial" w:cs="Arial"/>
+                <w:i w:val="false"/>
+                <w:b w:val="false"/>
+                <w:u w:val="none"/>
+                <w:strike w:val="false"/>
+                <w:sz w:val="20"/>
+                <w:szCs w:val="20"/>
+                <w:color w:val="000000"/>
+              </w:rPr>
+              <w:t xml:space="preserve">n (Studies)</w:t>
+            </w:r>
+          </w:p>
+        </w:tc>
+        <w:tc>
+          <w:tcPr>
+            <w:tcBorders>
+              <w:bottom w:val="single" w:sz="12" w:space="0" w:color="666666"/>
+              <w:top w:val="single" w:sz="12" w:space="0" w:color="666666"/>
+              <w:left w:val="none" w:sz="0" w:space="0" w:color="000000"/>
+              <w:right w:val="none" w:sz="0" w:space="0" w:color="000000"/>
+            </w:tcBorders>
+            <w:shd w:val="clear" w:color="auto" w:fill="FFFFFF"/>
+            <w:tcMar>
+              <w:top w:w="0" w:type="dxa"/>
+              <w:bottom w:w="0" w:type="dxa"/>
+              <w:left w:w="0" w:type="dxa"/>
+              <w:right w:w="0" w:type="dxa"/>
+            </w:tcMar>
+            <w:vAlign w:val="top"/>
+          </w:tcPr>
+          <w:p>
+            <w:pPr>
+              <w:pStyle w:val="Normal"/>
+              <w:jc w:val="left"/>
+              <w:pBdr>
+                <w:bottom w:val="none" w:sz="0" w:space="0" w:color="000000"/>
+                <w:top w:val="none" w:sz="0" w:space="0" w:color="000000"/>
+                <w:left w:val="none" w:sz="0" w:space="0" w:color="000000"/>
+                <w:right w:val="none" w:sz="0" w:space="0" w:color="000000"/>
+              </w:pBdr>
+              <w:spacing w:after="100" w:before="100" w:line="240"/>
+              <w:ind w:left="100" w:right="100" w:firstLine="0" w:firstLineChars="0"/>
+              <w:rPr>
+                <w:rFonts w:ascii="Arial" w:hAnsi="Arial" w:eastAsia="Arial" w:cs="Arial"/>
+                <w:i w:val="false"/>
+                <w:b w:val="false"/>
+                <w:u w:val="none"/>
+                <w:strike w:val="false"/>
+                <w:sz w:val="20"/>
+                <w:szCs w:val="20"/>
+                <w:color w:val="000000"/>
+              </w:rPr>
+            </w:pPr>
+            <w:r>
+              <w:rPr>
+                <w:rFonts w:ascii="Arial" w:hAnsi="Arial" w:eastAsia="Arial" w:cs="Arial"/>
+                <w:i w:val="false"/>
+                <w:b w:val="false"/>
+                <w:u w:val="none"/>
+                <w:strike w:val="false"/>
+                <w:sz w:val="20"/>
+                <w:szCs w:val="20"/>
+                <w:color w:val="000000"/>
+              </w:rPr>
+              <w:t xml:space="preserve">Proportion (n/N)</w:t>
+            </w:r>
+          </w:p>
+        </w:tc>
+        <w:tc>
+          <w:tcPr>
+            <w:tcBorders>
+              <w:bottom w:val="single" w:sz="12" w:space="0" w:color="666666"/>
+              <w:top w:val="single" w:sz="12" w:space="0" w:color="666666"/>
+              <w:left w:val="none" w:sz="0" w:space="0" w:color="000000"/>
+              <w:right w:val="none" w:sz="0" w:space="0" w:color="000000"/>
+            </w:tcBorders>
+            <w:shd w:val="clear" w:color="auto" w:fill="FFFFFF"/>
+            <w:tcMar>
+              <w:top w:w="0" w:type="dxa"/>
+              <w:bottom w:w="0" w:type="dxa"/>
+              <w:left w:w="0" w:type="dxa"/>
+              <w:right w:w="0" w:type="dxa"/>
+            </w:tcMar>
+            <w:vAlign w:val="top"/>
+          </w:tcPr>
+          <w:p>
+            <w:pPr>
+              <w:pStyle w:val="Normal"/>
+              <w:jc w:val="left"/>
+              <w:pBdr>
+                <w:bottom w:val="none" w:sz="0" w:space="0" w:color="000000"/>
+                <w:top w:val="none" w:sz="0" w:space="0" w:color="000000"/>
+                <w:left w:val="none" w:sz="0" w:space="0" w:color="000000"/>
+                <w:right w:val="none" w:sz="0" w:space="0" w:color="000000"/>
+              </w:pBdr>
+              <w:spacing w:after="100" w:before="100" w:line="240"/>
+              <w:ind w:left="100" w:right="100" w:firstLine="0" w:firstLineChars="0"/>
+              <w:rPr>
+                <w:rFonts w:ascii="Arial" w:hAnsi="Arial" w:eastAsia="Arial" w:cs="Arial"/>
+                <w:i w:val="false"/>
+                <w:b w:val="false"/>
+                <w:u w:val="none"/>
+                <w:strike w:val="false"/>
+                <w:sz w:val="20"/>
+                <w:szCs w:val="20"/>
+                <w:color w:val="000000"/>
+              </w:rPr>
+            </w:pPr>
+            <w:r>
+              <w:rPr>
+                <w:rFonts w:ascii="Arial" w:hAnsi="Arial" w:eastAsia="Arial" w:cs="Arial"/>
+                <w:i w:val="false"/>
+                <w:b w:val="false"/>
+                <w:u w:val="none"/>
+                <w:strike w:val="false"/>
+                <w:sz w:val="20"/>
+                <w:szCs w:val="20"/>
+                <w:color w:val="000000"/>
+              </w:rPr>
+              <w:t xml:space="preserve">Percent</w:t>
+            </w:r>
+          </w:p>
+        </w:tc>
+      </w:tr>
+      <w:tr>
+        <w:trPr>
+          <w:trHeight w:val="614" w:hRule="auto"/>
+        </w:trPr>
+        <w:tc>
+          <w:tcPr>
+            <w:tcBorders>
+              <w:bottom w:val="none" w:sz="0" w:space="0" w:color="000000"/>
+              <w:top w:val="single" w:sz="12" w:space="0" w:color="666666"/>
+              <w:left w:val="none" w:sz="0" w:space="0" w:color="000000"/>
+              <w:right w:val="none" w:sz="0" w:space="0" w:color="000000"/>
+            </w:tcBorders>
+            <w:shd w:val="clear" w:color="auto" w:fill="FFFFFF"/>
+            <w:tcMar>
+              <w:top w:w="0" w:type="dxa"/>
+              <w:bottom w:w="0" w:type="dxa"/>
+              <w:left w:w="0" w:type="dxa"/>
+              <w:right w:w="0" w:type="dxa"/>
+            </w:tcMar>
+            <w:vAlign w:val="top"/>
+          </w:tcPr>
+          <w:p>
+            <w:pPr>
+              <w:pStyle w:val="Normal"/>
+              <w:jc w:val="left"/>
+              <w:pBdr>
+                <w:bottom w:val="none" w:sz="0" w:space="0" w:color="000000"/>
+                <w:top w:val="none" w:sz="0" w:space="0" w:color="000000"/>
+                <w:left w:val="none" w:sz="0" w:space="0" w:color="000000"/>
+                <w:right w:val="none" w:sz="0" w:space="0" w:color="000000"/>
+              </w:pBdr>
+              <w:spacing w:after="100" w:before="100" w:line="240"/>
+              <w:ind w:left="100" w:right="100" w:firstLine="0" w:firstLineChars="0"/>
+              <w:rPr>
+                <w:rFonts w:ascii="Arial" w:hAnsi="Arial" w:eastAsia="Arial" w:cs="Arial"/>
+                <w:i w:val="false"/>
+                <w:b w:val="false"/>
+                <w:u w:val="none"/>
+                <w:strike w:val="false"/>
+                <w:sz w:val="20"/>
+                <w:szCs w:val="20"/>
+                <w:color w:val="000000"/>
+              </w:rPr>
+            </w:pPr>
+            <w:r>
+              <w:rPr>
+                <w:rFonts w:ascii="Arial" w:hAnsi="Arial" w:eastAsia="Arial" w:cs="Arial"/>
+                <w:i w:val="false"/>
+                <w:b w:val="false"/>
+                <w:u w:val="none"/>
+                <w:strike w:val="false"/>
+                <w:sz w:val="20"/>
+                <w:szCs w:val="20"/>
+                <w:color w:val="000000"/>
+              </w:rPr>
+              <w:t xml:space="preserve">Independent coding scheme mentioned</w:t>
+            </w:r>
+          </w:p>
+        </w:tc>
+        <w:tc>
+          <w:tcPr>
+            <w:tcBorders>
+              <w:bottom w:val="none" w:sz="0" w:space="0" w:color="000000"/>
+              <w:top w:val="single" w:sz="12" w:space="0" w:color="666666"/>
+              <w:left w:val="none" w:sz="0" w:space="0" w:color="000000"/>
+              <w:right w:val="none" w:sz="0" w:space="0" w:color="000000"/>
+            </w:tcBorders>
+            <w:shd w:val="clear" w:color="auto" w:fill="FFFFFF"/>
+            <w:tcMar>
+              <w:top w:w="0" w:type="dxa"/>
+              <w:bottom w:w="0" w:type="dxa"/>
+              <w:left w:w="0" w:type="dxa"/>
+              <w:right w:w="0" w:type="dxa"/>
+            </w:tcMar>
+            <w:vAlign w:val="top"/>
+          </w:tcPr>
+          <w:p>
+            <w:pPr>
+              <w:pStyle w:val="Normal"/>
+              <w:jc w:val="left"/>
+              <w:pBdr>
+                <w:bottom w:val="none" w:sz="0" w:space="0" w:color="000000"/>
+                <w:top w:val="none" w:sz="0" w:space="0" w:color="000000"/>
+                <w:left w:val="none" w:sz="0" w:space="0" w:color="000000"/>
+                <w:right w:val="none" w:sz="0" w:space="0" w:color="000000"/>
+              </w:pBdr>
+              <w:spacing w:after="100" w:before="100" w:line="240"/>
+              <w:ind w:left="100" w:right="100" w:firstLine="0" w:firstLineChars="0"/>
+              <w:rPr>
+                <w:rFonts w:ascii="Arial" w:hAnsi="Arial" w:eastAsia="Arial" w:cs="Arial"/>
+                <w:i w:val="false"/>
+                <w:b w:val="false"/>
+                <w:u w:val="none"/>
+                <w:strike w:val="false"/>
+                <w:sz w:val="20"/>
+                <w:szCs w:val="20"/>
+                <w:color w:val="000000"/>
+              </w:rPr>
+            </w:pPr>
+            <w:r>
+              <w:rPr>
+                <w:rFonts w:ascii="Arial" w:hAnsi="Arial" w:eastAsia="Arial" w:cs="Arial"/>
+                <w:i w:val="false"/>
+                <w:b w:val="false"/>
+                <w:u w:val="none"/>
+                <w:strike w:val="false"/>
+                <w:sz w:val="20"/>
+                <w:szCs w:val="20"/>
+                <w:color w:val="000000"/>
+              </w:rPr>
+              <w:t xml:space="preserve">14</w:t>
+            </w:r>
+          </w:p>
+        </w:tc>
+        <w:tc>
+          <w:tcPr>
+            <w:tcBorders>
+              <w:bottom w:val="none" w:sz="0" w:space="0" w:color="000000"/>
+              <w:top w:val="single" w:sz="12" w:space="0" w:color="666666"/>
+              <w:left w:val="none" w:sz="0" w:space="0" w:color="000000"/>
+              <w:right w:val="none" w:sz="0" w:space="0" w:color="000000"/>
+            </w:tcBorders>
+            <w:shd w:val="clear" w:color="auto" w:fill="FFFFFF"/>
+            <w:tcMar>
+              <w:top w:w="0" w:type="dxa"/>
+              <w:bottom w:w="0" w:type="dxa"/>
+              <w:left w:w="0" w:type="dxa"/>
+              <w:right w:w="0" w:type="dxa"/>
+            </w:tcMar>
+            <w:vAlign w:val="top"/>
+          </w:tcPr>
+          <w:p>
+            <w:pPr>
+              <w:pStyle w:val="Normal"/>
+              <w:jc w:val="left"/>
+              <w:pBdr>
+                <w:bottom w:val="none" w:sz="0" w:space="0" w:color="000000"/>
+                <w:top w:val="none" w:sz="0" w:space="0" w:color="000000"/>
+                <w:left w:val="none" w:sz="0" w:space="0" w:color="000000"/>
+                <w:right w:val="none" w:sz="0" w:space="0" w:color="000000"/>
+              </w:pBdr>
+              <w:spacing w:after="100" w:before="100" w:line="240"/>
+              <w:ind w:left="100" w:right="100" w:firstLine="0" w:firstLineChars="0"/>
+              <w:rPr>
+                <w:rFonts w:ascii="Arial" w:hAnsi="Arial" w:eastAsia="Arial" w:cs="Arial"/>
+                <w:i w:val="false"/>
+                <w:b w:val="false"/>
+                <w:u w:val="none"/>
+                <w:strike w:val="false"/>
+                <w:sz w:val="20"/>
+                <w:szCs w:val="20"/>
+                <w:color w:val="000000"/>
+              </w:rPr>
+            </w:pPr>
+            <w:r>
+              <w:rPr>
+                <w:rFonts w:ascii="Arial" w:hAnsi="Arial" w:eastAsia="Arial" w:cs="Arial"/>
+                <w:i w:val="false"/>
+                <w:b w:val="false"/>
+                <w:u w:val="none"/>
+                <w:strike w:val="false"/>
+                <w:sz w:val="20"/>
+                <w:szCs w:val="20"/>
+                <w:color w:val="000000"/>
+              </w:rPr>
+              <w:t xml:space="preserve">14/37</w:t>
+            </w:r>
+          </w:p>
+        </w:tc>
+        <w:tc>
+          <w:tcPr>
+            <w:tcBorders>
+              <w:bottom w:val="none" w:sz="0" w:space="0" w:color="000000"/>
+              <w:top w:val="single" w:sz="12" w:space="0" w:color="666666"/>
+              <w:left w:val="none" w:sz="0" w:space="0" w:color="000000"/>
+              <w:right w:val="none" w:sz="0" w:space="0" w:color="000000"/>
+            </w:tcBorders>
+            <w:shd w:val="clear" w:color="auto" w:fill="FFFFFF"/>
+            <w:tcMar>
+              <w:top w:w="0" w:type="dxa"/>
+              <w:bottom w:w="0" w:type="dxa"/>
+              <w:left w:w="0" w:type="dxa"/>
+              <w:right w:w="0" w:type="dxa"/>
+            </w:tcMar>
+            <w:vAlign w:val="top"/>
+          </w:tcPr>
+          <w:p>
+            <w:pPr>
+              <w:pStyle w:val="Normal"/>
+              <w:jc w:val="left"/>
+              <w:pBdr>
+                <w:bottom w:val="none" w:sz="0" w:space="0" w:color="000000"/>
+                <w:top w:val="none" w:sz="0" w:space="0" w:color="000000"/>
+                <w:left w:val="none" w:sz="0" w:space="0" w:color="000000"/>
+                <w:right w:val="none" w:sz="0" w:space="0" w:color="000000"/>
+              </w:pBdr>
+              <w:spacing w:after="100" w:before="100" w:line="240"/>
+              <w:ind w:left="100" w:right="100" w:firstLine="0" w:firstLineChars="0"/>
+              <w:rPr>
+                <w:rFonts w:ascii="Arial" w:hAnsi="Arial" w:eastAsia="Arial" w:cs="Arial"/>
+                <w:i w:val="false"/>
+                <w:b w:val="false"/>
+                <w:u w:val="none"/>
+                <w:strike w:val="false"/>
+                <w:sz w:val="20"/>
+                <w:szCs w:val="20"/>
+                <w:color w:val="000000"/>
+              </w:rPr>
+            </w:pPr>
+            <w:r>
+              <w:rPr>
+                <w:rFonts w:ascii="Arial" w:hAnsi="Arial" w:eastAsia="Arial" w:cs="Arial"/>
+                <w:i w:val="false"/>
+                <w:b w:val="false"/>
+                <w:u w:val="none"/>
+                <w:strike w:val="false"/>
+                <w:sz w:val="20"/>
+                <w:szCs w:val="20"/>
+                <w:color w:val="000000"/>
+              </w:rPr>
+              <w:t xml:space="preserve">37.8%</w:t>
+            </w:r>
+          </w:p>
+        </w:tc>
+      </w:tr>
+      <w:tr>
+        <w:trPr>
+          <w:trHeight w:val="614" w:hRule="auto"/>
+        </w:trPr>
+        <w:tc>
+          <w:tcPr>
+            <w:tcBorders>
+              <w:bottom w:val="none" w:sz="0" w:space="0" w:color="000000"/>
+              <w:top w:val="none" w:sz="0" w:space="0" w:color="000000"/>
+              <w:left w:val="none" w:sz="0" w:space="0" w:color="000000"/>
+              <w:right w:val="none" w:sz="0" w:space="0" w:color="000000"/>
+            </w:tcBorders>
+            <w:shd w:val="clear" w:color="auto" w:fill="FFFFFF"/>
+            <w:tcMar>
+              <w:top w:w="0" w:type="dxa"/>
+              <w:bottom w:w="0" w:type="dxa"/>
+              <w:left w:w="0" w:type="dxa"/>
+              <w:right w:w="0" w:type="dxa"/>
+            </w:tcMar>
+            <w:vAlign w:val="top"/>
+          </w:tcPr>
+          <w:p>
+            <w:pPr>
+              <w:pStyle w:val="Normal"/>
+              <w:jc w:val="left"/>
+              <w:pBdr>
+                <w:bottom w:val="none" w:sz="0" w:space="0" w:color="000000"/>
+                <w:top w:val="none" w:sz="0" w:space="0" w:color="000000"/>
+                <w:left w:val="none" w:sz="0" w:space="0" w:color="000000"/>
+                <w:right w:val="none" w:sz="0" w:space="0" w:color="000000"/>
+              </w:pBdr>
+              <w:spacing w:after="100" w:before="100" w:line="240"/>
+              <w:ind w:left="100" w:right="100" w:firstLine="0" w:firstLineChars="0"/>
+              <w:rPr>
+                <w:rFonts w:ascii="Arial" w:hAnsi="Arial" w:eastAsia="Arial" w:cs="Arial"/>
+                <w:i w:val="false"/>
+                <w:b w:val="false"/>
+                <w:u w:val="none"/>
+                <w:strike w:val="false"/>
+                <w:sz w:val="20"/>
+                <w:szCs w:val="20"/>
+                <w:color w:val="000000"/>
+              </w:rPr>
+            </w:pPr>
+            <w:r>
+              <w:rPr>
+                <w:rFonts w:ascii="Arial" w:hAnsi="Arial" w:eastAsia="Arial" w:cs="Arial"/>
+                <w:i w:val="false"/>
+                <w:b w:val="false"/>
+                <w:u w:val="none"/>
+                <w:strike w:val="false"/>
+                <w:sz w:val="20"/>
+                <w:szCs w:val="20"/>
+                <w:color w:val="000000"/>
+              </w:rPr>
+              <w:t xml:space="preserve">Interrater reliability reported</w:t>
+            </w:r>
+          </w:p>
+        </w:tc>
+        <w:tc>
+          <w:tcPr>
+            <w:tcBorders>
+              <w:bottom w:val="none" w:sz="0" w:space="0" w:color="000000"/>
+              <w:top w:val="none" w:sz="0" w:space="0" w:color="000000"/>
+              <w:left w:val="none" w:sz="0" w:space="0" w:color="000000"/>
+              <w:right w:val="none" w:sz="0" w:space="0" w:color="000000"/>
+            </w:tcBorders>
+            <w:shd w:val="clear" w:color="auto" w:fill="FFFFFF"/>
+            <w:tcMar>
+              <w:top w:w="0" w:type="dxa"/>
+              <w:bottom w:w="0" w:type="dxa"/>
+              <w:left w:w="0" w:type="dxa"/>
+              <w:right w:w="0" w:type="dxa"/>
+            </w:tcMar>
+            <w:vAlign w:val="top"/>
+          </w:tcPr>
+          <w:p>
+            <w:pPr>
+              <w:pStyle w:val="Normal"/>
+              <w:jc w:val="left"/>
+              <w:pBdr>
+                <w:bottom w:val="none" w:sz="0" w:space="0" w:color="000000"/>
+                <w:top w:val="none" w:sz="0" w:space="0" w:color="000000"/>
+                <w:left w:val="none" w:sz="0" w:space="0" w:color="000000"/>
+                <w:right w:val="none" w:sz="0" w:space="0" w:color="000000"/>
+              </w:pBdr>
+              <w:spacing w:after="100" w:before="100" w:line="240"/>
+              <w:ind w:left="100" w:right="100" w:firstLine="0" w:firstLineChars="0"/>
+              <w:rPr>
+                <w:rFonts w:ascii="Arial" w:hAnsi="Arial" w:eastAsia="Arial" w:cs="Arial"/>
+                <w:i w:val="false"/>
+                <w:b w:val="false"/>
+                <w:u w:val="none"/>
+                <w:strike w:val="false"/>
+                <w:sz w:val="20"/>
+                <w:szCs w:val="20"/>
+                <w:color w:val="000000"/>
+              </w:rPr>
+            </w:pPr>
+            <w:r>
+              <w:rPr>
+                <w:rFonts w:ascii="Arial" w:hAnsi="Arial" w:eastAsia="Arial" w:cs="Arial"/>
+                <w:i w:val="false"/>
+                <w:b w:val="false"/>
+                <w:u w:val="none"/>
+                <w:strike w:val="false"/>
+                <w:sz w:val="20"/>
+                <w:szCs w:val="20"/>
+                <w:color w:val="000000"/>
+              </w:rPr>
+              <w:t xml:space="preserve">10</w:t>
+            </w:r>
+          </w:p>
+        </w:tc>
+        <w:tc>
+          <w:tcPr>
+            <w:tcBorders>
+              <w:bottom w:val="none" w:sz="0" w:space="0" w:color="000000"/>
+              <w:top w:val="none" w:sz="0" w:space="0" w:color="000000"/>
+              <w:left w:val="none" w:sz="0" w:space="0" w:color="000000"/>
+              <w:right w:val="none" w:sz="0" w:space="0" w:color="000000"/>
+            </w:tcBorders>
+            <w:shd w:val="clear" w:color="auto" w:fill="FFFFFF"/>
+            <w:tcMar>
+              <w:top w:w="0" w:type="dxa"/>
+              <w:bottom w:w="0" w:type="dxa"/>
+              <w:left w:w="0" w:type="dxa"/>
+              <w:right w:w="0" w:type="dxa"/>
+            </w:tcMar>
+            <w:vAlign w:val="top"/>
+          </w:tcPr>
+          <w:p>
+            <w:pPr>
+              <w:pStyle w:val="Normal"/>
+              <w:jc w:val="left"/>
+              <w:pBdr>
+                <w:bottom w:val="none" w:sz="0" w:space="0" w:color="000000"/>
+                <w:top w:val="none" w:sz="0" w:space="0" w:color="000000"/>
+                <w:left w:val="none" w:sz="0" w:space="0" w:color="000000"/>
+                <w:right w:val="none" w:sz="0" w:space="0" w:color="000000"/>
+              </w:pBdr>
+              <w:spacing w:after="100" w:before="100" w:line="240"/>
+              <w:ind w:left="100" w:right="100" w:firstLine="0" w:firstLineChars="0"/>
+              <w:rPr>
+                <w:rFonts w:ascii="Arial" w:hAnsi="Arial" w:eastAsia="Arial" w:cs="Arial"/>
+                <w:i w:val="false"/>
+                <w:b w:val="false"/>
+                <w:u w:val="none"/>
+                <w:strike w:val="false"/>
+                <w:sz w:val="20"/>
+                <w:szCs w:val="20"/>
+                <w:color w:val="000000"/>
+              </w:rPr>
+            </w:pPr>
+            <w:r>
+              <w:rPr>
+                <w:rFonts w:ascii="Arial" w:hAnsi="Arial" w:eastAsia="Arial" w:cs="Arial"/>
+                <w:i w:val="false"/>
+                <w:b w:val="false"/>
+                <w:u w:val="none"/>
+                <w:strike w:val="false"/>
+                <w:sz w:val="20"/>
+                <w:szCs w:val="20"/>
+                <w:color w:val="000000"/>
+              </w:rPr>
+              <w:t xml:space="preserve">10/37</w:t>
+            </w:r>
+          </w:p>
+        </w:tc>
+        <w:tc>
+          <w:tcPr>
+            <w:tcBorders>
+              <w:bottom w:val="none" w:sz="0" w:space="0" w:color="000000"/>
+              <w:top w:val="none" w:sz="0" w:space="0" w:color="000000"/>
+              <w:left w:val="none" w:sz="0" w:space="0" w:color="000000"/>
+              <w:right w:val="none" w:sz="0" w:space="0" w:color="000000"/>
+            </w:tcBorders>
+            <w:shd w:val="clear" w:color="auto" w:fill="FFFFFF"/>
+            <w:tcMar>
+              <w:top w:w="0" w:type="dxa"/>
+              <w:bottom w:w="0" w:type="dxa"/>
+              <w:left w:w="0" w:type="dxa"/>
+              <w:right w:w="0" w:type="dxa"/>
+            </w:tcMar>
+            <w:vAlign w:val="top"/>
+          </w:tcPr>
+          <w:p>
+            <w:pPr>
+              <w:pStyle w:val="Normal"/>
+              <w:jc w:val="left"/>
+              <w:pBdr>
+                <w:bottom w:val="none" w:sz="0" w:space="0" w:color="000000"/>
+                <w:top w:val="none" w:sz="0" w:space="0" w:color="000000"/>
+                <w:left w:val="none" w:sz="0" w:space="0" w:color="000000"/>
+                <w:right w:val="none" w:sz="0" w:space="0" w:color="000000"/>
+              </w:pBdr>
+              <w:spacing w:after="100" w:before="100" w:line="240"/>
+              <w:ind w:left="100" w:right="100" w:firstLine="0" w:firstLineChars="0"/>
+              <w:rPr>
+                <w:rFonts w:ascii="Arial" w:hAnsi="Arial" w:eastAsia="Arial" w:cs="Arial"/>
+                <w:i w:val="false"/>
+                <w:b w:val="false"/>
+                <w:u w:val="none"/>
+                <w:strike w:val="false"/>
+                <w:sz w:val="20"/>
+                <w:szCs w:val="20"/>
+                <w:color w:val="000000"/>
+              </w:rPr>
+            </w:pPr>
+            <w:r>
+              <w:rPr>
+                <w:rFonts w:ascii="Arial" w:hAnsi="Arial" w:eastAsia="Arial" w:cs="Arial"/>
+                <w:i w:val="false"/>
+                <w:b w:val="false"/>
+                <w:u w:val="none"/>
+                <w:strike w:val="false"/>
+                <w:sz w:val="20"/>
+                <w:szCs w:val="20"/>
+                <w:color w:val="000000"/>
+              </w:rPr>
+              <w:t xml:space="preserve">27%</w:t>
+            </w:r>
+          </w:p>
+        </w:tc>
+      </w:tr>
+      <w:tr>
+        <w:trPr>
+          <w:trHeight w:val="614" w:hRule="auto"/>
+        </w:trPr>
+        <w:tc>
+          <w:tcPr>
+            <w:tcBorders>
+              <w:bottom w:val="single" w:sz="12" w:space="0" w:color="666666"/>
+              <w:top w:val="none" w:sz="0" w:space="0" w:color="000000"/>
+              <w:left w:val="none" w:sz="0" w:space="0" w:color="000000"/>
+              <w:right w:val="none" w:sz="0" w:space="0" w:color="000000"/>
+            </w:tcBorders>
+            <w:shd w:val="clear" w:color="auto" w:fill="FFFFFF"/>
+            <w:tcMar>
+              <w:top w:w="0" w:type="dxa"/>
+              <w:bottom w:w="0" w:type="dxa"/>
+              <w:left w:w="0" w:type="dxa"/>
+              <w:right w:w="0" w:type="dxa"/>
+            </w:tcMar>
+            <w:vAlign w:val="top"/>
+          </w:tcPr>
+          <w:p>
+            <w:pPr>
+              <w:pStyle w:val="Normal"/>
+              <w:jc w:val="left"/>
+              <w:pBdr>
+                <w:bottom w:val="none" w:sz="0" w:space="0" w:color="000000"/>
+                <w:top w:val="none" w:sz="0" w:space="0" w:color="000000"/>
+                <w:left w:val="none" w:sz="0" w:space="0" w:color="000000"/>
+                <w:right w:val="none" w:sz="0" w:space="0" w:color="000000"/>
+              </w:pBdr>
+              <w:spacing w:after="100" w:before="100" w:line="240"/>
+              <w:ind w:left="100" w:right="100" w:firstLine="0" w:firstLineChars="0"/>
+              <w:rPr>
+                <w:rFonts w:ascii="Arial" w:hAnsi="Arial" w:eastAsia="Arial" w:cs="Arial"/>
+                <w:i w:val="false"/>
+                <w:b w:val="false"/>
+                <w:u w:val="none"/>
+                <w:strike w:val="false"/>
+                <w:sz w:val="20"/>
+                <w:szCs w:val="20"/>
+                <w:color w:val="000000"/>
+              </w:rPr>
+            </w:pPr>
+            <w:r>
+              <w:rPr>
+                <w:rFonts w:ascii="Arial" w:hAnsi="Arial" w:eastAsia="Arial" w:cs="Arial"/>
+                <w:i w:val="false"/>
+                <w:b w:val="false"/>
+                <w:u w:val="none"/>
+                <w:strike w:val="false"/>
+                <w:sz w:val="20"/>
+                <w:szCs w:val="20"/>
+                <w:color w:val="000000"/>
+              </w:rPr>
+              <w:t xml:space="preserve">Disagreement resolved mentioned</w:t>
+            </w:r>
+          </w:p>
+        </w:tc>
+        <w:tc>
+          <w:tcPr>
+            <w:tcBorders>
+              <w:bottom w:val="single" w:sz="12" w:space="0" w:color="666666"/>
+              <w:top w:val="none" w:sz="0" w:space="0" w:color="000000"/>
+              <w:left w:val="none" w:sz="0" w:space="0" w:color="000000"/>
+              <w:right w:val="none" w:sz="0" w:space="0" w:color="000000"/>
+            </w:tcBorders>
+            <w:shd w:val="clear" w:color="auto" w:fill="FFFFFF"/>
+            <w:tcMar>
+              <w:top w:w="0" w:type="dxa"/>
+              <w:bottom w:w="0" w:type="dxa"/>
+              <w:left w:w="0" w:type="dxa"/>
+              <w:right w:w="0" w:type="dxa"/>
+            </w:tcMar>
+            <w:vAlign w:val="top"/>
+          </w:tcPr>
+          <w:p>
+            <w:pPr>
+              <w:pStyle w:val="Normal"/>
+              <w:jc w:val="left"/>
+              <w:pBdr>
+                <w:bottom w:val="none" w:sz="0" w:space="0" w:color="000000"/>
+                <w:top w:val="none" w:sz="0" w:space="0" w:color="000000"/>
+                <w:left w:val="none" w:sz="0" w:space="0" w:color="000000"/>
+                <w:right w:val="none" w:sz="0" w:space="0" w:color="000000"/>
+              </w:pBdr>
+              <w:spacing w:after="100" w:before="100" w:line="240"/>
+              <w:ind w:left="100" w:right="100" w:firstLine="0" w:firstLineChars="0"/>
+              <w:rPr>
+                <w:rFonts w:ascii="Arial" w:hAnsi="Arial" w:eastAsia="Arial" w:cs="Arial"/>
+                <w:i w:val="false"/>
+                <w:b w:val="false"/>
+                <w:u w:val="none"/>
+                <w:strike w:val="false"/>
+                <w:sz w:val="20"/>
+                <w:szCs w:val="20"/>
+                <w:color w:val="000000"/>
+              </w:rPr>
+            </w:pPr>
+            <w:r>
+              <w:rPr>
+                <w:rFonts w:ascii="Arial" w:hAnsi="Arial" w:eastAsia="Arial" w:cs="Arial"/>
+                <w:i w:val="false"/>
+                <w:b w:val="false"/>
+                <w:u w:val="none"/>
+                <w:strike w:val="false"/>
+                <w:sz w:val="20"/>
+                <w:szCs w:val="20"/>
+                <w:color w:val="000000"/>
+              </w:rPr>
+              <w:t xml:space="preserve">23</w:t>
+            </w:r>
+          </w:p>
+        </w:tc>
+        <w:tc>
+          <w:tcPr>
+            <w:tcBorders>
+              <w:bottom w:val="single" w:sz="12" w:space="0" w:color="666666"/>
+              <w:top w:val="none" w:sz="0" w:space="0" w:color="000000"/>
+              <w:left w:val="none" w:sz="0" w:space="0" w:color="000000"/>
+              <w:right w:val="none" w:sz="0" w:space="0" w:color="000000"/>
+            </w:tcBorders>
+            <w:shd w:val="clear" w:color="auto" w:fill="FFFFFF"/>
+            <w:tcMar>
+              <w:top w:w="0" w:type="dxa"/>
+              <w:bottom w:w="0" w:type="dxa"/>
+              <w:left w:w="0" w:type="dxa"/>
+              <w:right w:w="0" w:type="dxa"/>
+            </w:tcMar>
+            <w:vAlign w:val="top"/>
+          </w:tcPr>
+          <w:p>
+            <w:pPr>
+              <w:pStyle w:val="Normal"/>
+              <w:jc w:val="left"/>
+              <w:pBdr>
+                <w:bottom w:val="none" w:sz="0" w:space="0" w:color="000000"/>
+                <w:top w:val="none" w:sz="0" w:space="0" w:color="000000"/>
+                <w:left w:val="none" w:sz="0" w:space="0" w:color="000000"/>
+                <w:right w:val="none" w:sz="0" w:space="0" w:color="000000"/>
+              </w:pBdr>
+              <w:spacing w:after="100" w:before="100" w:line="240"/>
+              <w:ind w:left="100" w:right="100" w:firstLine="0" w:firstLineChars="0"/>
+              <w:rPr>
+                <w:rFonts w:ascii="Arial" w:hAnsi="Arial" w:eastAsia="Arial" w:cs="Arial"/>
+                <w:i w:val="false"/>
+                <w:b w:val="false"/>
+                <w:u w:val="none"/>
+                <w:strike w:val="false"/>
+                <w:sz w:val="20"/>
+                <w:szCs w:val="20"/>
+                <w:color w:val="000000"/>
+              </w:rPr>
+            </w:pPr>
+            <w:r>
+              <w:rPr>
+                <w:rFonts w:ascii="Arial" w:hAnsi="Arial" w:eastAsia="Arial" w:cs="Arial"/>
+                <w:i w:val="false"/>
+                <w:b w:val="false"/>
+                <w:u w:val="none"/>
+                <w:strike w:val="false"/>
+                <w:sz w:val="20"/>
+                <w:szCs w:val="20"/>
+                <w:color w:val="000000"/>
+              </w:rPr>
+              <w:t xml:space="preserve">23/37</w:t>
+            </w:r>
+          </w:p>
+        </w:tc>
+        <w:tc>
+          <w:tcPr>
+            <w:tcBorders>
+              <w:bottom w:val="single" w:sz="12" w:space="0" w:color="666666"/>
+              <w:top w:val="none" w:sz="0" w:space="0" w:color="000000"/>
+              <w:left w:val="none" w:sz="0" w:space="0" w:color="000000"/>
+              <w:right w:val="none" w:sz="0" w:space="0" w:color="000000"/>
+            </w:tcBorders>
+            <w:shd w:val="clear" w:color="auto" w:fill="FFFFFF"/>
+            <w:tcMar>
+              <w:top w:w="0" w:type="dxa"/>
+              <w:bottom w:w="0" w:type="dxa"/>
+              <w:left w:w="0" w:type="dxa"/>
+              <w:right w:w="0" w:type="dxa"/>
+            </w:tcMar>
+            <w:vAlign w:val="top"/>
+          </w:tcPr>
+          <w:p>
+            <w:pPr>
+              <w:pStyle w:val="Normal"/>
+              <w:jc w:val="left"/>
+              <w:pBdr>
+                <w:bottom w:val="none" w:sz="0" w:space="0" w:color="000000"/>
+                <w:top w:val="none" w:sz="0" w:space="0" w:color="000000"/>
+                <w:left w:val="none" w:sz="0" w:space="0" w:color="000000"/>
+                <w:right w:val="none" w:sz="0" w:space="0" w:color="000000"/>
+              </w:pBdr>
+              <w:spacing w:after="100" w:before="100" w:line="240"/>
+              <w:ind w:left="100" w:right="100" w:firstLine="0" w:firstLineChars="0"/>
+              <w:rPr>
+                <w:rFonts w:ascii="Arial" w:hAnsi="Arial" w:eastAsia="Arial" w:cs="Arial"/>
+                <w:i w:val="false"/>
+                <w:b w:val="false"/>
+                <w:u w:val="none"/>
+                <w:strike w:val="false"/>
+                <w:sz w:val="20"/>
+                <w:szCs w:val="20"/>
+                <w:color w:val="000000"/>
+              </w:rPr>
+            </w:pPr>
+            <w:r>
+              <w:rPr>
+                <w:rFonts w:ascii="Arial" w:hAnsi="Arial" w:eastAsia="Arial" w:cs="Arial"/>
+                <w:i w:val="false"/>
+                <w:b w:val="false"/>
+                <w:u w:val="none"/>
+                <w:strike w:val="false"/>
+                <w:sz w:val="20"/>
+                <w:szCs w:val="20"/>
+                <w:color w:val="000000"/>
+              </w:rPr>
+              <w:t xml:space="preserve">62.2%</w:t>
+            </w:r>
+          </w:p>
+        </w:tc>
+      </w:tr>
+    </w:tbl>
+    <w:p>
+      <w:pPr>
         <w:pStyle w:val="TableCaption"/>
         <w:jc w:val="center"/>
         <w:keepNext/>
@@ -23042,6 +24027,1886 @@
         </w:tc>
       </w:tr>
     </w:tbl>
+    <w:p>
+      <w:pPr>
+        <w:pStyle w:val="TableCaption"/>
+        <w:jc w:val="center"/>
+        <w:keepNext/>
+        <w:pBdr>
+          <w:bottom w:val="none" w:sz="0" w:space="0" w:color="000000"/>
+          <w:top w:val="none" w:sz="0" w:space="0" w:color="000000"/>
+          <w:left w:val="none" w:sz="0" w:space="0" w:color="000000"/>
+          <w:right w:val="none" w:sz="0" w:space="0" w:color="000000"/>
+        </w:pBdr>
+        <w:spacing w:after="60" w:before="60" w:line="240"/>
+        <w:ind w:left="60" w:right="60" w:firstLine="0" w:firstLineChars="0"/>
+      </w:pPr>
+      <w:r>
+        <w:t xml:space="preserve">Documentation indicators</w:t>
+      </w:r>
+    </w:p>
+    <w:tbl xmlns:a="http://schemas.openxmlformats.org/drawingml/2006/main" xmlns:pic="http://schemas.openxmlformats.org/drawingml/2006/picture">
+      <w:tblPr>
+        <w:tblLayout w:type="fixed"/>
+        <w:jc w:val="center"/>
+        <w:tblLook w:firstRow="1" w:lastRow="0" w:firstColumn="0" w:lastColumn="0" w:noHBand="0" w:noVBand="1"/>
+      </w:tblPr>
+      <w:tblGrid>
+        <w:gridCol w:w="3150"/>
+        <w:gridCol w:w="1474"/>
+        <w:gridCol w:w="1976"/>
+        <w:gridCol w:w="1169"/>
+      </w:tblGrid>
+      <w:tr>
+        <w:trPr>
+          <w:trHeight w:val="617" w:hRule="auto"/>
+          <w:tblHeader/>
+        </w:trPr>
+        <w:tc>
+          <w:tcPr>
+            <w:tcBorders>
+              <w:bottom w:val="single" w:sz="12" w:space="0" w:color="666666"/>
+              <w:top w:val="single" w:sz="12" w:space="0" w:color="666666"/>
+              <w:left w:val="none" w:sz="0" w:space="0" w:color="000000"/>
+              <w:right w:val="none" w:sz="0" w:space="0" w:color="000000"/>
+            </w:tcBorders>
+            <w:shd w:val="clear" w:color="auto" w:fill="FFFFFF"/>
+            <w:tcMar>
+              <w:top w:w="0" w:type="dxa"/>
+              <w:bottom w:w="0" w:type="dxa"/>
+              <w:left w:w="0" w:type="dxa"/>
+              <w:right w:w="0" w:type="dxa"/>
+            </w:tcMar>
+            <w:vAlign w:val="top"/>
+          </w:tcPr>
+          <w:p>
+            <w:pPr>
+              <w:pStyle w:val="Normal"/>
+              <w:jc w:val="left"/>
+              <w:pBdr>
+                <w:bottom w:val="none" w:sz="0" w:space="0" w:color="000000"/>
+                <w:top w:val="none" w:sz="0" w:space="0" w:color="000000"/>
+                <w:left w:val="none" w:sz="0" w:space="0" w:color="000000"/>
+                <w:right w:val="none" w:sz="0" w:space="0" w:color="000000"/>
+              </w:pBdr>
+              <w:spacing w:after="100" w:before="100" w:line="240"/>
+              <w:ind w:left="100" w:right="100" w:firstLine="0" w:firstLineChars="0"/>
+              <w:rPr>
+                <w:rFonts w:ascii="Arial" w:hAnsi="Arial" w:eastAsia="Arial" w:cs="Arial"/>
+                <w:i w:val="false"/>
+                <w:b w:val="false"/>
+                <w:u w:val="none"/>
+                <w:strike w:val="false"/>
+                <w:sz w:val="20"/>
+                <w:szCs w:val="20"/>
+                <w:color w:val="000000"/>
+              </w:rPr>
+            </w:pPr>
+            <w:r>
+              <w:rPr>
+                <w:rFonts w:ascii="Arial" w:hAnsi="Arial" w:eastAsia="Arial" w:cs="Arial"/>
+                <w:i w:val="false"/>
+                <w:b w:val="false"/>
+                <w:u w:val="none"/>
+                <w:strike w:val="false"/>
+                <w:sz w:val="20"/>
+                <w:szCs w:val="20"/>
+                <w:color w:val="000000"/>
+              </w:rPr>
+              <w:t xml:space="preserve">Indicator</w:t>
+            </w:r>
+          </w:p>
+        </w:tc>
+        <w:tc>
+          <w:tcPr>
+            <w:tcBorders>
+              <w:bottom w:val="single" w:sz="12" w:space="0" w:color="666666"/>
+              <w:top w:val="single" w:sz="12" w:space="0" w:color="666666"/>
+              <w:left w:val="none" w:sz="0" w:space="0" w:color="000000"/>
+              <w:right w:val="none" w:sz="0" w:space="0" w:color="000000"/>
+            </w:tcBorders>
+            <w:shd w:val="clear" w:color="auto" w:fill="FFFFFF"/>
+            <w:tcMar>
+              <w:top w:w="0" w:type="dxa"/>
+              <w:bottom w:w="0" w:type="dxa"/>
+              <w:left w:w="0" w:type="dxa"/>
+              <w:right w:w="0" w:type="dxa"/>
+            </w:tcMar>
+            <w:vAlign w:val="top"/>
+          </w:tcPr>
+          <w:p>
+            <w:pPr>
+              <w:pStyle w:val="Normal"/>
+              <w:jc w:val="left"/>
+              <w:pBdr>
+                <w:bottom w:val="none" w:sz="0" w:space="0" w:color="000000"/>
+                <w:top w:val="none" w:sz="0" w:space="0" w:color="000000"/>
+                <w:left w:val="none" w:sz="0" w:space="0" w:color="000000"/>
+                <w:right w:val="none" w:sz="0" w:space="0" w:color="000000"/>
+              </w:pBdr>
+              <w:spacing w:after="100" w:before="100" w:line="240"/>
+              <w:ind w:left="100" w:right="100" w:firstLine="0" w:firstLineChars="0"/>
+              <w:rPr>
+                <w:rFonts w:ascii="Arial" w:hAnsi="Arial" w:eastAsia="Arial" w:cs="Arial"/>
+                <w:i w:val="false"/>
+                <w:b w:val="false"/>
+                <w:u w:val="none"/>
+                <w:strike w:val="false"/>
+                <w:sz w:val="20"/>
+                <w:szCs w:val="20"/>
+                <w:color w:val="000000"/>
+              </w:rPr>
+            </w:pPr>
+            <w:r>
+              <w:rPr>
+                <w:rFonts w:ascii="Arial" w:hAnsi="Arial" w:eastAsia="Arial" w:cs="Arial"/>
+                <w:i w:val="false"/>
+                <w:b w:val="false"/>
+                <w:u w:val="none"/>
+                <w:strike w:val="false"/>
+                <w:sz w:val="20"/>
+                <w:szCs w:val="20"/>
+                <w:color w:val="000000"/>
+              </w:rPr>
+              <w:t xml:space="preserve">n (Studies)</w:t>
+            </w:r>
+          </w:p>
+        </w:tc>
+        <w:tc>
+          <w:tcPr>
+            <w:tcBorders>
+              <w:bottom w:val="single" w:sz="12" w:space="0" w:color="666666"/>
+              <w:top w:val="single" w:sz="12" w:space="0" w:color="666666"/>
+              <w:left w:val="none" w:sz="0" w:space="0" w:color="000000"/>
+              <w:right w:val="none" w:sz="0" w:space="0" w:color="000000"/>
+            </w:tcBorders>
+            <w:shd w:val="clear" w:color="auto" w:fill="FFFFFF"/>
+            <w:tcMar>
+              <w:top w:w="0" w:type="dxa"/>
+              <w:bottom w:w="0" w:type="dxa"/>
+              <w:left w:w="0" w:type="dxa"/>
+              <w:right w:w="0" w:type="dxa"/>
+            </w:tcMar>
+            <w:vAlign w:val="top"/>
+          </w:tcPr>
+          <w:p>
+            <w:pPr>
+              <w:pStyle w:val="Normal"/>
+              <w:jc w:val="left"/>
+              <w:pBdr>
+                <w:bottom w:val="none" w:sz="0" w:space="0" w:color="000000"/>
+                <w:top w:val="none" w:sz="0" w:space="0" w:color="000000"/>
+                <w:left w:val="none" w:sz="0" w:space="0" w:color="000000"/>
+                <w:right w:val="none" w:sz="0" w:space="0" w:color="000000"/>
+              </w:pBdr>
+              <w:spacing w:after="100" w:before="100" w:line="240"/>
+              <w:ind w:left="100" w:right="100" w:firstLine="0" w:firstLineChars="0"/>
+              <w:rPr>
+                <w:rFonts w:ascii="Arial" w:hAnsi="Arial" w:eastAsia="Arial" w:cs="Arial"/>
+                <w:i w:val="false"/>
+                <w:b w:val="false"/>
+                <w:u w:val="none"/>
+                <w:strike w:val="false"/>
+                <w:sz w:val="20"/>
+                <w:szCs w:val="20"/>
+                <w:color w:val="000000"/>
+              </w:rPr>
+            </w:pPr>
+            <w:r>
+              <w:rPr>
+                <w:rFonts w:ascii="Arial" w:hAnsi="Arial" w:eastAsia="Arial" w:cs="Arial"/>
+                <w:i w:val="false"/>
+                <w:b w:val="false"/>
+                <w:u w:val="none"/>
+                <w:strike w:val="false"/>
+                <w:sz w:val="20"/>
+                <w:szCs w:val="20"/>
+                <w:color w:val="000000"/>
+              </w:rPr>
+              <w:t xml:space="preserve">Proportion (n/N)</w:t>
+            </w:r>
+          </w:p>
+        </w:tc>
+        <w:tc>
+          <w:tcPr>
+            <w:tcBorders>
+              <w:bottom w:val="single" w:sz="12" w:space="0" w:color="666666"/>
+              <w:top w:val="single" w:sz="12" w:space="0" w:color="666666"/>
+              <w:left w:val="none" w:sz="0" w:space="0" w:color="000000"/>
+              <w:right w:val="none" w:sz="0" w:space="0" w:color="000000"/>
+            </w:tcBorders>
+            <w:shd w:val="clear" w:color="auto" w:fill="FFFFFF"/>
+            <w:tcMar>
+              <w:top w:w="0" w:type="dxa"/>
+              <w:bottom w:w="0" w:type="dxa"/>
+              <w:left w:w="0" w:type="dxa"/>
+              <w:right w:w="0" w:type="dxa"/>
+            </w:tcMar>
+            <w:vAlign w:val="top"/>
+          </w:tcPr>
+          <w:p>
+            <w:pPr>
+              <w:pStyle w:val="Normal"/>
+              <w:jc w:val="left"/>
+              <w:pBdr>
+                <w:bottom w:val="none" w:sz="0" w:space="0" w:color="000000"/>
+                <w:top w:val="none" w:sz="0" w:space="0" w:color="000000"/>
+                <w:left w:val="none" w:sz="0" w:space="0" w:color="000000"/>
+                <w:right w:val="none" w:sz="0" w:space="0" w:color="000000"/>
+              </w:pBdr>
+              <w:spacing w:after="100" w:before="100" w:line="240"/>
+              <w:ind w:left="100" w:right="100" w:firstLine="0" w:firstLineChars="0"/>
+              <w:rPr>
+                <w:rFonts w:ascii="Arial" w:hAnsi="Arial" w:eastAsia="Arial" w:cs="Arial"/>
+                <w:i w:val="false"/>
+                <w:b w:val="false"/>
+                <w:u w:val="none"/>
+                <w:strike w:val="false"/>
+                <w:sz w:val="20"/>
+                <w:szCs w:val="20"/>
+                <w:color w:val="000000"/>
+              </w:rPr>
+            </w:pPr>
+            <w:r>
+              <w:rPr>
+                <w:rFonts w:ascii="Arial" w:hAnsi="Arial" w:eastAsia="Arial" w:cs="Arial"/>
+                <w:i w:val="false"/>
+                <w:b w:val="false"/>
+                <w:u w:val="none"/>
+                <w:strike w:val="false"/>
+                <w:sz w:val="20"/>
+                <w:szCs w:val="20"/>
+                <w:color w:val="000000"/>
+              </w:rPr>
+              <w:t xml:space="preserve">Percent</w:t>
+            </w:r>
+          </w:p>
+        </w:tc>
+      </w:tr>
+      <w:tr>
+        <w:trPr>
+          <w:trHeight w:val="615" w:hRule="auto"/>
+        </w:trPr>
+        <w:tc>
+          <w:tcPr>
+            <w:tcBorders>
+              <w:bottom w:val="none" w:sz="0" w:space="0" w:color="000000"/>
+              <w:top w:val="single" w:sz="12" w:space="0" w:color="666666"/>
+              <w:left w:val="none" w:sz="0" w:space="0" w:color="000000"/>
+              <w:right w:val="none" w:sz="0" w:space="0" w:color="000000"/>
+            </w:tcBorders>
+            <w:shd w:val="clear" w:color="auto" w:fill="FFFFFF"/>
+            <w:tcMar>
+              <w:top w:w="0" w:type="dxa"/>
+              <w:bottom w:w="0" w:type="dxa"/>
+              <w:left w:w="0" w:type="dxa"/>
+              <w:right w:w="0" w:type="dxa"/>
+            </w:tcMar>
+            <w:vAlign w:val="top"/>
+          </w:tcPr>
+          <w:p>
+            <w:pPr>
+              <w:pStyle w:val="Normal"/>
+              <w:jc w:val="left"/>
+              <w:pBdr>
+                <w:bottom w:val="none" w:sz="0" w:space="0" w:color="000000"/>
+                <w:top w:val="none" w:sz="0" w:space="0" w:color="000000"/>
+                <w:left w:val="none" w:sz="0" w:space="0" w:color="000000"/>
+                <w:right w:val="none" w:sz="0" w:space="0" w:color="000000"/>
+              </w:pBdr>
+              <w:spacing w:after="100" w:before="100" w:line="240"/>
+              <w:ind w:left="100" w:right="100" w:firstLine="0" w:firstLineChars="0"/>
+              <w:rPr>
+                <w:rFonts w:ascii="Arial" w:hAnsi="Arial" w:eastAsia="Arial" w:cs="Arial"/>
+                <w:i w:val="false"/>
+                <w:b w:val="false"/>
+                <w:u w:val="none"/>
+                <w:strike w:val="false"/>
+                <w:sz w:val="20"/>
+                <w:szCs w:val="20"/>
+                <w:color w:val="000000"/>
+              </w:rPr>
+            </w:pPr>
+            <w:r>
+              <w:rPr>
+                <w:rFonts w:ascii="Arial" w:hAnsi="Arial" w:eastAsia="Arial" w:cs="Arial"/>
+                <w:i w:val="false"/>
+                <w:b w:val="false"/>
+                <w:u w:val="none"/>
+                <w:strike w:val="false"/>
+                <w:sz w:val="20"/>
+                <w:szCs w:val="20"/>
+                <w:color w:val="000000"/>
+              </w:rPr>
+              <w:t xml:space="preserve">Codebook reported</w:t>
+            </w:r>
+          </w:p>
+        </w:tc>
+        <w:tc>
+          <w:tcPr>
+            <w:tcBorders>
+              <w:bottom w:val="none" w:sz="0" w:space="0" w:color="000000"/>
+              <w:top w:val="single" w:sz="12" w:space="0" w:color="666666"/>
+              <w:left w:val="none" w:sz="0" w:space="0" w:color="000000"/>
+              <w:right w:val="none" w:sz="0" w:space="0" w:color="000000"/>
+            </w:tcBorders>
+            <w:shd w:val="clear" w:color="auto" w:fill="FFFFFF"/>
+            <w:tcMar>
+              <w:top w:w="0" w:type="dxa"/>
+              <w:bottom w:w="0" w:type="dxa"/>
+              <w:left w:w="0" w:type="dxa"/>
+              <w:right w:w="0" w:type="dxa"/>
+            </w:tcMar>
+            <w:vAlign w:val="top"/>
+          </w:tcPr>
+          <w:p>
+            <w:pPr>
+              <w:pStyle w:val="Normal"/>
+              <w:jc w:val="left"/>
+              <w:pBdr>
+                <w:bottom w:val="none" w:sz="0" w:space="0" w:color="000000"/>
+                <w:top w:val="none" w:sz="0" w:space="0" w:color="000000"/>
+                <w:left w:val="none" w:sz="0" w:space="0" w:color="000000"/>
+                <w:right w:val="none" w:sz="0" w:space="0" w:color="000000"/>
+              </w:pBdr>
+              <w:spacing w:after="100" w:before="100" w:line="240"/>
+              <w:ind w:left="100" w:right="100" w:firstLine="0" w:firstLineChars="0"/>
+              <w:rPr>
+                <w:rFonts w:ascii="Arial" w:hAnsi="Arial" w:eastAsia="Arial" w:cs="Arial"/>
+                <w:i w:val="false"/>
+                <w:b w:val="false"/>
+                <w:u w:val="none"/>
+                <w:strike w:val="false"/>
+                <w:sz w:val="20"/>
+                <w:szCs w:val="20"/>
+                <w:color w:val="000000"/>
+              </w:rPr>
+            </w:pPr>
+            <w:r>
+              <w:rPr>
+                <w:rFonts w:ascii="Arial" w:hAnsi="Arial" w:eastAsia="Arial" w:cs="Arial"/>
+                <w:i w:val="false"/>
+                <w:b w:val="false"/>
+                <w:u w:val="none"/>
+                <w:strike w:val="false"/>
+                <w:sz w:val="20"/>
+                <w:szCs w:val="20"/>
+                <w:color w:val="000000"/>
+              </w:rPr>
+              <w:t xml:space="preserve">15</w:t>
+            </w:r>
+          </w:p>
+        </w:tc>
+        <w:tc>
+          <w:tcPr>
+            <w:tcBorders>
+              <w:bottom w:val="none" w:sz="0" w:space="0" w:color="000000"/>
+              <w:top w:val="single" w:sz="12" w:space="0" w:color="666666"/>
+              <w:left w:val="none" w:sz="0" w:space="0" w:color="000000"/>
+              <w:right w:val="none" w:sz="0" w:space="0" w:color="000000"/>
+            </w:tcBorders>
+            <w:shd w:val="clear" w:color="auto" w:fill="FFFFFF"/>
+            <w:tcMar>
+              <w:top w:w="0" w:type="dxa"/>
+              <w:bottom w:w="0" w:type="dxa"/>
+              <w:left w:w="0" w:type="dxa"/>
+              <w:right w:w="0" w:type="dxa"/>
+            </w:tcMar>
+            <w:vAlign w:val="top"/>
+          </w:tcPr>
+          <w:p>
+            <w:pPr>
+              <w:pStyle w:val="Normal"/>
+              <w:jc w:val="left"/>
+              <w:pBdr>
+                <w:bottom w:val="none" w:sz="0" w:space="0" w:color="000000"/>
+                <w:top w:val="none" w:sz="0" w:space="0" w:color="000000"/>
+                <w:left w:val="none" w:sz="0" w:space="0" w:color="000000"/>
+                <w:right w:val="none" w:sz="0" w:space="0" w:color="000000"/>
+              </w:pBdr>
+              <w:spacing w:after="100" w:before="100" w:line="240"/>
+              <w:ind w:left="100" w:right="100" w:firstLine="0" w:firstLineChars="0"/>
+              <w:rPr>
+                <w:rFonts w:ascii="Arial" w:hAnsi="Arial" w:eastAsia="Arial" w:cs="Arial"/>
+                <w:i w:val="false"/>
+                <w:b w:val="false"/>
+                <w:u w:val="none"/>
+                <w:strike w:val="false"/>
+                <w:sz w:val="20"/>
+                <w:szCs w:val="20"/>
+                <w:color w:val="000000"/>
+              </w:rPr>
+            </w:pPr>
+            <w:r>
+              <w:rPr>
+                <w:rFonts w:ascii="Arial" w:hAnsi="Arial" w:eastAsia="Arial" w:cs="Arial"/>
+                <w:i w:val="false"/>
+                <w:b w:val="false"/>
+                <w:u w:val="none"/>
+                <w:strike w:val="false"/>
+                <w:sz w:val="20"/>
+                <w:szCs w:val="20"/>
+                <w:color w:val="000000"/>
+              </w:rPr>
+              <w:t xml:space="preserve">15/37</w:t>
+            </w:r>
+          </w:p>
+        </w:tc>
+        <w:tc>
+          <w:tcPr>
+            <w:tcBorders>
+              <w:bottom w:val="none" w:sz="0" w:space="0" w:color="000000"/>
+              <w:top w:val="single" w:sz="12" w:space="0" w:color="666666"/>
+              <w:left w:val="none" w:sz="0" w:space="0" w:color="000000"/>
+              <w:right w:val="none" w:sz="0" w:space="0" w:color="000000"/>
+            </w:tcBorders>
+            <w:shd w:val="clear" w:color="auto" w:fill="FFFFFF"/>
+            <w:tcMar>
+              <w:top w:w="0" w:type="dxa"/>
+              <w:bottom w:w="0" w:type="dxa"/>
+              <w:left w:w="0" w:type="dxa"/>
+              <w:right w:w="0" w:type="dxa"/>
+            </w:tcMar>
+            <w:vAlign w:val="top"/>
+          </w:tcPr>
+          <w:p>
+            <w:pPr>
+              <w:pStyle w:val="Normal"/>
+              <w:jc w:val="left"/>
+              <w:pBdr>
+                <w:bottom w:val="none" w:sz="0" w:space="0" w:color="000000"/>
+                <w:top w:val="none" w:sz="0" w:space="0" w:color="000000"/>
+                <w:left w:val="none" w:sz="0" w:space="0" w:color="000000"/>
+                <w:right w:val="none" w:sz="0" w:space="0" w:color="000000"/>
+              </w:pBdr>
+              <w:spacing w:after="100" w:before="100" w:line="240"/>
+              <w:ind w:left="100" w:right="100" w:firstLine="0" w:firstLineChars="0"/>
+              <w:rPr>
+                <w:rFonts w:ascii="Arial" w:hAnsi="Arial" w:eastAsia="Arial" w:cs="Arial"/>
+                <w:i w:val="false"/>
+                <w:b w:val="false"/>
+                <w:u w:val="none"/>
+                <w:strike w:val="false"/>
+                <w:sz w:val="20"/>
+                <w:szCs w:val="20"/>
+                <w:color w:val="000000"/>
+              </w:rPr>
+            </w:pPr>
+            <w:r>
+              <w:rPr>
+                <w:rFonts w:ascii="Arial" w:hAnsi="Arial" w:eastAsia="Arial" w:cs="Arial"/>
+                <w:i w:val="false"/>
+                <w:b w:val="false"/>
+                <w:u w:val="none"/>
+                <w:strike w:val="false"/>
+                <w:sz w:val="20"/>
+                <w:szCs w:val="20"/>
+                <w:color w:val="000000"/>
+              </w:rPr>
+              <w:t xml:space="preserve">40.5%</w:t>
+            </w:r>
+          </w:p>
+        </w:tc>
+      </w:tr>
+      <w:tr>
+        <w:trPr>
+          <w:trHeight w:val="577" w:hRule="auto"/>
+        </w:trPr>
+        <w:tc>
+          <w:tcPr>
+            <w:tcBorders>
+              <w:bottom w:val="none" w:sz="0" w:space="0" w:color="000000"/>
+              <w:top w:val="none" w:sz="0" w:space="0" w:color="000000"/>
+              <w:left w:val="none" w:sz="0" w:space="0" w:color="000000"/>
+              <w:right w:val="none" w:sz="0" w:space="0" w:color="000000"/>
+            </w:tcBorders>
+            <w:shd w:val="clear" w:color="auto" w:fill="FFFFFF"/>
+            <w:tcMar>
+              <w:top w:w="0" w:type="dxa"/>
+              <w:bottom w:w="0" w:type="dxa"/>
+              <w:left w:w="0" w:type="dxa"/>
+              <w:right w:w="0" w:type="dxa"/>
+            </w:tcMar>
+            <w:vAlign w:val="top"/>
+          </w:tcPr>
+          <w:p>
+            <w:pPr>
+              <w:pStyle w:val="Normal"/>
+              <w:jc w:val="left"/>
+              <w:pBdr>
+                <w:bottom w:val="none" w:sz="0" w:space="0" w:color="000000"/>
+                <w:top w:val="none" w:sz="0" w:space="0" w:color="000000"/>
+                <w:left w:val="none" w:sz="0" w:space="0" w:color="000000"/>
+                <w:right w:val="none" w:sz="0" w:space="0" w:color="000000"/>
+              </w:pBdr>
+              <w:spacing w:after="100" w:before="100" w:line="240"/>
+              <w:ind w:left="100" w:right="100" w:firstLine="0" w:firstLineChars="0"/>
+              <w:rPr>
+                <w:rFonts w:ascii="Arial" w:hAnsi="Arial" w:eastAsia="Arial" w:cs="Arial"/>
+                <w:i w:val="false"/>
+                <w:b w:val="false"/>
+                <w:u w:val="none"/>
+                <w:strike w:val="false"/>
+                <w:sz w:val="20"/>
+                <w:szCs w:val="20"/>
+                <w:color w:val="000000"/>
+              </w:rPr>
+            </w:pPr>
+            <w:r>
+              <w:rPr>
+                <w:rFonts w:ascii="Arial" w:hAnsi="Arial" w:eastAsia="Arial" w:cs="Arial"/>
+                <w:i w:val="false"/>
+                <w:b w:val="false"/>
+                <w:u w:val="none"/>
+                <w:strike w:val="false"/>
+                <w:sz w:val="20"/>
+                <w:szCs w:val="20"/>
+                <w:color w:val="000000"/>
+              </w:rPr>
+              <w:t xml:space="preserve">Software mentioned</w:t>
+            </w:r>
+          </w:p>
+        </w:tc>
+        <w:tc>
+          <w:tcPr>
+            <w:tcBorders>
+              <w:bottom w:val="none" w:sz="0" w:space="0" w:color="000000"/>
+              <w:top w:val="none" w:sz="0" w:space="0" w:color="000000"/>
+              <w:left w:val="none" w:sz="0" w:space="0" w:color="000000"/>
+              <w:right w:val="none" w:sz="0" w:space="0" w:color="000000"/>
+            </w:tcBorders>
+            <w:shd w:val="clear" w:color="auto" w:fill="FFFFFF"/>
+            <w:tcMar>
+              <w:top w:w="0" w:type="dxa"/>
+              <w:bottom w:w="0" w:type="dxa"/>
+              <w:left w:w="0" w:type="dxa"/>
+              <w:right w:w="0" w:type="dxa"/>
+            </w:tcMar>
+            <w:vAlign w:val="top"/>
+          </w:tcPr>
+          <w:p>
+            <w:pPr>
+              <w:pStyle w:val="Normal"/>
+              <w:jc w:val="left"/>
+              <w:pBdr>
+                <w:bottom w:val="none" w:sz="0" w:space="0" w:color="000000"/>
+                <w:top w:val="none" w:sz="0" w:space="0" w:color="000000"/>
+                <w:left w:val="none" w:sz="0" w:space="0" w:color="000000"/>
+                <w:right w:val="none" w:sz="0" w:space="0" w:color="000000"/>
+              </w:pBdr>
+              <w:spacing w:after="100" w:before="100" w:line="240"/>
+              <w:ind w:left="100" w:right="100" w:firstLine="0" w:firstLineChars="0"/>
+              <w:rPr>
+                <w:rFonts w:ascii="Arial" w:hAnsi="Arial" w:eastAsia="Arial" w:cs="Arial"/>
+                <w:i w:val="false"/>
+                <w:b w:val="false"/>
+                <w:u w:val="none"/>
+                <w:strike w:val="false"/>
+                <w:sz w:val="20"/>
+                <w:szCs w:val="20"/>
+                <w:color w:val="000000"/>
+              </w:rPr>
+            </w:pPr>
+            <w:r>
+              <w:rPr>
+                <w:rFonts w:ascii="Arial" w:hAnsi="Arial" w:eastAsia="Arial" w:cs="Arial"/>
+                <w:i w:val="false"/>
+                <w:b w:val="false"/>
+                <w:u w:val="none"/>
+                <w:strike w:val="false"/>
+                <w:sz w:val="20"/>
+                <w:szCs w:val="20"/>
+                <w:color w:val="000000"/>
+              </w:rPr>
+              <w:t xml:space="preserve">29</w:t>
+            </w:r>
+          </w:p>
+        </w:tc>
+        <w:tc>
+          <w:tcPr>
+            <w:tcBorders>
+              <w:bottom w:val="none" w:sz="0" w:space="0" w:color="000000"/>
+              <w:top w:val="none" w:sz="0" w:space="0" w:color="000000"/>
+              <w:left w:val="none" w:sz="0" w:space="0" w:color="000000"/>
+              <w:right w:val="none" w:sz="0" w:space="0" w:color="000000"/>
+            </w:tcBorders>
+            <w:shd w:val="clear" w:color="auto" w:fill="FFFFFF"/>
+            <w:tcMar>
+              <w:top w:w="0" w:type="dxa"/>
+              <w:bottom w:w="0" w:type="dxa"/>
+              <w:left w:w="0" w:type="dxa"/>
+              <w:right w:w="0" w:type="dxa"/>
+            </w:tcMar>
+            <w:vAlign w:val="top"/>
+          </w:tcPr>
+          <w:p>
+            <w:pPr>
+              <w:pStyle w:val="Normal"/>
+              <w:jc w:val="left"/>
+              <w:pBdr>
+                <w:bottom w:val="none" w:sz="0" w:space="0" w:color="000000"/>
+                <w:top w:val="none" w:sz="0" w:space="0" w:color="000000"/>
+                <w:left w:val="none" w:sz="0" w:space="0" w:color="000000"/>
+                <w:right w:val="none" w:sz="0" w:space="0" w:color="000000"/>
+              </w:pBdr>
+              <w:spacing w:after="100" w:before="100" w:line="240"/>
+              <w:ind w:left="100" w:right="100" w:firstLine="0" w:firstLineChars="0"/>
+              <w:rPr>
+                <w:rFonts w:ascii="Arial" w:hAnsi="Arial" w:eastAsia="Arial" w:cs="Arial"/>
+                <w:i w:val="false"/>
+                <w:b w:val="false"/>
+                <w:u w:val="none"/>
+                <w:strike w:val="false"/>
+                <w:sz w:val="20"/>
+                <w:szCs w:val="20"/>
+                <w:color w:val="000000"/>
+              </w:rPr>
+            </w:pPr>
+            <w:r>
+              <w:rPr>
+                <w:rFonts w:ascii="Arial" w:hAnsi="Arial" w:eastAsia="Arial" w:cs="Arial"/>
+                <w:i w:val="false"/>
+                <w:b w:val="false"/>
+                <w:u w:val="none"/>
+                <w:strike w:val="false"/>
+                <w:sz w:val="20"/>
+                <w:szCs w:val="20"/>
+                <w:color w:val="000000"/>
+              </w:rPr>
+              <w:t xml:space="preserve">29/37</w:t>
+            </w:r>
+          </w:p>
+        </w:tc>
+        <w:tc>
+          <w:tcPr>
+            <w:tcBorders>
+              <w:bottom w:val="none" w:sz="0" w:space="0" w:color="000000"/>
+              <w:top w:val="none" w:sz="0" w:space="0" w:color="000000"/>
+              <w:left w:val="none" w:sz="0" w:space="0" w:color="000000"/>
+              <w:right w:val="none" w:sz="0" w:space="0" w:color="000000"/>
+            </w:tcBorders>
+            <w:shd w:val="clear" w:color="auto" w:fill="FFFFFF"/>
+            <w:tcMar>
+              <w:top w:w="0" w:type="dxa"/>
+              <w:bottom w:w="0" w:type="dxa"/>
+              <w:left w:w="0" w:type="dxa"/>
+              <w:right w:w="0" w:type="dxa"/>
+            </w:tcMar>
+            <w:vAlign w:val="top"/>
+          </w:tcPr>
+          <w:p>
+            <w:pPr>
+              <w:pStyle w:val="Normal"/>
+              <w:jc w:val="left"/>
+              <w:pBdr>
+                <w:bottom w:val="none" w:sz="0" w:space="0" w:color="000000"/>
+                <w:top w:val="none" w:sz="0" w:space="0" w:color="000000"/>
+                <w:left w:val="none" w:sz="0" w:space="0" w:color="000000"/>
+                <w:right w:val="none" w:sz="0" w:space="0" w:color="000000"/>
+              </w:pBdr>
+              <w:spacing w:after="100" w:before="100" w:line="240"/>
+              <w:ind w:left="100" w:right="100" w:firstLine="0" w:firstLineChars="0"/>
+              <w:rPr>
+                <w:rFonts w:ascii="Arial" w:hAnsi="Arial" w:eastAsia="Arial" w:cs="Arial"/>
+                <w:i w:val="false"/>
+                <w:b w:val="false"/>
+                <w:u w:val="none"/>
+                <w:strike w:val="false"/>
+                <w:sz w:val="20"/>
+                <w:szCs w:val="20"/>
+                <w:color w:val="000000"/>
+              </w:rPr>
+            </w:pPr>
+            <w:r>
+              <w:rPr>
+                <w:rFonts w:ascii="Arial" w:hAnsi="Arial" w:eastAsia="Arial" w:cs="Arial"/>
+                <w:i w:val="false"/>
+                <w:b w:val="false"/>
+                <w:u w:val="none"/>
+                <w:strike w:val="false"/>
+                <w:sz w:val="20"/>
+                <w:szCs w:val="20"/>
+                <w:color w:val="000000"/>
+              </w:rPr>
+              <w:t xml:space="preserve">78.4%</w:t>
+            </w:r>
+          </w:p>
+        </w:tc>
+      </w:tr>
+      <w:tr>
+        <w:trPr>
+          <w:trHeight w:val="614" w:hRule="auto"/>
+        </w:trPr>
+        <w:tc>
+          <w:tcPr>
+            <w:tcBorders>
+              <w:bottom w:val="single" w:sz="12" w:space="0" w:color="666666"/>
+              <w:top w:val="none" w:sz="0" w:space="0" w:color="000000"/>
+              <w:left w:val="none" w:sz="0" w:space="0" w:color="000000"/>
+              <w:right w:val="none" w:sz="0" w:space="0" w:color="000000"/>
+            </w:tcBorders>
+            <w:shd w:val="clear" w:color="auto" w:fill="FFFFFF"/>
+            <w:tcMar>
+              <w:top w:w="0" w:type="dxa"/>
+              <w:bottom w:w="0" w:type="dxa"/>
+              <w:left w:w="0" w:type="dxa"/>
+              <w:right w:w="0" w:type="dxa"/>
+            </w:tcMar>
+            <w:vAlign w:val="top"/>
+          </w:tcPr>
+          <w:p>
+            <w:pPr>
+              <w:pStyle w:val="Normal"/>
+              <w:jc w:val="left"/>
+              <w:pBdr>
+                <w:bottom w:val="none" w:sz="0" w:space="0" w:color="000000"/>
+                <w:top w:val="none" w:sz="0" w:space="0" w:color="000000"/>
+                <w:left w:val="none" w:sz="0" w:space="0" w:color="000000"/>
+                <w:right w:val="none" w:sz="0" w:space="0" w:color="000000"/>
+              </w:pBdr>
+              <w:spacing w:after="100" w:before="100" w:line="240"/>
+              <w:ind w:left="100" w:right="100" w:firstLine="0" w:firstLineChars="0"/>
+              <w:rPr>
+                <w:rFonts w:ascii="Arial" w:hAnsi="Arial" w:eastAsia="Arial" w:cs="Arial"/>
+                <w:i w:val="false"/>
+                <w:b w:val="false"/>
+                <w:u w:val="none"/>
+                <w:strike w:val="false"/>
+                <w:sz w:val="20"/>
+                <w:szCs w:val="20"/>
+                <w:color w:val="000000"/>
+              </w:rPr>
+            </w:pPr>
+            <w:r>
+              <w:rPr>
+                <w:rFonts w:ascii="Arial" w:hAnsi="Arial" w:eastAsia="Arial" w:cs="Arial"/>
+                <w:i w:val="false"/>
+                <w:b w:val="false"/>
+                <w:u w:val="none"/>
+                <w:strike w:val="false"/>
+                <w:sz w:val="20"/>
+                <w:szCs w:val="20"/>
+                <w:color w:val="000000"/>
+              </w:rPr>
+              <w:t xml:space="preserve">Preregistered rules reported</w:t>
+            </w:r>
+          </w:p>
+        </w:tc>
+        <w:tc>
+          <w:tcPr>
+            <w:tcBorders>
+              <w:bottom w:val="single" w:sz="12" w:space="0" w:color="666666"/>
+              <w:top w:val="none" w:sz="0" w:space="0" w:color="000000"/>
+              <w:left w:val="none" w:sz="0" w:space="0" w:color="000000"/>
+              <w:right w:val="none" w:sz="0" w:space="0" w:color="000000"/>
+            </w:tcBorders>
+            <w:shd w:val="clear" w:color="auto" w:fill="FFFFFF"/>
+            <w:tcMar>
+              <w:top w:w="0" w:type="dxa"/>
+              <w:bottom w:w="0" w:type="dxa"/>
+              <w:left w:w="0" w:type="dxa"/>
+              <w:right w:w="0" w:type="dxa"/>
+            </w:tcMar>
+            <w:vAlign w:val="top"/>
+          </w:tcPr>
+          <w:p>
+            <w:pPr>
+              <w:pStyle w:val="Normal"/>
+              <w:jc w:val="left"/>
+              <w:pBdr>
+                <w:bottom w:val="none" w:sz="0" w:space="0" w:color="000000"/>
+                <w:top w:val="none" w:sz="0" w:space="0" w:color="000000"/>
+                <w:left w:val="none" w:sz="0" w:space="0" w:color="000000"/>
+                <w:right w:val="none" w:sz="0" w:space="0" w:color="000000"/>
+              </w:pBdr>
+              <w:spacing w:after="100" w:before="100" w:line="240"/>
+              <w:ind w:left="100" w:right="100" w:firstLine="0" w:firstLineChars="0"/>
+              <w:rPr>
+                <w:rFonts w:ascii="Arial" w:hAnsi="Arial" w:eastAsia="Arial" w:cs="Arial"/>
+                <w:i w:val="false"/>
+                <w:b w:val="false"/>
+                <w:u w:val="none"/>
+                <w:strike w:val="false"/>
+                <w:sz w:val="20"/>
+                <w:szCs w:val="20"/>
+                <w:color w:val="000000"/>
+              </w:rPr>
+            </w:pPr>
+            <w:r>
+              <w:rPr>
+                <w:rFonts w:ascii="Arial" w:hAnsi="Arial" w:eastAsia="Arial" w:cs="Arial"/>
+                <w:i w:val="false"/>
+                <w:b w:val="false"/>
+                <w:u w:val="none"/>
+                <w:strike w:val="false"/>
+                <w:sz w:val="20"/>
+                <w:szCs w:val="20"/>
+                <w:color w:val="000000"/>
+              </w:rPr>
+              <w:t xml:space="preserve">1</w:t>
+            </w:r>
+          </w:p>
+        </w:tc>
+        <w:tc>
+          <w:tcPr>
+            <w:tcBorders>
+              <w:bottom w:val="single" w:sz="12" w:space="0" w:color="666666"/>
+              <w:top w:val="none" w:sz="0" w:space="0" w:color="000000"/>
+              <w:left w:val="none" w:sz="0" w:space="0" w:color="000000"/>
+              <w:right w:val="none" w:sz="0" w:space="0" w:color="000000"/>
+            </w:tcBorders>
+            <w:shd w:val="clear" w:color="auto" w:fill="FFFFFF"/>
+            <w:tcMar>
+              <w:top w:w="0" w:type="dxa"/>
+              <w:bottom w:w="0" w:type="dxa"/>
+              <w:left w:w="0" w:type="dxa"/>
+              <w:right w:w="0" w:type="dxa"/>
+            </w:tcMar>
+            <w:vAlign w:val="top"/>
+          </w:tcPr>
+          <w:p>
+            <w:pPr>
+              <w:pStyle w:val="Normal"/>
+              <w:jc w:val="left"/>
+              <w:pBdr>
+                <w:bottom w:val="none" w:sz="0" w:space="0" w:color="000000"/>
+                <w:top w:val="none" w:sz="0" w:space="0" w:color="000000"/>
+                <w:left w:val="none" w:sz="0" w:space="0" w:color="000000"/>
+                <w:right w:val="none" w:sz="0" w:space="0" w:color="000000"/>
+              </w:pBdr>
+              <w:spacing w:after="100" w:before="100" w:line="240"/>
+              <w:ind w:left="100" w:right="100" w:firstLine="0" w:firstLineChars="0"/>
+              <w:rPr>
+                <w:rFonts w:ascii="Arial" w:hAnsi="Arial" w:eastAsia="Arial" w:cs="Arial"/>
+                <w:i w:val="false"/>
+                <w:b w:val="false"/>
+                <w:u w:val="none"/>
+                <w:strike w:val="false"/>
+                <w:sz w:val="20"/>
+                <w:szCs w:val="20"/>
+                <w:color w:val="000000"/>
+              </w:rPr>
+            </w:pPr>
+            <w:r>
+              <w:rPr>
+                <w:rFonts w:ascii="Arial" w:hAnsi="Arial" w:eastAsia="Arial" w:cs="Arial"/>
+                <w:i w:val="false"/>
+                <w:b w:val="false"/>
+                <w:u w:val="none"/>
+                <w:strike w:val="false"/>
+                <w:sz w:val="20"/>
+                <w:szCs w:val="20"/>
+                <w:color w:val="000000"/>
+              </w:rPr>
+              <w:t xml:space="preserve">1/37</w:t>
+            </w:r>
+          </w:p>
+        </w:tc>
+        <w:tc>
+          <w:tcPr>
+            <w:tcBorders>
+              <w:bottom w:val="single" w:sz="12" w:space="0" w:color="666666"/>
+              <w:top w:val="none" w:sz="0" w:space="0" w:color="000000"/>
+              <w:left w:val="none" w:sz="0" w:space="0" w:color="000000"/>
+              <w:right w:val="none" w:sz="0" w:space="0" w:color="000000"/>
+            </w:tcBorders>
+            <w:shd w:val="clear" w:color="auto" w:fill="FFFFFF"/>
+            <w:tcMar>
+              <w:top w:w="0" w:type="dxa"/>
+              <w:bottom w:w="0" w:type="dxa"/>
+              <w:left w:w="0" w:type="dxa"/>
+              <w:right w:w="0" w:type="dxa"/>
+            </w:tcMar>
+            <w:vAlign w:val="top"/>
+          </w:tcPr>
+          <w:p>
+            <w:pPr>
+              <w:pStyle w:val="Normal"/>
+              <w:jc w:val="left"/>
+              <w:pBdr>
+                <w:bottom w:val="none" w:sz="0" w:space="0" w:color="000000"/>
+                <w:top w:val="none" w:sz="0" w:space="0" w:color="000000"/>
+                <w:left w:val="none" w:sz="0" w:space="0" w:color="000000"/>
+                <w:right w:val="none" w:sz="0" w:space="0" w:color="000000"/>
+              </w:pBdr>
+              <w:spacing w:after="100" w:before="100" w:line="240"/>
+              <w:ind w:left="100" w:right="100" w:firstLine="0" w:firstLineChars="0"/>
+              <w:rPr>
+                <w:rFonts w:ascii="Arial" w:hAnsi="Arial" w:eastAsia="Arial" w:cs="Arial"/>
+                <w:i w:val="false"/>
+                <w:b w:val="false"/>
+                <w:u w:val="none"/>
+                <w:strike w:val="false"/>
+                <w:sz w:val="20"/>
+                <w:szCs w:val="20"/>
+                <w:color w:val="000000"/>
+              </w:rPr>
+            </w:pPr>
+            <w:r>
+              <w:rPr>
+                <w:rFonts w:ascii="Arial" w:hAnsi="Arial" w:eastAsia="Arial" w:cs="Arial"/>
+                <w:i w:val="false"/>
+                <w:b w:val="false"/>
+                <w:u w:val="none"/>
+                <w:strike w:val="false"/>
+                <w:sz w:val="20"/>
+                <w:szCs w:val="20"/>
+                <w:color w:val="000000"/>
+              </w:rPr>
+              <w:t xml:space="preserve">2.7%</w:t>
+            </w:r>
+          </w:p>
+        </w:tc>
+      </w:tr>
+    </w:tbl>
+    <w:p>
+      <w:pPr>
+        <w:pStyle w:val="Normal"/>
+      </w:pPr>
+      <w:r>
+        <w:t xml:space="preserve"/>
+      </w:r>
+    </w:p>
+    <w:p>
+      <w:pPr>
+        <w:pStyle w:val="TableCaption"/>
+        <w:jc w:val="center"/>
+        <w:keepNext/>
+        <w:pBdr>
+          <w:bottom w:val="none" w:sz="0" w:space="0" w:color="000000"/>
+          <w:top w:val="none" w:sz="0" w:space="0" w:color="000000"/>
+          <w:left w:val="none" w:sz="0" w:space="0" w:color="000000"/>
+          <w:right w:val="none" w:sz="0" w:space="0" w:color="000000"/>
+        </w:pBdr>
+        <w:spacing w:after="60" w:before="60" w:line="240"/>
+        <w:ind w:left="60" w:right="60" w:firstLine="0" w:firstLineChars="0"/>
+      </w:pPr>
+      <w:r>
+        <w:t xml:space="preserve">Software used</w:t>
+      </w:r>
+    </w:p>
+    <w:tbl xmlns:a="http://schemas.openxmlformats.org/drawingml/2006/main" xmlns:pic="http://schemas.openxmlformats.org/drawingml/2006/picture">
+      <w:tblPr>
+        <w:tblLayout w:type="fixed"/>
+        <w:jc w:val="center"/>
+        <w:tblLook w:firstRow="1" w:lastRow="0" w:firstColumn="0" w:lastColumn="0" w:noHBand="0" w:noVBand="1"/>
+      </w:tblPr>
+      <w:tblGrid>
+        <w:gridCol w:w="1817"/>
+        <w:gridCol w:w="1474"/>
+        <w:gridCol w:w="1976"/>
+        <w:gridCol w:w="1169"/>
+      </w:tblGrid>
+      <w:tr>
+        <w:trPr>
+          <w:trHeight w:val="617" w:hRule="auto"/>
+          <w:tblHeader/>
+        </w:trPr>
+        <w:tc>
+          <w:tcPr>
+            <w:tcBorders>
+              <w:bottom w:val="single" w:sz="12" w:space="0" w:color="666666"/>
+              <w:top w:val="single" w:sz="12" w:space="0" w:color="666666"/>
+              <w:left w:val="none" w:sz="0" w:space="0" w:color="000000"/>
+              <w:right w:val="none" w:sz="0" w:space="0" w:color="000000"/>
+            </w:tcBorders>
+            <w:shd w:val="clear" w:color="auto" w:fill="FFFFFF"/>
+            <w:tcMar>
+              <w:top w:w="0" w:type="dxa"/>
+              <w:bottom w:w="0" w:type="dxa"/>
+              <w:left w:w="0" w:type="dxa"/>
+              <w:right w:w="0" w:type="dxa"/>
+            </w:tcMar>
+            <w:vAlign w:val="top"/>
+          </w:tcPr>
+          <w:p>
+            <w:pPr>
+              <w:pStyle w:val="Normal"/>
+              <w:jc w:val="left"/>
+              <w:pBdr>
+                <w:bottom w:val="none" w:sz="0" w:space="0" w:color="000000"/>
+                <w:top w:val="none" w:sz="0" w:space="0" w:color="000000"/>
+                <w:left w:val="none" w:sz="0" w:space="0" w:color="000000"/>
+                <w:right w:val="none" w:sz="0" w:space="0" w:color="000000"/>
+              </w:pBdr>
+              <w:spacing w:after="100" w:before="100" w:line="240"/>
+              <w:ind w:left="100" w:right="100" w:firstLine="0" w:firstLineChars="0"/>
+              <w:rPr>
+                <w:rFonts w:ascii="Arial" w:hAnsi="Arial" w:eastAsia="Arial" w:cs="Arial"/>
+                <w:i w:val="false"/>
+                <w:b w:val="false"/>
+                <w:u w:val="none"/>
+                <w:strike w:val="false"/>
+                <w:sz w:val="20"/>
+                <w:szCs w:val="20"/>
+                <w:color w:val="000000"/>
+              </w:rPr>
+            </w:pPr>
+            <w:r>
+              <w:rPr>
+                <w:rFonts w:ascii="Arial" w:hAnsi="Arial" w:eastAsia="Arial" w:cs="Arial"/>
+                <w:i w:val="false"/>
+                <w:b w:val="false"/>
+                <w:u w:val="none"/>
+                <w:strike w:val="false"/>
+                <w:sz w:val="20"/>
+                <w:szCs w:val="20"/>
+                <w:color w:val="000000"/>
+              </w:rPr>
+              <w:t xml:space="preserve">Software used</w:t>
+            </w:r>
+          </w:p>
+        </w:tc>
+        <w:tc>
+          <w:tcPr>
+            <w:tcBorders>
+              <w:bottom w:val="single" w:sz="12" w:space="0" w:color="666666"/>
+              <w:top w:val="single" w:sz="12" w:space="0" w:color="666666"/>
+              <w:left w:val="none" w:sz="0" w:space="0" w:color="000000"/>
+              <w:right w:val="none" w:sz="0" w:space="0" w:color="000000"/>
+            </w:tcBorders>
+            <w:shd w:val="clear" w:color="auto" w:fill="FFFFFF"/>
+            <w:tcMar>
+              <w:top w:w="0" w:type="dxa"/>
+              <w:bottom w:w="0" w:type="dxa"/>
+              <w:left w:w="0" w:type="dxa"/>
+              <w:right w:w="0" w:type="dxa"/>
+            </w:tcMar>
+            <w:vAlign w:val="top"/>
+          </w:tcPr>
+          <w:p>
+            <w:pPr>
+              <w:pStyle w:val="Normal"/>
+              <w:jc w:val="left"/>
+              <w:pBdr>
+                <w:bottom w:val="none" w:sz="0" w:space="0" w:color="000000"/>
+                <w:top w:val="none" w:sz="0" w:space="0" w:color="000000"/>
+                <w:left w:val="none" w:sz="0" w:space="0" w:color="000000"/>
+                <w:right w:val="none" w:sz="0" w:space="0" w:color="000000"/>
+              </w:pBdr>
+              <w:spacing w:after="100" w:before="100" w:line="240"/>
+              <w:ind w:left="100" w:right="100" w:firstLine="0" w:firstLineChars="0"/>
+              <w:rPr>
+                <w:rFonts w:ascii="Arial" w:hAnsi="Arial" w:eastAsia="Arial" w:cs="Arial"/>
+                <w:i w:val="false"/>
+                <w:b w:val="false"/>
+                <w:u w:val="none"/>
+                <w:strike w:val="false"/>
+                <w:sz w:val="20"/>
+                <w:szCs w:val="20"/>
+                <w:color w:val="000000"/>
+              </w:rPr>
+            </w:pPr>
+            <w:r>
+              <w:rPr>
+                <w:rFonts w:ascii="Arial" w:hAnsi="Arial" w:eastAsia="Arial" w:cs="Arial"/>
+                <w:i w:val="false"/>
+                <w:b w:val="false"/>
+                <w:u w:val="none"/>
+                <w:strike w:val="false"/>
+                <w:sz w:val="20"/>
+                <w:szCs w:val="20"/>
+                <w:color w:val="000000"/>
+              </w:rPr>
+              <w:t xml:space="preserve">n (Studies)</w:t>
+            </w:r>
+          </w:p>
+        </w:tc>
+        <w:tc>
+          <w:tcPr>
+            <w:tcBorders>
+              <w:bottom w:val="single" w:sz="12" w:space="0" w:color="666666"/>
+              <w:top w:val="single" w:sz="12" w:space="0" w:color="666666"/>
+              <w:left w:val="none" w:sz="0" w:space="0" w:color="000000"/>
+              <w:right w:val="none" w:sz="0" w:space="0" w:color="000000"/>
+            </w:tcBorders>
+            <w:shd w:val="clear" w:color="auto" w:fill="FFFFFF"/>
+            <w:tcMar>
+              <w:top w:w="0" w:type="dxa"/>
+              <w:bottom w:w="0" w:type="dxa"/>
+              <w:left w:w="0" w:type="dxa"/>
+              <w:right w:w="0" w:type="dxa"/>
+            </w:tcMar>
+            <w:vAlign w:val="top"/>
+          </w:tcPr>
+          <w:p>
+            <w:pPr>
+              <w:pStyle w:val="Normal"/>
+              <w:jc w:val="left"/>
+              <w:pBdr>
+                <w:bottom w:val="none" w:sz="0" w:space="0" w:color="000000"/>
+                <w:top w:val="none" w:sz="0" w:space="0" w:color="000000"/>
+                <w:left w:val="none" w:sz="0" w:space="0" w:color="000000"/>
+                <w:right w:val="none" w:sz="0" w:space="0" w:color="000000"/>
+              </w:pBdr>
+              <w:spacing w:after="100" w:before="100" w:line="240"/>
+              <w:ind w:left="100" w:right="100" w:firstLine="0" w:firstLineChars="0"/>
+              <w:rPr>
+                <w:rFonts w:ascii="Arial" w:hAnsi="Arial" w:eastAsia="Arial" w:cs="Arial"/>
+                <w:i w:val="false"/>
+                <w:b w:val="false"/>
+                <w:u w:val="none"/>
+                <w:strike w:val="false"/>
+                <w:sz w:val="20"/>
+                <w:szCs w:val="20"/>
+                <w:color w:val="000000"/>
+              </w:rPr>
+            </w:pPr>
+            <w:r>
+              <w:rPr>
+                <w:rFonts w:ascii="Arial" w:hAnsi="Arial" w:eastAsia="Arial" w:cs="Arial"/>
+                <w:i w:val="false"/>
+                <w:b w:val="false"/>
+                <w:u w:val="none"/>
+                <w:strike w:val="false"/>
+                <w:sz w:val="20"/>
+                <w:szCs w:val="20"/>
+                <w:color w:val="000000"/>
+              </w:rPr>
+              <w:t xml:space="preserve">Proportion (n/N)</w:t>
+            </w:r>
+          </w:p>
+        </w:tc>
+        <w:tc>
+          <w:tcPr>
+            <w:tcBorders>
+              <w:bottom w:val="single" w:sz="12" w:space="0" w:color="666666"/>
+              <w:top w:val="single" w:sz="12" w:space="0" w:color="666666"/>
+              <w:left w:val="none" w:sz="0" w:space="0" w:color="000000"/>
+              <w:right w:val="none" w:sz="0" w:space="0" w:color="000000"/>
+            </w:tcBorders>
+            <w:shd w:val="clear" w:color="auto" w:fill="FFFFFF"/>
+            <w:tcMar>
+              <w:top w:w="0" w:type="dxa"/>
+              <w:bottom w:w="0" w:type="dxa"/>
+              <w:left w:w="0" w:type="dxa"/>
+              <w:right w:w="0" w:type="dxa"/>
+            </w:tcMar>
+            <w:vAlign w:val="top"/>
+          </w:tcPr>
+          <w:p>
+            <w:pPr>
+              <w:pStyle w:val="Normal"/>
+              <w:jc w:val="left"/>
+              <w:pBdr>
+                <w:bottom w:val="none" w:sz="0" w:space="0" w:color="000000"/>
+                <w:top w:val="none" w:sz="0" w:space="0" w:color="000000"/>
+                <w:left w:val="none" w:sz="0" w:space="0" w:color="000000"/>
+                <w:right w:val="none" w:sz="0" w:space="0" w:color="000000"/>
+              </w:pBdr>
+              <w:spacing w:after="100" w:before="100" w:line="240"/>
+              <w:ind w:left="100" w:right="100" w:firstLine="0" w:firstLineChars="0"/>
+              <w:rPr>
+                <w:rFonts w:ascii="Arial" w:hAnsi="Arial" w:eastAsia="Arial" w:cs="Arial"/>
+                <w:i w:val="false"/>
+                <w:b w:val="false"/>
+                <w:u w:val="none"/>
+                <w:strike w:val="false"/>
+                <w:sz w:val="20"/>
+                <w:szCs w:val="20"/>
+                <w:color w:val="000000"/>
+              </w:rPr>
+            </w:pPr>
+            <w:r>
+              <w:rPr>
+                <w:rFonts w:ascii="Arial" w:hAnsi="Arial" w:eastAsia="Arial" w:cs="Arial"/>
+                <w:i w:val="false"/>
+                <w:b w:val="false"/>
+                <w:u w:val="none"/>
+                <w:strike w:val="false"/>
+                <w:sz w:val="20"/>
+                <w:szCs w:val="20"/>
+                <w:color w:val="000000"/>
+              </w:rPr>
+              <w:t xml:space="preserve">Percent</w:t>
+            </w:r>
+          </w:p>
+        </w:tc>
+      </w:tr>
+      <w:tr>
+        <w:trPr>
+          <w:trHeight w:val="577" w:hRule="auto"/>
+        </w:trPr>
+        <w:tc>
+          <w:tcPr>
+            <w:tcBorders>
+              <w:bottom w:val="none" w:sz="0" w:space="0" w:color="000000"/>
+              <w:top w:val="single" w:sz="12" w:space="0" w:color="666666"/>
+              <w:left w:val="none" w:sz="0" w:space="0" w:color="000000"/>
+              <w:right w:val="none" w:sz="0" w:space="0" w:color="000000"/>
+            </w:tcBorders>
+            <w:shd w:val="clear" w:color="auto" w:fill="FFFFFF"/>
+            <w:tcMar>
+              <w:top w:w="0" w:type="dxa"/>
+              <w:bottom w:w="0" w:type="dxa"/>
+              <w:left w:w="0" w:type="dxa"/>
+              <w:right w:w="0" w:type="dxa"/>
+            </w:tcMar>
+            <w:vAlign w:val="top"/>
+          </w:tcPr>
+          <w:p>
+            <w:pPr>
+              <w:pStyle w:val="Normal"/>
+              <w:jc w:val="left"/>
+              <w:pBdr>
+                <w:bottom w:val="none" w:sz="0" w:space="0" w:color="000000"/>
+                <w:top w:val="none" w:sz="0" w:space="0" w:color="000000"/>
+                <w:left w:val="none" w:sz="0" w:space="0" w:color="000000"/>
+                <w:right w:val="none" w:sz="0" w:space="0" w:color="000000"/>
+              </w:pBdr>
+              <w:spacing w:after="100" w:before="100" w:line="240"/>
+              <w:ind w:left="100" w:right="100" w:firstLine="0" w:firstLineChars="0"/>
+              <w:rPr>
+                <w:rFonts w:ascii="Arial" w:hAnsi="Arial" w:eastAsia="Arial" w:cs="Arial"/>
+                <w:i w:val="false"/>
+                <w:b w:val="false"/>
+                <w:u w:val="none"/>
+                <w:strike w:val="false"/>
+                <w:sz w:val="20"/>
+                <w:szCs w:val="20"/>
+                <w:color w:val="000000"/>
+              </w:rPr>
+            </w:pPr>
+            <w:r>
+              <w:rPr>
+                <w:rFonts w:ascii="Arial" w:hAnsi="Arial" w:eastAsia="Arial" w:cs="Arial"/>
+                <w:i w:val="false"/>
+                <w:b w:val="false"/>
+                <w:u w:val="none"/>
+                <w:strike w:val="false"/>
+                <w:sz w:val="20"/>
+                <w:szCs w:val="20"/>
+                <w:color w:val="000000"/>
+              </w:rPr>
+              <w:t xml:space="preserve">R</w:t>
+            </w:r>
+          </w:p>
+        </w:tc>
+        <w:tc>
+          <w:tcPr>
+            <w:tcBorders>
+              <w:bottom w:val="none" w:sz="0" w:space="0" w:color="000000"/>
+              <w:top w:val="single" w:sz="12" w:space="0" w:color="666666"/>
+              <w:left w:val="none" w:sz="0" w:space="0" w:color="000000"/>
+              <w:right w:val="none" w:sz="0" w:space="0" w:color="000000"/>
+            </w:tcBorders>
+            <w:shd w:val="clear" w:color="auto" w:fill="FFFFFF"/>
+            <w:tcMar>
+              <w:top w:w="0" w:type="dxa"/>
+              <w:bottom w:w="0" w:type="dxa"/>
+              <w:left w:w="0" w:type="dxa"/>
+              <w:right w:w="0" w:type="dxa"/>
+            </w:tcMar>
+            <w:vAlign w:val="top"/>
+          </w:tcPr>
+          <w:p>
+            <w:pPr>
+              <w:pStyle w:val="Normal"/>
+              <w:jc w:val="left"/>
+              <w:pBdr>
+                <w:bottom w:val="none" w:sz="0" w:space="0" w:color="000000"/>
+                <w:top w:val="none" w:sz="0" w:space="0" w:color="000000"/>
+                <w:left w:val="none" w:sz="0" w:space="0" w:color="000000"/>
+                <w:right w:val="none" w:sz="0" w:space="0" w:color="000000"/>
+              </w:pBdr>
+              <w:spacing w:after="100" w:before="100" w:line="240"/>
+              <w:ind w:left="100" w:right="100" w:firstLine="0" w:firstLineChars="0"/>
+              <w:rPr>
+                <w:rFonts w:ascii="Arial" w:hAnsi="Arial" w:eastAsia="Arial" w:cs="Arial"/>
+                <w:i w:val="false"/>
+                <w:b w:val="false"/>
+                <w:u w:val="none"/>
+                <w:strike w:val="false"/>
+                <w:sz w:val="20"/>
+                <w:szCs w:val="20"/>
+                <w:color w:val="000000"/>
+              </w:rPr>
+            </w:pPr>
+            <w:r>
+              <w:rPr>
+                <w:rFonts w:ascii="Arial" w:hAnsi="Arial" w:eastAsia="Arial" w:cs="Arial"/>
+                <w:i w:val="false"/>
+                <w:b w:val="false"/>
+                <w:u w:val="none"/>
+                <w:strike w:val="false"/>
+                <w:sz w:val="20"/>
+                <w:szCs w:val="20"/>
+                <w:color w:val="000000"/>
+              </w:rPr>
+              <w:t xml:space="preserve">25</w:t>
+            </w:r>
+          </w:p>
+        </w:tc>
+        <w:tc>
+          <w:tcPr>
+            <w:tcBorders>
+              <w:bottom w:val="none" w:sz="0" w:space="0" w:color="000000"/>
+              <w:top w:val="single" w:sz="12" w:space="0" w:color="666666"/>
+              <w:left w:val="none" w:sz="0" w:space="0" w:color="000000"/>
+              <w:right w:val="none" w:sz="0" w:space="0" w:color="000000"/>
+            </w:tcBorders>
+            <w:shd w:val="clear" w:color="auto" w:fill="FFFFFF"/>
+            <w:tcMar>
+              <w:top w:w="0" w:type="dxa"/>
+              <w:bottom w:w="0" w:type="dxa"/>
+              <w:left w:w="0" w:type="dxa"/>
+              <w:right w:w="0" w:type="dxa"/>
+            </w:tcMar>
+            <w:vAlign w:val="top"/>
+          </w:tcPr>
+          <w:p>
+            <w:pPr>
+              <w:pStyle w:val="Normal"/>
+              <w:jc w:val="left"/>
+              <w:pBdr>
+                <w:bottom w:val="none" w:sz="0" w:space="0" w:color="000000"/>
+                <w:top w:val="none" w:sz="0" w:space="0" w:color="000000"/>
+                <w:left w:val="none" w:sz="0" w:space="0" w:color="000000"/>
+                <w:right w:val="none" w:sz="0" w:space="0" w:color="000000"/>
+              </w:pBdr>
+              <w:spacing w:after="100" w:before="100" w:line="240"/>
+              <w:ind w:left="100" w:right="100" w:firstLine="0" w:firstLineChars="0"/>
+              <w:rPr>
+                <w:rFonts w:ascii="Arial" w:hAnsi="Arial" w:eastAsia="Arial" w:cs="Arial"/>
+                <w:i w:val="false"/>
+                <w:b w:val="false"/>
+                <w:u w:val="none"/>
+                <w:strike w:val="false"/>
+                <w:sz w:val="20"/>
+                <w:szCs w:val="20"/>
+                <w:color w:val="000000"/>
+              </w:rPr>
+            </w:pPr>
+            <w:r>
+              <w:rPr>
+                <w:rFonts w:ascii="Arial" w:hAnsi="Arial" w:eastAsia="Arial" w:cs="Arial"/>
+                <w:i w:val="false"/>
+                <w:b w:val="false"/>
+                <w:u w:val="none"/>
+                <w:strike w:val="false"/>
+                <w:sz w:val="20"/>
+                <w:szCs w:val="20"/>
+                <w:color w:val="000000"/>
+              </w:rPr>
+              <w:t xml:space="preserve">25/29</w:t>
+            </w:r>
+          </w:p>
+        </w:tc>
+        <w:tc>
+          <w:tcPr>
+            <w:tcBorders>
+              <w:bottom w:val="none" w:sz="0" w:space="0" w:color="000000"/>
+              <w:top w:val="single" w:sz="12" w:space="0" w:color="666666"/>
+              <w:left w:val="none" w:sz="0" w:space="0" w:color="000000"/>
+              <w:right w:val="none" w:sz="0" w:space="0" w:color="000000"/>
+            </w:tcBorders>
+            <w:shd w:val="clear" w:color="auto" w:fill="FFFFFF"/>
+            <w:tcMar>
+              <w:top w:w="0" w:type="dxa"/>
+              <w:bottom w:w="0" w:type="dxa"/>
+              <w:left w:w="0" w:type="dxa"/>
+              <w:right w:w="0" w:type="dxa"/>
+            </w:tcMar>
+            <w:vAlign w:val="top"/>
+          </w:tcPr>
+          <w:p>
+            <w:pPr>
+              <w:pStyle w:val="Normal"/>
+              <w:jc w:val="left"/>
+              <w:pBdr>
+                <w:bottom w:val="none" w:sz="0" w:space="0" w:color="000000"/>
+                <w:top w:val="none" w:sz="0" w:space="0" w:color="000000"/>
+                <w:left w:val="none" w:sz="0" w:space="0" w:color="000000"/>
+                <w:right w:val="none" w:sz="0" w:space="0" w:color="000000"/>
+              </w:pBdr>
+              <w:spacing w:after="100" w:before="100" w:line="240"/>
+              <w:ind w:left="100" w:right="100" w:firstLine="0" w:firstLineChars="0"/>
+              <w:rPr>
+                <w:rFonts w:ascii="Arial" w:hAnsi="Arial" w:eastAsia="Arial" w:cs="Arial"/>
+                <w:i w:val="false"/>
+                <w:b w:val="false"/>
+                <w:u w:val="none"/>
+                <w:strike w:val="false"/>
+                <w:sz w:val="20"/>
+                <w:szCs w:val="20"/>
+                <w:color w:val="000000"/>
+              </w:rPr>
+            </w:pPr>
+            <w:r>
+              <w:rPr>
+                <w:rFonts w:ascii="Arial" w:hAnsi="Arial" w:eastAsia="Arial" w:cs="Arial"/>
+                <w:i w:val="false"/>
+                <w:b w:val="false"/>
+                <w:u w:val="none"/>
+                <w:strike w:val="false"/>
+                <w:sz w:val="20"/>
+                <w:szCs w:val="20"/>
+                <w:color w:val="000000"/>
+              </w:rPr>
+              <w:t xml:space="preserve">86.2%</w:t>
+            </w:r>
+          </w:p>
+        </w:tc>
+      </w:tr>
+      <w:tr>
+        <w:trPr>
+          <w:trHeight w:val="614" w:hRule="auto"/>
+        </w:trPr>
+        <w:tc>
+          <w:tcPr>
+            <w:tcBorders>
+              <w:bottom w:val="none" w:sz="0" w:space="0" w:color="000000"/>
+              <w:top w:val="none" w:sz="0" w:space="0" w:color="000000"/>
+              <w:left w:val="none" w:sz="0" w:space="0" w:color="000000"/>
+              <w:right w:val="none" w:sz="0" w:space="0" w:color="000000"/>
+            </w:tcBorders>
+            <w:shd w:val="clear" w:color="auto" w:fill="FFFFFF"/>
+            <w:tcMar>
+              <w:top w:w="0" w:type="dxa"/>
+              <w:bottom w:w="0" w:type="dxa"/>
+              <w:left w:w="0" w:type="dxa"/>
+              <w:right w:w="0" w:type="dxa"/>
+            </w:tcMar>
+            <w:vAlign w:val="top"/>
+          </w:tcPr>
+          <w:p>
+            <w:pPr>
+              <w:pStyle w:val="Normal"/>
+              <w:jc w:val="left"/>
+              <w:pBdr>
+                <w:bottom w:val="none" w:sz="0" w:space="0" w:color="000000"/>
+                <w:top w:val="none" w:sz="0" w:space="0" w:color="000000"/>
+                <w:left w:val="none" w:sz="0" w:space="0" w:color="000000"/>
+                <w:right w:val="none" w:sz="0" w:space="0" w:color="000000"/>
+              </w:pBdr>
+              <w:spacing w:after="100" w:before="100" w:line="240"/>
+              <w:ind w:left="100" w:right="100" w:firstLine="0" w:firstLineChars="0"/>
+              <w:rPr>
+                <w:rFonts w:ascii="Arial" w:hAnsi="Arial" w:eastAsia="Arial" w:cs="Arial"/>
+                <w:i w:val="false"/>
+                <w:b w:val="false"/>
+                <w:u w:val="none"/>
+                <w:strike w:val="false"/>
+                <w:sz w:val="20"/>
+                <w:szCs w:val="20"/>
+                <w:color w:val="000000"/>
+              </w:rPr>
+            </w:pPr>
+            <w:r>
+              <w:rPr>
+                <w:rFonts w:ascii="Arial" w:hAnsi="Arial" w:eastAsia="Arial" w:cs="Arial"/>
+                <w:i w:val="false"/>
+                <w:b w:val="false"/>
+                <w:u w:val="none"/>
+                <w:strike w:val="false"/>
+                <w:sz w:val="20"/>
+                <w:szCs w:val="20"/>
+                <w:color w:val="000000"/>
+              </w:rPr>
+              <w:t xml:space="preserve">Python</w:t>
+            </w:r>
+          </w:p>
+        </w:tc>
+        <w:tc>
+          <w:tcPr>
+            <w:tcBorders>
+              <w:bottom w:val="none" w:sz="0" w:space="0" w:color="000000"/>
+              <w:top w:val="none" w:sz="0" w:space="0" w:color="000000"/>
+              <w:left w:val="none" w:sz="0" w:space="0" w:color="000000"/>
+              <w:right w:val="none" w:sz="0" w:space="0" w:color="000000"/>
+            </w:tcBorders>
+            <w:shd w:val="clear" w:color="auto" w:fill="FFFFFF"/>
+            <w:tcMar>
+              <w:top w:w="0" w:type="dxa"/>
+              <w:bottom w:w="0" w:type="dxa"/>
+              <w:left w:w="0" w:type="dxa"/>
+              <w:right w:w="0" w:type="dxa"/>
+            </w:tcMar>
+            <w:vAlign w:val="top"/>
+          </w:tcPr>
+          <w:p>
+            <w:pPr>
+              <w:pStyle w:val="Normal"/>
+              <w:jc w:val="left"/>
+              <w:pBdr>
+                <w:bottom w:val="none" w:sz="0" w:space="0" w:color="000000"/>
+                <w:top w:val="none" w:sz="0" w:space="0" w:color="000000"/>
+                <w:left w:val="none" w:sz="0" w:space="0" w:color="000000"/>
+                <w:right w:val="none" w:sz="0" w:space="0" w:color="000000"/>
+              </w:pBdr>
+              <w:spacing w:after="100" w:before="100" w:line="240"/>
+              <w:ind w:left="100" w:right="100" w:firstLine="0" w:firstLineChars="0"/>
+              <w:rPr>
+                <w:rFonts w:ascii="Arial" w:hAnsi="Arial" w:eastAsia="Arial" w:cs="Arial"/>
+                <w:i w:val="false"/>
+                <w:b w:val="false"/>
+                <w:u w:val="none"/>
+                <w:strike w:val="false"/>
+                <w:sz w:val="20"/>
+                <w:szCs w:val="20"/>
+                <w:color w:val="000000"/>
+              </w:rPr>
+            </w:pPr>
+            <w:r>
+              <w:rPr>
+                <w:rFonts w:ascii="Arial" w:hAnsi="Arial" w:eastAsia="Arial" w:cs="Arial"/>
+                <w:i w:val="false"/>
+                <w:b w:val="false"/>
+                <w:u w:val="none"/>
+                <w:strike w:val="false"/>
+                <w:sz w:val="20"/>
+                <w:szCs w:val="20"/>
+                <w:color w:val="000000"/>
+              </w:rPr>
+              <w:t xml:space="preserve">3</w:t>
+            </w:r>
+          </w:p>
+        </w:tc>
+        <w:tc>
+          <w:tcPr>
+            <w:tcBorders>
+              <w:bottom w:val="none" w:sz="0" w:space="0" w:color="000000"/>
+              <w:top w:val="none" w:sz="0" w:space="0" w:color="000000"/>
+              <w:left w:val="none" w:sz="0" w:space="0" w:color="000000"/>
+              <w:right w:val="none" w:sz="0" w:space="0" w:color="000000"/>
+            </w:tcBorders>
+            <w:shd w:val="clear" w:color="auto" w:fill="FFFFFF"/>
+            <w:tcMar>
+              <w:top w:w="0" w:type="dxa"/>
+              <w:bottom w:w="0" w:type="dxa"/>
+              <w:left w:w="0" w:type="dxa"/>
+              <w:right w:w="0" w:type="dxa"/>
+            </w:tcMar>
+            <w:vAlign w:val="top"/>
+          </w:tcPr>
+          <w:p>
+            <w:pPr>
+              <w:pStyle w:val="Normal"/>
+              <w:jc w:val="left"/>
+              <w:pBdr>
+                <w:bottom w:val="none" w:sz="0" w:space="0" w:color="000000"/>
+                <w:top w:val="none" w:sz="0" w:space="0" w:color="000000"/>
+                <w:left w:val="none" w:sz="0" w:space="0" w:color="000000"/>
+                <w:right w:val="none" w:sz="0" w:space="0" w:color="000000"/>
+              </w:pBdr>
+              <w:spacing w:after="100" w:before="100" w:line="240"/>
+              <w:ind w:left="100" w:right="100" w:firstLine="0" w:firstLineChars="0"/>
+              <w:rPr>
+                <w:rFonts w:ascii="Arial" w:hAnsi="Arial" w:eastAsia="Arial" w:cs="Arial"/>
+                <w:i w:val="false"/>
+                <w:b w:val="false"/>
+                <w:u w:val="none"/>
+                <w:strike w:val="false"/>
+                <w:sz w:val="20"/>
+                <w:szCs w:val="20"/>
+                <w:color w:val="000000"/>
+              </w:rPr>
+            </w:pPr>
+            <w:r>
+              <w:rPr>
+                <w:rFonts w:ascii="Arial" w:hAnsi="Arial" w:eastAsia="Arial" w:cs="Arial"/>
+                <w:i w:val="false"/>
+                <w:b w:val="false"/>
+                <w:u w:val="none"/>
+                <w:strike w:val="false"/>
+                <w:sz w:val="20"/>
+                <w:szCs w:val="20"/>
+                <w:color w:val="000000"/>
+              </w:rPr>
+              <w:t xml:space="preserve">3/29</w:t>
+            </w:r>
+          </w:p>
+        </w:tc>
+        <w:tc>
+          <w:tcPr>
+            <w:tcBorders>
+              <w:bottom w:val="none" w:sz="0" w:space="0" w:color="000000"/>
+              <w:top w:val="none" w:sz="0" w:space="0" w:color="000000"/>
+              <w:left w:val="none" w:sz="0" w:space="0" w:color="000000"/>
+              <w:right w:val="none" w:sz="0" w:space="0" w:color="000000"/>
+            </w:tcBorders>
+            <w:shd w:val="clear" w:color="auto" w:fill="FFFFFF"/>
+            <w:tcMar>
+              <w:top w:w="0" w:type="dxa"/>
+              <w:bottom w:w="0" w:type="dxa"/>
+              <w:left w:w="0" w:type="dxa"/>
+              <w:right w:w="0" w:type="dxa"/>
+            </w:tcMar>
+            <w:vAlign w:val="top"/>
+          </w:tcPr>
+          <w:p>
+            <w:pPr>
+              <w:pStyle w:val="Normal"/>
+              <w:jc w:val="left"/>
+              <w:pBdr>
+                <w:bottom w:val="none" w:sz="0" w:space="0" w:color="000000"/>
+                <w:top w:val="none" w:sz="0" w:space="0" w:color="000000"/>
+                <w:left w:val="none" w:sz="0" w:space="0" w:color="000000"/>
+                <w:right w:val="none" w:sz="0" w:space="0" w:color="000000"/>
+              </w:pBdr>
+              <w:spacing w:after="100" w:before="100" w:line="240"/>
+              <w:ind w:left="100" w:right="100" w:firstLine="0" w:firstLineChars="0"/>
+              <w:rPr>
+                <w:rFonts w:ascii="Arial" w:hAnsi="Arial" w:eastAsia="Arial" w:cs="Arial"/>
+                <w:i w:val="false"/>
+                <w:b w:val="false"/>
+                <w:u w:val="none"/>
+                <w:strike w:val="false"/>
+                <w:sz w:val="20"/>
+                <w:szCs w:val="20"/>
+                <w:color w:val="000000"/>
+              </w:rPr>
+            </w:pPr>
+            <w:r>
+              <w:rPr>
+                <w:rFonts w:ascii="Arial" w:hAnsi="Arial" w:eastAsia="Arial" w:cs="Arial"/>
+                <w:i w:val="false"/>
+                <w:b w:val="false"/>
+                <w:u w:val="none"/>
+                <w:strike w:val="false"/>
+                <w:sz w:val="20"/>
+                <w:szCs w:val="20"/>
+                <w:color w:val="000000"/>
+              </w:rPr>
+              <w:t xml:space="preserve">10.3%</w:t>
+            </w:r>
+          </w:p>
+        </w:tc>
+      </w:tr>
+      <w:tr>
+        <w:trPr>
+          <w:trHeight w:val="577" w:hRule="auto"/>
+        </w:trPr>
+        <w:tc>
+          <w:tcPr>
+            <w:tcBorders>
+              <w:bottom w:val="single" w:sz="12" w:space="0" w:color="666666"/>
+              <w:top w:val="none" w:sz="0" w:space="0" w:color="000000"/>
+              <w:left w:val="none" w:sz="0" w:space="0" w:color="000000"/>
+              <w:right w:val="none" w:sz="0" w:space="0" w:color="000000"/>
+            </w:tcBorders>
+            <w:shd w:val="clear" w:color="auto" w:fill="FFFFFF"/>
+            <w:tcMar>
+              <w:top w:w="0" w:type="dxa"/>
+              <w:bottom w:w="0" w:type="dxa"/>
+              <w:left w:w="0" w:type="dxa"/>
+              <w:right w:w="0" w:type="dxa"/>
+            </w:tcMar>
+            <w:vAlign w:val="top"/>
+          </w:tcPr>
+          <w:p>
+            <w:pPr>
+              <w:pStyle w:val="Normal"/>
+              <w:jc w:val="left"/>
+              <w:pBdr>
+                <w:bottom w:val="none" w:sz="0" w:space="0" w:color="000000"/>
+                <w:top w:val="none" w:sz="0" w:space="0" w:color="000000"/>
+                <w:left w:val="none" w:sz="0" w:space="0" w:color="000000"/>
+                <w:right w:val="none" w:sz="0" w:space="0" w:color="000000"/>
+              </w:pBdr>
+              <w:spacing w:after="100" w:before="100" w:line="240"/>
+              <w:ind w:left="100" w:right="100" w:firstLine="0" w:firstLineChars="0"/>
+              <w:rPr>
+                <w:rFonts w:ascii="Arial" w:hAnsi="Arial" w:eastAsia="Arial" w:cs="Arial"/>
+                <w:i w:val="false"/>
+                <w:b w:val="false"/>
+                <w:u w:val="none"/>
+                <w:strike w:val="false"/>
+                <w:sz w:val="20"/>
+                <w:szCs w:val="20"/>
+                <w:color w:val="000000"/>
+              </w:rPr>
+            </w:pPr>
+            <w:r>
+              <w:rPr>
+                <w:rFonts w:ascii="Arial" w:hAnsi="Arial" w:eastAsia="Arial" w:cs="Arial"/>
+                <w:i w:val="false"/>
+                <w:b w:val="false"/>
+                <w:u w:val="none"/>
+                <w:strike w:val="false"/>
+                <w:sz w:val="20"/>
+                <w:szCs w:val="20"/>
+                <w:color w:val="000000"/>
+              </w:rPr>
+              <w:t xml:space="preserve">No code</w:t>
+            </w:r>
+          </w:p>
+        </w:tc>
+        <w:tc>
+          <w:tcPr>
+            <w:tcBorders>
+              <w:bottom w:val="single" w:sz="12" w:space="0" w:color="666666"/>
+              <w:top w:val="none" w:sz="0" w:space="0" w:color="000000"/>
+              <w:left w:val="none" w:sz="0" w:space="0" w:color="000000"/>
+              <w:right w:val="none" w:sz="0" w:space="0" w:color="000000"/>
+            </w:tcBorders>
+            <w:shd w:val="clear" w:color="auto" w:fill="FFFFFF"/>
+            <w:tcMar>
+              <w:top w:w="0" w:type="dxa"/>
+              <w:bottom w:w="0" w:type="dxa"/>
+              <w:left w:w="0" w:type="dxa"/>
+              <w:right w:w="0" w:type="dxa"/>
+            </w:tcMar>
+            <w:vAlign w:val="top"/>
+          </w:tcPr>
+          <w:p>
+            <w:pPr>
+              <w:pStyle w:val="Normal"/>
+              <w:jc w:val="left"/>
+              <w:pBdr>
+                <w:bottom w:val="none" w:sz="0" w:space="0" w:color="000000"/>
+                <w:top w:val="none" w:sz="0" w:space="0" w:color="000000"/>
+                <w:left w:val="none" w:sz="0" w:space="0" w:color="000000"/>
+                <w:right w:val="none" w:sz="0" w:space="0" w:color="000000"/>
+              </w:pBdr>
+              <w:spacing w:after="100" w:before="100" w:line="240"/>
+              <w:ind w:left="100" w:right="100" w:firstLine="0" w:firstLineChars="0"/>
+              <w:rPr>
+                <w:rFonts w:ascii="Arial" w:hAnsi="Arial" w:eastAsia="Arial" w:cs="Arial"/>
+                <w:i w:val="false"/>
+                <w:b w:val="false"/>
+                <w:u w:val="none"/>
+                <w:strike w:val="false"/>
+                <w:sz w:val="20"/>
+                <w:szCs w:val="20"/>
+                <w:color w:val="000000"/>
+              </w:rPr>
+            </w:pPr>
+            <w:r>
+              <w:rPr>
+                <w:rFonts w:ascii="Arial" w:hAnsi="Arial" w:eastAsia="Arial" w:cs="Arial"/>
+                <w:i w:val="false"/>
+                <w:b w:val="false"/>
+                <w:u w:val="none"/>
+                <w:strike w:val="false"/>
+                <w:sz w:val="20"/>
+                <w:szCs w:val="20"/>
+                <w:color w:val="000000"/>
+              </w:rPr>
+              <w:t xml:space="preserve">1</w:t>
+            </w:r>
+          </w:p>
+        </w:tc>
+        <w:tc>
+          <w:tcPr>
+            <w:tcBorders>
+              <w:bottom w:val="single" w:sz="12" w:space="0" w:color="666666"/>
+              <w:top w:val="none" w:sz="0" w:space="0" w:color="000000"/>
+              <w:left w:val="none" w:sz="0" w:space="0" w:color="000000"/>
+              <w:right w:val="none" w:sz="0" w:space="0" w:color="000000"/>
+            </w:tcBorders>
+            <w:shd w:val="clear" w:color="auto" w:fill="FFFFFF"/>
+            <w:tcMar>
+              <w:top w:w="0" w:type="dxa"/>
+              <w:bottom w:w="0" w:type="dxa"/>
+              <w:left w:w="0" w:type="dxa"/>
+              <w:right w:w="0" w:type="dxa"/>
+            </w:tcMar>
+            <w:vAlign w:val="top"/>
+          </w:tcPr>
+          <w:p>
+            <w:pPr>
+              <w:pStyle w:val="Normal"/>
+              <w:jc w:val="left"/>
+              <w:pBdr>
+                <w:bottom w:val="none" w:sz="0" w:space="0" w:color="000000"/>
+                <w:top w:val="none" w:sz="0" w:space="0" w:color="000000"/>
+                <w:left w:val="none" w:sz="0" w:space="0" w:color="000000"/>
+                <w:right w:val="none" w:sz="0" w:space="0" w:color="000000"/>
+              </w:pBdr>
+              <w:spacing w:after="100" w:before="100" w:line="240"/>
+              <w:ind w:left="100" w:right="100" w:firstLine="0" w:firstLineChars="0"/>
+              <w:rPr>
+                <w:rFonts w:ascii="Arial" w:hAnsi="Arial" w:eastAsia="Arial" w:cs="Arial"/>
+                <w:i w:val="false"/>
+                <w:b w:val="false"/>
+                <w:u w:val="none"/>
+                <w:strike w:val="false"/>
+                <w:sz w:val="20"/>
+                <w:szCs w:val="20"/>
+                <w:color w:val="000000"/>
+              </w:rPr>
+            </w:pPr>
+            <w:r>
+              <w:rPr>
+                <w:rFonts w:ascii="Arial" w:hAnsi="Arial" w:eastAsia="Arial" w:cs="Arial"/>
+                <w:i w:val="false"/>
+                <w:b w:val="false"/>
+                <w:u w:val="none"/>
+                <w:strike w:val="false"/>
+                <w:sz w:val="20"/>
+                <w:szCs w:val="20"/>
+                <w:color w:val="000000"/>
+              </w:rPr>
+              <w:t xml:space="preserve">1/29</w:t>
+            </w:r>
+          </w:p>
+        </w:tc>
+        <w:tc>
+          <w:tcPr>
+            <w:tcBorders>
+              <w:bottom w:val="single" w:sz="12" w:space="0" w:color="666666"/>
+              <w:top w:val="none" w:sz="0" w:space="0" w:color="000000"/>
+              <w:left w:val="none" w:sz="0" w:space="0" w:color="000000"/>
+              <w:right w:val="none" w:sz="0" w:space="0" w:color="000000"/>
+            </w:tcBorders>
+            <w:shd w:val="clear" w:color="auto" w:fill="FFFFFF"/>
+            <w:tcMar>
+              <w:top w:w="0" w:type="dxa"/>
+              <w:bottom w:w="0" w:type="dxa"/>
+              <w:left w:w="0" w:type="dxa"/>
+              <w:right w:w="0" w:type="dxa"/>
+            </w:tcMar>
+            <w:vAlign w:val="top"/>
+          </w:tcPr>
+          <w:p>
+            <w:pPr>
+              <w:pStyle w:val="Normal"/>
+              <w:jc w:val="left"/>
+              <w:pBdr>
+                <w:bottom w:val="none" w:sz="0" w:space="0" w:color="000000"/>
+                <w:top w:val="none" w:sz="0" w:space="0" w:color="000000"/>
+                <w:left w:val="none" w:sz="0" w:space="0" w:color="000000"/>
+                <w:right w:val="none" w:sz="0" w:space="0" w:color="000000"/>
+              </w:pBdr>
+              <w:spacing w:after="100" w:before="100" w:line="240"/>
+              <w:ind w:left="100" w:right="100" w:firstLine="0" w:firstLineChars="0"/>
+              <w:rPr>
+                <w:rFonts w:ascii="Arial" w:hAnsi="Arial" w:eastAsia="Arial" w:cs="Arial"/>
+                <w:i w:val="false"/>
+                <w:b w:val="false"/>
+                <w:u w:val="none"/>
+                <w:strike w:val="false"/>
+                <w:sz w:val="20"/>
+                <w:szCs w:val="20"/>
+                <w:color w:val="000000"/>
+              </w:rPr>
+            </w:pPr>
+            <w:r>
+              <w:rPr>
+                <w:rFonts w:ascii="Arial" w:hAnsi="Arial" w:eastAsia="Arial" w:cs="Arial"/>
+                <w:i w:val="false"/>
+                <w:b w:val="false"/>
+                <w:u w:val="none"/>
+                <w:strike w:val="false"/>
+                <w:sz w:val="20"/>
+                <w:szCs w:val="20"/>
+                <w:color w:val="000000"/>
+              </w:rPr>
+              <w:t xml:space="preserve">3.4%</w:t>
+            </w:r>
+          </w:p>
+        </w:tc>
+      </w:tr>
+    </w:tbl>
+    <w:p>
+      <w:pPr>
+        <w:pStyle w:val="Normal"/>
+      </w:pPr>
+      <w:r>
+        <w:t xml:space="preserve"/>
+      </w:r>
+    </w:p>
     <w:sectPr>
       <w:type w:val="continuous"/>
       <w:pgSz w:w="11900" w:h="16840"/>

</xml_diff>

<commit_message>
some minor corrections in data and renaming of values
</commit_message>
<xml_diff>
--- a/outputs/tables_methods_synthesis_simpler.docx
+++ b/outputs/tables_methods_synthesis_simpler.docx
@@ -21629,938 +21629,6 @@
         <w:ind w:left="60" w:right="60" w:firstLine="0" w:firstLineChars="0"/>
       </w:pPr>
       <w:r>
-        <w:t xml:space="preserve">Coding reliability indicators</w:t>
-      </w:r>
-    </w:p>
-    <w:tbl xmlns:a="http://schemas.openxmlformats.org/drawingml/2006/main" xmlns:pic="http://schemas.openxmlformats.org/drawingml/2006/picture">
-      <w:tblPr>
-        <w:tblLayout w:type="fixed"/>
-        <w:jc w:val="center"/>
-        <w:tblLook w:firstRow="1" w:lastRow="0" w:firstColumn="0" w:lastColumn="0" w:noHBand="0" w:noVBand="1"/>
-      </w:tblPr>
-      <w:tblGrid>
-        <w:gridCol w:w="4263"/>
-        <w:gridCol w:w="1474"/>
-        <w:gridCol w:w="1976"/>
-        <w:gridCol w:w="1169"/>
-      </w:tblGrid>
-      <w:tr>
-        <w:trPr>
-          <w:trHeight w:val="617" w:hRule="auto"/>
-          <w:tblHeader/>
-        </w:trPr>
-        <w:tc>
-          <w:tcPr>
-            <w:tcBorders>
-              <w:bottom w:val="single" w:sz="12" w:space="0" w:color="666666"/>
-              <w:top w:val="single" w:sz="12" w:space="0" w:color="666666"/>
-              <w:left w:val="none" w:sz="0" w:space="0" w:color="000000"/>
-              <w:right w:val="none" w:sz="0" w:space="0" w:color="000000"/>
-            </w:tcBorders>
-            <w:shd w:val="clear" w:color="auto" w:fill="FFFFFF"/>
-            <w:tcMar>
-              <w:top w:w="0" w:type="dxa"/>
-              <w:bottom w:w="0" w:type="dxa"/>
-              <w:left w:w="0" w:type="dxa"/>
-              <w:right w:w="0" w:type="dxa"/>
-            </w:tcMar>
-            <w:vAlign w:val="top"/>
-          </w:tcPr>
-          <w:p>
-            <w:pPr>
-              <w:pStyle w:val="Normal"/>
-              <w:jc w:val="left"/>
-              <w:pBdr>
-                <w:bottom w:val="none" w:sz="0" w:space="0" w:color="000000"/>
-                <w:top w:val="none" w:sz="0" w:space="0" w:color="000000"/>
-                <w:left w:val="none" w:sz="0" w:space="0" w:color="000000"/>
-                <w:right w:val="none" w:sz="0" w:space="0" w:color="000000"/>
-              </w:pBdr>
-              <w:spacing w:after="100" w:before="100" w:line="240"/>
-              <w:ind w:left="100" w:right="100" w:firstLine="0" w:firstLineChars="0"/>
-              <w:rPr>
-                <w:rFonts w:ascii="Arial" w:hAnsi="Arial" w:eastAsia="Arial" w:cs="Arial"/>
-                <w:i w:val="false"/>
-                <w:b w:val="false"/>
-                <w:u w:val="none"/>
-                <w:strike w:val="false"/>
-                <w:sz w:val="20"/>
-                <w:szCs w:val="20"/>
-                <w:color w:val="000000"/>
-              </w:rPr>
-            </w:pPr>
-            <w:r>
-              <w:rPr>
-                <w:rFonts w:ascii="Arial" w:hAnsi="Arial" w:eastAsia="Arial" w:cs="Arial"/>
-                <w:i w:val="false"/>
-                <w:b w:val="false"/>
-                <w:u w:val="none"/>
-                <w:strike w:val="false"/>
-                <w:sz w:val="20"/>
-                <w:szCs w:val="20"/>
-                <w:color w:val="000000"/>
-              </w:rPr>
-              <w:t xml:space="preserve">Indicator</w:t>
-            </w:r>
-          </w:p>
-        </w:tc>
-        <w:tc>
-          <w:tcPr>
-            <w:tcBorders>
-              <w:bottom w:val="single" w:sz="12" w:space="0" w:color="666666"/>
-              <w:top w:val="single" w:sz="12" w:space="0" w:color="666666"/>
-              <w:left w:val="none" w:sz="0" w:space="0" w:color="000000"/>
-              <w:right w:val="none" w:sz="0" w:space="0" w:color="000000"/>
-            </w:tcBorders>
-            <w:shd w:val="clear" w:color="auto" w:fill="FFFFFF"/>
-            <w:tcMar>
-              <w:top w:w="0" w:type="dxa"/>
-              <w:bottom w:w="0" w:type="dxa"/>
-              <w:left w:w="0" w:type="dxa"/>
-              <w:right w:w="0" w:type="dxa"/>
-            </w:tcMar>
-            <w:vAlign w:val="top"/>
-          </w:tcPr>
-          <w:p>
-            <w:pPr>
-              <w:pStyle w:val="Normal"/>
-              <w:jc w:val="left"/>
-              <w:pBdr>
-                <w:bottom w:val="none" w:sz="0" w:space="0" w:color="000000"/>
-                <w:top w:val="none" w:sz="0" w:space="0" w:color="000000"/>
-                <w:left w:val="none" w:sz="0" w:space="0" w:color="000000"/>
-                <w:right w:val="none" w:sz="0" w:space="0" w:color="000000"/>
-              </w:pBdr>
-              <w:spacing w:after="100" w:before="100" w:line="240"/>
-              <w:ind w:left="100" w:right="100" w:firstLine="0" w:firstLineChars="0"/>
-              <w:rPr>
-                <w:rFonts w:ascii="Arial" w:hAnsi="Arial" w:eastAsia="Arial" w:cs="Arial"/>
-                <w:i w:val="false"/>
-                <w:b w:val="false"/>
-                <w:u w:val="none"/>
-                <w:strike w:val="false"/>
-                <w:sz w:val="20"/>
-                <w:szCs w:val="20"/>
-                <w:color w:val="000000"/>
-              </w:rPr>
-            </w:pPr>
-            <w:r>
-              <w:rPr>
-                <w:rFonts w:ascii="Arial" w:hAnsi="Arial" w:eastAsia="Arial" w:cs="Arial"/>
-                <w:i w:val="false"/>
-                <w:b w:val="false"/>
-                <w:u w:val="none"/>
-                <w:strike w:val="false"/>
-                <w:sz w:val="20"/>
-                <w:szCs w:val="20"/>
-                <w:color w:val="000000"/>
-              </w:rPr>
-              <w:t xml:space="preserve">n (Studies)</w:t>
-            </w:r>
-          </w:p>
-        </w:tc>
-        <w:tc>
-          <w:tcPr>
-            <w:tcBorders>
-              <w:bottom w:val="single" w:sz="12" w:space="0" w:color="666666"/>
-              <w:top w:val="single" w:sz="12" w:space="0" w:color="666666"/>
-              <w:left w:val="none" w:sz="0" w:space="0" w:color="000000"/>
-              <w:right w:val="none" w:sz="0" w:space="0" w:color="000000"/>
-            </w:tcBorders>
-            <w:shd w:val="clear" w:color="auto" w:fill="FFFFFF"/>
-            <w:tcMar>
-              <w:top w:w="0" w:type="dxa"/>
-              <w:bottom w:w="0" w:type="dxa"/>
-              <w:left w:w="0" w:type="dxa"/>
-              <w:right w:w="0" w:type="dxa"/>
-            </w:tcMar>
-            <w:vAlign w:val="top"/>
-          </w:tcPr>
-          <w:p>
-            <w:pPr>
-              <w:pStyle w:val="Normal"/>
-              <w:jc w:val="left"/>
-              <w:pBdr>
-                <w:bottom w:val="none" w:sz="0" w:space="0" w:color="000000"/>
-                <w:top w:val="none" w:sz="0" w:space="0" w:color="000000"/>
-                <w:left w:val="none" w:sz="0" w:space="0" w:color="000000"/>
-                <w:right w:val="none" w:sz="0" w:space="0" w:color="000000"/>
-              </w:pBdr>
-              <w:spacing w:after="100" w:before="100" w:line="240"/>
-              <w:ind w:left="100" w:right="100" w:firstLine="0" w:firstLineChars="0"/>
-              <w:rPr>
-                <w:rFonts w:ascii="Arial" w:hAnsi="Arial" w:eastAsia="Arial" w:cs="Arial"/>
-                <w:i w:val="false"/>
-                <w:b w:val="false"/>
-                <w:u w:val="none"/>
-                <w:strike w:val="false"/>
-                <w:sz w:val="20"/>
-                <w:szCs w:val="20"/>
-                <w:color w:val="000000"/>
-              </w:rPr>
-            </w:pPr>
-            <w:r>
-              <w:rPr>
-                <w:rFonts w:ascii="Arial" w:hAnsi="Arial" w:eastAsia="Arial" w:cs="Arial"/>
-                <w:i w:val="false"/>
-                <w:b w:val="false"/>
-                <w:u w:val="none"/>
-                <w:strike w:val="false"/>
-                <w:sz w:val="20"/>
-                <w:szCs w:val="20"/>
-                <w:color w:val="000000"/>
-              </w:rPr>
-              <w:t xml:space="preserve">Proportion (n/N)</w:t>
-            </w:r>
-          </w:p>
-        </w:tc>
-        <w:tc>
-          <w:tcPr>
-            <w:tcBorders>
-              <w:bottom w:val="single" w:sz="12" w:space="0" w:color="666666"/>
-              <w:top w:val="single" w:sz="12" w:space="0" w:color="666666"/>
-              <w:left w:val="none" w:sz="0" w:space="0" w:color="000000"/>
-              <w:right w:val="none" w:sz="0" w:space="0" w:color="000000"/>
-            </w:tcBorders>
-            <w:shd w:val="clear" w:color="auto" w:fill="FFFFFF"/>
-            <w:tcMar>
-              <w:top w:w="0" w:type="dxa"/>
-              <w:bottom w:w="0" w:type="dxa"/>
-              <w:left w:w="0" w:type="dxa"/>
-              <w:right w:w="0" w:type="dxa"/>
-            </w:tcMar>
-            <w:vAlign w:val="top"/>
-          </w:tcPr>
-          <w:p>
-            <w:pPr>
-              <w:pStyle w:val="Normal"/>
-              <w:jc w:val="left"/>
-              <w:pBdr>
-                <w:bottom w:val="none" w:sz="0" w:space="0" w:color="000000"/>
-                <w:top w:val="none" w:sz="0" w:space="0" w:color="000000"/>
-                <w:left w:val="none" w:sz="0" w:space="0" w:color="000000"/>
-                <w:right w:val="none" w:sz="0" w:space="0" w:color="000000"/>
-              </w:pBdr>
-              <w:spacing w:after="100" w:before="100" w:line="240"/>
-              <w:ind w:left="100" w:right="100" w:firstLine="0" w:firstLineChars="0"/>
-              <w:rPr>
-                <w:rFonts w:ascii="Arial" w:hAnsi="Arial" w:eastAsia="Arial" w:cs="Arial"/>
-                <w:i w:val="false"/>
-                <w:b w:val="false"/>
-                <w:u w:val="none"/>
-                <w:strike w:val="false"/>
-                <w:sz w:val="20"/>
-                <w:szCs w:val="20"/>
-                <w:color w:val="000000"/>
-              </w:rPr>
-            </w:pPr>
-            <w:r>
-              <w:rPr>
-                <w:rFonts w:ascii="Arial" w:hAnsi="Arial" w:eastAsia="Arial" w:cs="Arial"/>
-                <w:i w:val="false"/>
-                <w:b w:val="false"/>
-                <w:u w:val="none"/>
-                <w:strike w:val="false"/>
-                <w:sz w:val="20"/>
-                <w:szCs w:val="20"/>
-                <w:color w:val="000000"/>
-              </w:rPr>
-              <w:t xml:space="preserve">Percent</w:t>
-            </w:r>
-          </w:p>
-        </w:tc>
-      </w:tr>
-      <w:tr>
-        <w:trPr>
-          <w:trHeight w:val="614" w:hRule="auto"/>
-        </w:trPr>
-        <w:tc>
-          <w:tcPr>
-            <w:tcBorders>
-              <w:bottom w:val="none" w:sz="0" w:space="0" w:color="000000"/>
-              <w:top w:val="single" w:sz="12" w:space="0" w:color="666666"/>
-              <w:left w:val="none" w:sz="0" w:space="0" w:color="000000"/>
-              <w:right w:val="none" w:sz="0" w:space="0" w:color="000000"/>
-            </w:tcBorders>
-            <w:shd w:val="clear" w:color="auto" w:fill="FFFFFF"/>
-            <w:tcMar>
-              <w:top w:w="0" w:type="dxa"/>
-              <w:bottom w:w="0" w:type="dxa"/>
-              <w:left w:w="0" w:type="dxa"/>
-              <w:right w:w="0" w:type="dxa"/>
-            </w:tcMar>
-            <w:vAlign w:val="top"/>
-          </w:tcPr>
-          <w:p>
-            <w:pPr>
-              <w:pStyle w:val="Normal"/>
-              <w:jc w:val="left"/>
-              <w:pBdr>
-                <w:bottom w:val="none" w:sz="0" w:space="0" w:color="000000"/>
-                <w:top w:val="none" w:sz="0" w:space="0" w:color="000000"/>
-                <w:left w:val="none" w:sz="0" w:space="0" w:color="000000"/>
-                <w:right w:val="none" w:sz="0" w:space="0" w:color="000000"/>
-              </w:pBdr>
-              <w:spacing w:after="100" w:before="100" w:line="240"/>
-              <w:ind w:left="100" w:right="100" w:firstLine="0" w:firstLineChars="0"/>
-              <w:rPr>
-                <w:rFonts w:ascii="Arial" w:hAnsi="Arial" w:eastAsia="Arial" w:cs="Arial"/>
-                <w:i w:val="false"/>
-                <w:b w:val="false"/>
-                <w:u w:val="none"/>
-                <w:strike w:val="false"/>
-                <w:sz w:val="20"/>
-                <w:szCs w:val="20"/>
-                <w:color w:val="000000"/>
-              </w:rPr>
-            </w:pPr>
-            <w:r>
-              <w:rPr>
-                <w:rFonts w:ascii="Arial" w:hAnsi="Arial" w:eastAsia="Arial" w:cs="Arial"/>
-                <w:i w:val="false"/>
-                <w:b w:val="false"/>
-                <w:u w:val="none"/>
-                <w:strike w:val="false"/>
-                <w:sz w:val="20"/>
-                <w:szCs w:val="20"/>
-                <w:color w:val="000000"/>
-              </w:rPr>
-              <w:t xml:space="preserve">Independent coding scheme mentioned</w:t>
-            </w:r>
-          </w:p>
-        </w:tc>
-        <w:tc>
-          <w:tcPr>
-            <w:tcBorders>
-              <w:bottom w:val="none" w:sz="0" w:space="0" w:color="000000"/>
-              <w:top w:val="single" w:sz="12" w:space="0" w:color="666666"/>
-              <w:left w:val="none" w:sz="0" w:space="0" w:color="000000"/>
-              <w:right w:val="none" w:sz="0" w:space="0" w:color="000000"/>
-            </w:tcBorders>
-            <w:shd w:val="clear" w:color="auto" w:fill="FFFFFF"/>
-            <w:tcMar>
-              <w:top w:w="0" w:type="dxa"/>
-              <w:bottom w:w="0" w:type="dxa"/>
-              <w:left w:w="0" w:type="dxa"/>
-              <w:right w:w="0" w:type="dxa"/>
-            </w:tcMar>
-            <w:vAlign w:val="top"/>
-          </w:tcPr>
-          <w:p>
-            <w:pPr>
-              <w:pStyle w:val="Normal"/>
-              <w:jc w:val="left"/>
-              <w:pBdr>
-                <w:bottom w:val="none" w:sz="0" w:space="0" w:color="000000"/>
-                <w:top w:val="none" w:sz="0" w:space="0" w:color="000000"/>
-                <w:left w:val="none" w:sz="0" w:space="0" w:color="000000"/>
-                <w:right w:val="none" w:sz="0" w:space="0" w:color="000000"/>
-              </w:pBdr>
-              <w:spacing w:after="100" w:before="100" w:line="240"/>
-              <w:ind w:left="100" w:right="100" w:firstLine="0" w:firstLineChars="0"/>
-              <w:rPr>
-                <w:rFonts w:ascii="Arial" w:hAnsi="Arial" w:eastAsia="Arial" w:cs="Arial"/>
-                <w:i w:val="false"/>
-                <w:b w:val="false"/>
-                <w:u w:val="none"/>
-                <w:strike w:val="false"/>
-                <w:sz w:val="20"/>
-                <w:szCs w:val="20"/>
-                <w:color w:val="000000"/>
-              </w:rPr>
-            </w:pPr>
-            <w:r>
-              <w:rPr>
-                <w:rFonts w:ascii="Arial" w:hAnsi="Arial" w:eastAsia="Arial" w:cs="Arial"/>
-                <w:i w:val="false"/>
-                <w:b w:val="false"/>
-                <w:u w:val="none"/>
-                <w:strike w:val="false"/>
-                <w:sz w:val="20"/>
-                <w:szCs w:val="20"/>
-                <w:color w:val="000000"/>
-              </w:rPr>
-              <w:t xml:space="preserve">14</w:t>
-            </w:r>
-          </w:p>
-        </w:tc>
-        <w:tc>
-          <w:tcPr>
-            <w:tcBorders>
-              <w:bottom w:val="none" w:sz="0" w:space="0" w:color="000000"/>
-              <w:top w:val="single" w:sz="12" w:space="0" w:color="666666"/>
-              <w:left w:val="none" w:sz="0" w:space="0" w:color="000000"/>
-              <w:right w:val="none" w:sz="0" w:space="0" w:color="000000"/>
-            </w:tcBorders>
-            <w:shd w:val="clear" w:color="auto" w:fill="FFFFFF"/>
-            <w:tcMar>
-              <w:top w:w="0" w:type="dxa"/>
-              <w:bottom w:w="0" w:type="dxa"/>
-              <w:left w:w="0" w:type="dxa"/>
-              <w:right w:w="0" w:type="dxa"/>
-            </w:tcMar>
-            <w:vAlign w:val="top"/>
-          </w:tcPr>
-          <w:p>
-            <w:pPr>
-              <w:pStyle w:val="Normal"/>
-              <w:jc w:val="left"/>
-              <w:pBdr>
-                <w:bottom w:val="none" w:sz="0" w:space="0" w:color="000000"/>
-                <w:top w:val="none" w:sz="0" w:space="0" w:color="000000"/>
-                <w:left w:val="none" w:sz="0" w:space="0" w:color="000000"/>
-                <w:right w:val="none" w:sz="0" w:space="0" w:color="000000"/>
-              </w:pBdr>
-              <w:spacing w:after="100" w:before="100" w:line="240"/>
-              <w:ind w:left="100" w:right="100" w:firstLine="0" w:firstLineChars="0"/>
-              <w:rPr>
-                <w:rFonts w:ascii="Arial" w:hAnsi="Arial" w:eastAsia="Arial" w:cs="Arial"/>
-                <w:i w:val="false"/>
-                <w:b w:val="false"/>
-                <w:u w:val="none"/>
-                <w:strike w:val="false"/>
-                <w:sz w:val="20"/>
-                <w:szCs w:val="20"/>
-                <w:color w:val="000000"/>
-              </w:rPr>
-            </w:pPr>
-            <w:r>
-              <w:rPr>
-                <w:rFonts w:ascii="Arial" w:hAnsi="Arial" w:eastAsia="Arial" w:cs="Arial"/>
-                <w:i w:val="false"/>
-                <w:b w:val="false"/>
-                <w:u w:val="none"/>
-                <w:strike w:val="false"/>
-                <w:sz w:val="20"/>
-                <w:szCs w:val="20"/>
-                <w:color w:val="000000"/>
-              </w:rPr>
-              <w:t xml:space="preserve">14/37</w:t>
-            </w:r>
-          </w:p>
-        </w:tc>
-        <w:tc>
-          <w:tcPr>
-            <w:tcBorders>
-              <w:bottom w:val="none" w:sz="0" w:space="0" w:color="000000"/>
-              <w:top w:val="single" w:sz="12" w:space="0" w:color="666666"/>
-              <w:left w:val="none" w:sz="0" w:space="0" w:color="000000"/>
-              <w:right w:val="none" w:sz="0" w:space="0" w:color="000000"/>
-            </w:tcBorders>
-            <w:shd w:val="clear" w:color="auto" w:fill="FFFFFF"/>
-            <w:tcMar>
-              <w:top w:w="0" w:type="dxa"/>
-              <w:bottom w:w="0" w:type="dxa"/>
-              <w:left w:w="0" w:type="dxa"/>
-              <w:right w:w="0" w:type="dxa"/>
-            </w:tcMar>
-            <w:vAlign w:val="top"/>
-          </w:tcPr>
-          <w:p>
-            <w:pPr>
-              <w:pStyle w:val="Normal"/>
-              <w:jc w:val="left"/>
-              <w:pBdr>
-                <w:bottom w:val="none" w:sz="0" w:space="0" w:color="000000"/>
-                <w:top w:val="none" w:sz="0" w:space="0" w:color="000000"/>
-                <w:left w:val="none" w:sz="0" w:space="0" w:color="000000"/>
-                <w:right w:val="none" w:sz="0" w:space="0" w:color="000000"/>
-              </w:pBdr>
-              <w:spacing w:after="100" w:before="100" w:line="240"/>
-              <w:ind w:left="100" w:right="100" w:firstLine="0" w:firstLineChars="0"/>
-              <w:rPr>
-                <w:rFonts w:ascii="Arial" w:hAnsi="Arial" w:eastAsia="Arial" w:cs="Arial"/>
-                <w:i w:val="false"/>
-                <w:b w:val="false"/>
-                <w:u w:val="none"/>
-                <w:strike w:val="false"/>
-                <w:sz w:val="20"/>
-                <w:szCs w:val="20"/>
-                <w:color w:val="000000"/>
-              </w:rPr>
-            </w:pPr>
-            <w:r>
-              <w:rPr>
-                <w:rFonts w:ascii="Arial" w:hAnsi="Arial" w:eastAsia="Arial" w:cs="Arial"/>
-                <w:i w:val="false"/>
-                <w:b w:val="false"/>
-                <w:u w:val="none"/>
-                <w:strike w:val="false"/>
-                <w:sz w:val="20"/>
-                <w:szCs w:val="20"/>
-                <w:color w:val="000000"/>
-              </w:rPr>
-              <w:t xml:space="preserve">37.8%</w:t>
-            </w:r>
-          </w:p>
-        </w:tc>
-      </w:tr>
-      <w:tr>
-        <w:trPr>
-          <w:trHeight w:val="614" w:hRule="auto"/>
-        </w:trPr>
-        <w:tc>
-          <w:tcPr>
-            <w:tcBorders>
-              <w:bottom w:val="none" w:sz="0" w:space="0" w:color="000000"/>
-              <w:top w:val="none" w:sz="0" w:space="0" w:color="000000"/>
-              <w:left w:val="none" w:sz="0" w:space="0" w:color="000000"/>
-              <w:right w:val="none" w:sz="0" w:space="0" w:color="000000"/>
-            </w:tcBorders>
-            <w:shd w:val="clear" w:color="auto" w:fill="FFFFFF"/>
-            <w:tcMar>
-              <w:top w:w="0" w:type="dxa"/>
-              <w:bottom w:w="0" w:type="dxa"/>
-              <w:left w:w="0" w:type="dxa"/>
-              <w:right w:w="0" w:type="dxa"/>
-            </w:tcMar>
-            <w:vAlign w:val="top"/>
-          </w:tcPr>
-          <w:p>
-            <w:pPr>
-              <w:pStyle w:val="Normal"/>
-              <w:jc w:val="left"/>
-              <w:pBdr>
-                <w:bottom w:val="none" w:sz="0" w:space="0" w:color="000000"/>
-                <w:top w:val="none" w:sz="0" w:space="0" w:color="000000"/>
-                <w:left w:val="none" w:sz="0" w:space="0" w:color="000000"/>
-                <w:right w:val="none" w:sz="0" w:space="0" w:color="000000"/>
-              </w:pBdr>
-              <w:spacing w:after="100" w:before="100" w:line="240"/>
-              <w:ind w:left="100" w:right="100" w:firstLine="0" w:firstLineChars="0"/>
-              <w:rPr>
-                <w:rFonts w:ascii="Arial" w:hAnsi="Arial" w:eastAsia="Arial" w:cs="Arial"/>
-                <w:i w:val="false"/>
-                <w:b w:val="false"/>
-                <w:u w:val="none"/>
-                <w:strike w:val="false"/>
-                <w:sz w:val="20"/>
-                <w:szCs w:val="20"/>
-                <w:color w:val="000000"/>
-              </w:rPr>
-            </w:pPr>
-            <w:r>
-              <w:rPr>
-                <w:rFonts w:ascii="Arial" w:hAnsi="Arial" w:eastAsia="Arial" w:cs="Arial"/>
-                <w:i w:val="false"/>
-                <w:b w:val="false"/>
-                <w:u w:val="none"/>
-                <w:strike w:val="false"/>
-                <w:sz w:val="20"/>
-                <w:szCs w:val="20"/>
-                <w:color w:val="000000"/>
-              </w:rPr>
-              <w:t xml:space="preserve">Interrater reliability reported</w:t>
-            </w:r>
-          </w:p>
-        </w:tc>
-        <w:tc>
-          <w:tcPr>
-            <w:tcBorders>
-              <w:bottom w:val="none" w:sz="0" w:space="0" w:color="000000"/>
-              <w:top w:val="none" w:sz="0" w:space="0" w:color="000000"/>
-              <w:left w:val="none" w:sz="0" w:space="0" w:color="000000"/>
-              <w:right w:val="none" w:sz="0" w:space="0" w:color="000000"/>
-            </w:tcBorders>
-            <w:shd w:val="clear" w:color="auto" w:fill="FFFFFF"/>
-            <w:tcMar>
-              <w:top w:w="0" w:type="dxa"/>
-              <w:bottom w:w="0" w:type="dxa"/>
-              <w:left w:w="0" w:type="dxa"/>
-              <w:right w:w="0" w:type="dxa"/>
-            </w:tcMar>
-            <w:vAlign w:val="top"/>
-          </w:tcPr>
-          <w:p>
-            <w:pPr>
-              <w:pStyle w:val="Normal"/>
-              <w:jc w:val="left"/>
-              <w:pBdr>
-                <w:bottom w:val="none" w:sz="0" w:space="0" w:color="000000"/>
-                <w:top w:val="none" w:sz="0" w:space="0" w:color="000000"/>
-                <w:left w:val="none" w:sz="0" w:space="0" w:color="000000"/>
-                <w:right w:val="none" w:sz="0" w:space="0" w:color="000000"/>
-              </w:pBdr>
-              <w:spacing w:after="100" w:before="100" w:line="240"/>
-              <w:ind w:left="100" w:right="100" w:firstLine="0" w:firstLineChars="0"/>
-              <w:rPr>
-                <w:rFonts w:ascii="Arial" w:hAnsi="Arial" w:eastAsia="Arial" w:cs="Arial"/>
-                <w:i w:val="false"/>
-                <w:b w:val="false"/>
-                <w:u w:val="none"/>
-                <w:strike w:val="false"/>
-                <w:sz w:val="20"/>
-                <w:szCs w:val="20"/>
-                <w:color w:val="000000"/>
-              </w:rPr>
-            </w:pPr>
-            <w:r>
-              <w:rPr>
-                <w:rFonts w:ascii="Arial" w:hAnsi="Arial" w:eastAsia="Arial" w:cs="Arial"/>
-                <w:i w:val="false"/>
-                <w:b w:val="false"/>
-                <w:u w:val="none"/>
-                <w:strike w:val="false"/>
-                <w:sz w:val="20"/>
-                <w:szCs w:val="20"/>
-                <w:color w:val="000000"/>
-              </w:rPr>
-              <w:t xml:space="preserve">10</w:t>
-            </w:r>
-          </w:p>
-        </w:tc>
-        <w:tc>
-          <w:tcPr>
-            <w:tcBorders>
-              <w:bottom w:val="none" w:sz="0" w:space="0" w:color="000000"/>
-              <w:top w:val="none" w:sz="0" w:space="0" w:color="000000"/>
-              <w:left w:val="none" w:sz="0" w:space="0" w:color="000000"/>
-              <w:right w:val="none" w:sz="0" w:space="0" w:color="000000"/>
-            </w:tcBorders>
-            <w:shd w:val="clear" w:color="auto" w:fill="FFFFFF"/>
-            <w:tcMar>
-              <w:top w:w="0" w:type="dxa"/>
-              <w:bottom w:w="0" w:type="dxa"/>
-              <w:left w:w="0" w:type="dxa"/>
-              <w:right w:w="0" w:type="dxa"/>
-            </w:tcMar>
-            <w:vAlign w:val="top"/>
-          </w:tcPr>
-          <w:p>
-            <w:pPr>
-              <w:pStyle w:val="Normal"/>
-              <w:jc w:val="left"/>
-              <w:pBdr>
-                <w:bottom w:val="none" w:sz="0" w:space="0" w:color="000000"/>
-                <w:top w:val="none" w:sz="0" w:space="0" w:color="000000"/>
-                <w:left w:val="none" w:sz="0" w:space="0" w:color="000000"/>
-                <w:right w:val="none" w:sz="0" w:space="0" w:color="000000"/>
-              </w:pBdr>
-              <w:spacing w:after="100" w:before="100" w:line="240"/>
-              <w:ind w:left="100" w:right="100" w:firstLine="0" w:firstLineChars="0"/>
-              <w:rPr>
-                <w:rFonts w:ascii="Arial" w:hAnsi="Arial" w:eastAsia="Arial" w:cs="Arial"/>
-                <w:i w:val="false"/>
-                <w:b w:val="false"/>
-                <w:u w:val="none"/>
-                <w:strike w:val="false"/>
-                <w:sz w:val="20"/>
-                <w:szCs w:val="20"/>
-                <w:color w:val="000000"/>
-              </w:rPr>
-            </w:pPr>
-            <w:r>
-              <w:rPr>
-                <w:rFonts w:ascii="Arial" w:hAnsi="Arial" w:eastAsia="Arial" w:cs="Arial"/>
-                <w:i w:val="false"/>
-                <w:b w:val="false"/>
-                <w:u w:val="none"/>
-                <w:strike w:val="false"/>
-                <w:sz w:val="20"/>
-                <w:szCs w:val="20"/>
-                <w:color w:val="000000"/>
-              </w:rPr>
-              <w:t xml:space="preserve">10/37</w:t>
-            </w:r>
-          </w:p>
-        </w:tc>
-        <w:tc>
-          <w:tcPr>
-            <w:tcBorders>
-              <w:bottom w:val="none" w:sz="0" w:space="0" w:color="000000"/>
-              <w:top w:val="none" w:sz="0" w:space="0" w:color="000000"/>
-              <w:left w:val="none" w:sz="0" w:space="0" w:color="000000"/>
-              <w:right w:val="none" w:sz="0" w:space="0" w:color="000000"/>
-            </w:tcBorders>
-            <w:shd w:val="clear" w:color="auto" w:fill="FFFFFF"/>
-            <w:tcMar>
-              <w:top w:w="0" w:type="dxa"/>
-              <w:bottom w:w="0" w:type="dxa"/>
-              <w:left w:w="0" w:type="dxa"/>
-              <w:right w:w="0" w:type="dxa"/>
-            </w:tcMar>
-            <w:vAlign w:val="top"/>
-          </w:tcPr>
-          <w:p>
-            <w:pPr>
-              <w:pStyle w:val="Normal"/>
-              <w:jc w:val="left"/>
-              <w:pBdr>
-                <w:bottom w:val="none" w:sz="0" w:space="0" w:color="000000"/>
-                <w:top w:val="none" w:sz="0" w:space="0" w:color="000000"/>
-                <w:left w:val="none" w:sz="0" w:space="0" w:color="000000"/>
-                <w:right w:val="none" w:sz="0" w:space="0" w:color="000000"/>
-              </w:pBdr>
-              <w:spacing w:after="100" w:before="100" w:line="240"/>
-              <w:ind w:left="100" w:right="100" w:firstLine="0" w:firstLineChars="0"/>
-              <w:rPr>
-                <w:rFonts w:ascii="Arial" w:hAnsi="Arial" w:eastAsia="Arial" w:cs="Arial"/>
-                <w:i w:val="false"/>
-                <w:b w:val="false"/>
-                <w:u w:val="none"/>
-                <w:strike w:val="false"/>
-                <w:sz w:val="20"/>
-                <w:szCs w:val="20"/>
-                <w:color w:val="000000"/>
-              </w:rPr>
-            </w:pPr>
-            <w:r>
-              <w:rPr>
-                <w:rFonts w:ascii="Arial" w:hAnsi="Arial" w:eastAsia="Arial" w:cs="Arial"/>
-                <w:i w:val="false"/>
-                <w:b w:val="false"/>
-                <w:u w:val="none"/>
-                <w:strike w:val="false"/>
-                <w:sz w:val="20"/>
-                <w:szCs w:val="20"/>
-                <w:color w:val="000000"/>
-              </w:rPr>
-              <w:t xml:space="preserve">27%</w:t>
-            </w:r>
-          </w:p>
-        </w:tc>
-      </w:tr>
-      <w:tr>
-        <w:trPr>
-          <w:trHeight w:val="614" w:hRule="auto"/>
-        </w:trPr>
-        <w:tc>
-          <w:tcPr>
-            <w:tcBorders>
-              <w:bottom w:val="single" w:sz="12" w:space="0" w:color="666666"/>
-              <w:top w:val="none" w:sz="0" w:space="0" w:color="000000"/>
-              <w:left w:val="none" w:sz="0" w:space="0" w:color="000000"/>
-              <w:right w:val="none" w:sz="0" w:space="0" w:color="000000"/>
-            </w:tcBorders>
-            <w:shd w:val="clear" w:color="auto" w:fill="FFFFFF"/>
-            <w:tcMar>
-              <w:top w:w="0" w:type="dxa"/>
-              <w:bottom w:w="0" w:type="dxa"/>
-              <w:left w:w="0" w:type="dxa"/>
-              <w:right w:w="0" w:type="dxa"/>
-            </w:tcMar>
-            <w:vAlign w:val="top"/>
-          </w:tcPr>
-          <w:p>
-            <w:pPr>
-              <w:pStyle w:val="Normal"/>
-              <w:jc w:val="left"/>
-              <w:pBdr>
-                <w:bottom w:val="none" w:sz="0" w:space="0" w:color="000000"/>
-                <w:top w:val="none" w:sz="0" w:space="0" w:color="000000"/>
-                <w:left w:val="none" w:sz="0" w:space="0" w:color="000000"/>
-                <w:right w:val="none" w:sz="0" w:space="0" w:color="000000"/>
-              </w:pBdr>
-              <w:spacing w:after="100" w:before="100" w:line="240"/>
-              <w:ind w:left="100" w:right="100" w:firstLine="0" w:firstLineChars="0"/>
-              <w:rPr>
-                <w:rFonts w:ascii="Arial" w:hAnsi="Arial" w:eastAsia="Arial" w:cs="Arial"/>
-                <w:i w:val="false"/>
-                <w:b w:val="false"/>
-                <w:u w:val="none"/>
-                <w:strike w:val="false"/>
-                <w:sz w:val="20"/>
-                <w:szCs w:val="20"/>
-                <w:color w:val="000000"/>
-              </w:rPr>
-            </w:pPr>
-            <w:r>
-              <w:rPr>
-                <w:rFonts w:ascii="Arial" w:hAnsi="Arial" w:eastAsia="Arial" w:cs="Arial"/>
-                <w:i w:val="false"/>
-                <w:b w:val="false"/>
-                <w:u w:val="none"/>
-                <w:strike w:val="false"/>
-                <w:sz w:val="20"/>
-                <w:szCs w:val="20"/>
-                <w:color w:val="000000"/>
-              </w:rPr>
-              <w:t xml:space="preserve">Disagreement resolved mentioned</w:t>
-            </w:r>
-          </w:p>
-        </w:tc>
-        <w:tc>
-          <w:tcPr>
-            <w:tcBorders>
-              <w:bottom w:val="single" w:sz="12" w:space="0" w:color="666666"/>
-              <w:top w:val="none" w:sz="0" w:space="0" w:color="000000"/>
-              <w:left w:val="none" w:sz="0" w:space="0" w:color="000000"/>
-              <w:right w:val="none" w:sz="0" w:space="0" w:color="000000"/>
-            </w:tcBorders>
-            <w:shd w:val="clear" w:color="auto" w:fill="FFFFFF"/>
-            <w:tcMar>
-              <w:top w:w="0" w:type="dxa"/>
-              <w:bottom w:w="0" w:type="dxa"/>
-              <w:left w:w="0" w:type="dxa"/>
-              <w:right w:w="0" w:type="dxa"/>
-            </w:tcMar>
-            <w:vAlign w:val="top"/>
-          </w:tcPr>
-          <w:p>
-            <w:pPr>
-              <w:pStyle w:val="Normal"/>
-              <w:jc w:val="left"/>
-              <w:pBdr>
-                <w:bottom w:val="none" w:sz="0" w:space="0" w:color="000000"/>
-                <w:top w:val="none" w:sz="0" w:space="0" w:color="000000"/>
-                <w:left w:val="none" w:sz="0" w:space="0" w:color="000000"/>
-                <w:right w:val="none" w:sz="0" w:space="0" w:color="000000"/>
-              </w:pBdr>
-              <w:spacing w:after="100" w:before="100" w:line="240"/>
-              <w:ind w:left="100" w:right="100" w:firstLine="0" w:firstLineChars="0"/>
-              <w:rPr>
-                <w:rFonts w:ascii="Arial" w:hAnsi="Arial" w:eastAsia="Arial" w:cs="Arial"/>
-                <w:i w:val="false"/>
-                <w:b w:val="false"/>
-                <w:u w:val="none"/>
-                <w:strike w:val="false"/>
-                <w:sz w:val="20"/>
-                <w:szCs w:val="20"/>
-                <w:color w:val="000000"/>
-              </w:rPr>
-            </w:pPr>
-            <w:r>
-              <w:rPr>
-                <w:rFonts w:ascii="Arial" w:hAnsi="Arial" w:eastAsia="Arial" w:cs="Arial"/>
-                <w:i w:val="false"/>
-                <w:b w:val="false"/>
-                <w:u w:val="none"/>
-                <w:strike w:val="false"/>
-                <w:sz w:val="20"/>
-                <w:szCs w:val="20"/>
-                <w:color w:val="000000"/>
-              </w:rPr>
-              <w:t xml:space="preserve">23</w:t>
-            </w:r>
-          </w:p>
-        </w:tc>
-        <w:tc>
-          <w:tcPr>
-            <w:tcBorders>
-              <w:bottom w:val="single" w:sz="12" w:space="0" w:color="666666"/>
-              <w:top w:val="none" w:sz="0" w:space="0" w:color="000000"/>
-              <w:left w:val="none" w:sz="0" w:space="0" w:color="000000"/>
-              <w:right w:val="none" w:sz="0" w:space="0" w:color="000000"/>
-            </w:tcBorders>
-            <w:shd w:val="clear" w:color="auto" w:fill="FFFFFF"/>
-            <w:tcMar>
-              <w:top w:w="0" w:type="dxa"/>
-              <w:bottom w:w="0" w:type="dxa"/>
-              <w:left w:w="0" w:type="dxa"/>
-              <w:right w:w="0" w:type="dxa"/>
-            </w:tcMar>
-            <w:vAlign w:val="top"/>
-          </w:tcPr>
-          <w:p>
-            <w:pPr>
-              <w:pStyle w:val="Normal"/>
-              <w:jc w:val="left"/>
-              <w:pBdr>
-                <w:bottom w:val="none" w:sz="0" w:space="0" w:color="000000"/>
-                <w:top w:val="none" w:sz="0" w:space="0" w:color="000000"/>
-                <w:left w:val="none" w:sz="0" w:space="0" w:color="000000"/>
-                <w:right w:val="none" w:sz="0" w:space="0" w:color="000000"/>
-              </w:pBdr>
-              <w:spacing w:after="100" w:before="100" w:line="240"/>
-              <w:ind w:left="100" w:right="100" w:firstLine="0" w:firstLineChars="0"/>
-              <w:rPr>
-                <w:rFonts w:ascii="Arial" w:hAnsi="Arial" w:eastAsia="Arial" w:cs="Arial"/>
-                <w:i w:val="false"/>
-                <w:b w:val="false"/>
-                <w:u w:val="none"/>
-                <w:strike w:val="false"/>
-                <w:sz w:val="20"/>
-                <w:szCs w:val="20"/>
-                <w:color w:val="000000"/>
-              </w:rPr>
-            </w:pPr>
-            <w:r>
-              <w:rPr>
-                <w:rFonts w:ascii="Arial" w:hAnsi="Arial" w:eastAsia="Arial" w:cs="Arial"/>
-                <w:i w:val="false"/>
-                <w:b w:val="false"/>
-                <w:u w:val="none"/>
-                <w:strike w:val="false"/>
-                <w:sz w:val="20"/>
-                <w:szCs w:val="20"/>
-                <w:color w:val="000000"/>
-              </w:rPr>
-              <w:t xml:space="preserve">23/37</w:t>
-            </w:r>
-          </w:p>
-        </w:tc>
-        <w:tc>
-          <w:tcPr>
-            <w:tcBorders>
-              <w:bottom w:val="single" w:sz="12" w:space="0" w:color="666666"/>
-              <w:top w:val="none" w:sz="0" w:space="0" w:color="000000"/>
-              <w:left w:val="none" w:sz="0" w:space="0" w:color="000000"/>
-              <w:right w:val="none" w:sz="0" w:space="0" w:color="000000"/>
-            </w:tcBorders>
-            <w:shd w:val="clear" w:color="auto" w:fill="FFFFFF"/>
-            <w:tcMar>
-              <w:top w:w="0" w:type="dxa"/>
-              <w:bottom w:w="0" w:type="dxa"/>
-              <w:left w:w="0" w:type="dxa"/>
-              <w:right w:w="0" w:type="dxa"/>
-            </w:tcMar>
-            <w:vAlign w:val="top"/>
-          </w:tcPr>
-          <w:p>
-            <w:pPr>
-              <w:pStyle w:val="Normal"/>
-              <w:jc w:val="left"/>
-              <w:pBdr>
-                <w:bottom w:val="none" w:sz="0" w:space="0" w:color="000000"/>
-                <w:top w:val="none" w:sz="0" w:space="0" w:color="000000"/>
-                <w:left w:val="none" w:sz="0" w:space="0" w:color="000000"/>
-                <w:right w:val="none" w:sz="0" w:space="0" w:color="000000"/>
-              </w:pBdr>
-              <w:spacing w:after="100" w:before="100" w:line="240"/>
-              <w:ind w:left="100" w:right="100" w:firstLine="0" w:firstLineChars="0"/>
-              <w:rPr>
-                <w:rFonts w:ascii="Arial" w:hAnsi="Arial" w:eastAsia="Arial" w:cs="Arial"/>
-                <w:i w:val="false"/>
-                <w:b w:val="false"/>
-                <w:u w:val="none"/>
-                <w:strike w:val="false"/>
-                <w:sz w:val="20"/>
-                <w:szCs w:val="20"/>
-                <w:color w:val="000000"/>
-              </w:rPr>
-            </w:pPr>
-            <w:r>
-              <w:rPr>
-                <w:rFonts w:ascii="Arial" w:hAnsi="Arial" w:eastAsia="Arial" w:cs="Arial"/>
-                <w:i w:val="false"/>
-                <w:b w:val="false"/>
-                <w:u w:val="none"/>
-                <w:strike w:val="false"/>
-                <w:sz w:val="20"/>
-                <w:szCs w:val="20"/>
-                <w:color w:val="000000"/>
-              </w:rPr>
-              <w:t xml:space="preserve">62.2%</w:t>
-            </w:r>
-          </w:p>
-        </w:tc>
-      </w:tr>
-    </w:tbl>
-    <w:p>
-      <w:pPr>
-        <w:pStyle w:val="TableCaption"/>
-        <w:jc w:val="center"/>
-        <w:keepNext/>
-        <w:pBdr>
-          <w:bottom w:val="none" w:sz="0" w:space="0" w:color="000000"/>
-          <w:top w:val="none" w:sz="0" w:space="0" w:color="000000"/>
-          <w:left w:val="none" w:sz="0" w:space="0" w:color="000000"/>
-          <w:right w:val="none" w:sz="0" w:space="0" w:color="000000"/>
-        </w:pBdr>
-        <w:spacing w:after="60" w:before="60" w:line="240"/>
-        <w:ind w:left="60" w:right="60" w:firstLine="0" w:firstLineChars="0"/>
-      </w:pPr>
-      <w:r>
         <w:t xml:space="preserve">Coding team expansion</w:t>
       </w:r>
     </w:p>
@@ -25894,6 +24962,2336 @@
                 <w:color w:val="000000"/>
               </w:rPr>
               <w:t xml:space="preserve">3.4%</w:t>
+            </w:r>
+          </w:p>
+        </w:tc>
+      </w:tr>
+    </w:tbl>
+    <w:p>
+      <w:pPr>
+        <w:pStyle w:val="Normal"/>
+      </w:pPr>
+      <w:r>
+        <w:t xml:space="preserve"/>
+      </w:r>
+    </w:p>
+    <w:p>
+      <w:pPr>
+        <w:pStyle w:val="TableCaption"/>
+        <w:jc w:val="center"/>
+        <w:keepNext/>
+        <w:pBdr>
+          <w:bottom w:val="none" w:sz="0" w:space="0" w:color="000000"/>
+          <w:top w:val="none" w:sz="0" w:space="0" w:color="000000"/>
+          <w:left w:val="none" w:sz="0" w:space="0" w:color="000000"/>
+          <w:right w:val="none" w:sz="0" w:space="0" w:color="000000"/>
+        </w:pBdr>
+        <w:spacing w:after="60" w:before="60" w:line="240"/>
+        <w:ind w:left="60" w:right="60" w:firstLine="0" w:firstLineChars="0"/>
+      </w:pPr>
+      <w:r>
+        <w:t xml:space="preserve">Overlap reporting and scale length correlation</w:t>
+      </w:r>
+    </w:p>
+    <w:tbl xmlns:a="http://schemas.openxmlformats.org/drawingml/2006/main" xmlns:pic="http://schemas.openxmlformats.org/drawingml/2006/picture">
+      <w:tblPr>
+        <w:tblLayout w:type="fixed"/>
+        <w:jc w:val="center"/>
+        <w:tblLook w:firstRow="1" w:lastRow="0" w:firstColumn="0" w:lastColumn="0" w:noHBand="0" w:noVBand="1"/>
+      </w:tblPr>
+      <w:tblGrid>
+        <w:gridCol w:w="4074"/>
+        <w:gridCol w:w="1474"/>
+        <w:gridCol w:w="1976"/>
+        <w:gridCol w:w="1169"/>
+      </w:tblGrid>
+      <w:tr>
+        <w:trPr>
+          <w:trHeight w:val="617" w:hRule="auto"/>
+          <w:tblHeader/>
+        </w:trPr>
+        <w:tc>
+          <w:tcPr>
+            <w:tcBorders>
+              <w:bottom w:val="single" w:sz="12" w:space="0" w:color="666666"/>
+              <w:top w:val="single" w:sz="12" w:space="0" w:color="666666"/>
+              <w:left w:val="none" w:sz="0" w:space="0" w:color="000000"/>
+              <w:right w:val="none" w:sz="0" w:space="0" w:color="000000"/>
+            </w:tcBorders>
+            <w:shd w:val="clear" w:color="auto" w:fill="FFFFFF"/>
+            <w:tcMar>
+              <w:top w:w="0" w:type="dxa"/>
+              <w:bottom w:w="0" w:type="dxa"/>
+              <w:left w:w="0" w:type="dxa"/>
+              <w:right w:w="0" w:type="dxa"/>
+            </w:tcMar>
+            <w:vAlign w:val="top"/>
+          </w:tcPr>
+          <w:p>
+            <w:pPr>
+              <w:pStyle w:val="Normal"/>
+              <w:jc w:val="left"/>
+              <w:pBdr>
+                <w:bottom w:val="none" w:sz="0" w:space="0" w:color="000000"/>
+                <w:top w:val="none" w:sz="0" w:space="0" w:color="000000"/>
+                <w:left w:val="none" w:sz="0" w:space="0" w:color="000000"/>
+                <w:right w:val="none" w:sz="0" w:space="0" w:color="000000"/>
+              </w:pBdr>
+              <w:spacing w:after="100" w:before="100" w:line="240"/>
+              <w:ind w:left="100" w:right="100" w:firstLine="0" w:firstLineChars="0"/>
+              <w:rPr>
+                <w:rFonts w:ascii="Arial" w:hAnsi="Arial" w:eastAsia="Arial" w:cs="Arial"/>
+                <w:i w:val="false"/>
+                <w:b w:val="false"/>
+                <w:u w:val="none"/>
+                <w:strike w:val="false"/>
+                <w:sz w:val="20"/>
+                <w:szCs w:val="20"/>
+                <w:color w:val="000000"/>
+              </w:rPr>
+            </w:pPr>
+            <w:r>
+              <w:rPr>
+                <w:rFonts w:ascii="Arial" w:hAnsi="Arial" w:eastAsia="Arial" w:cs="Arial"/>
+                <w:i w:val="false"/>
+                <w:b w:val="false"/>
+                <w:u w:val="none"/>
+                <w:strike w:val="false"/>
+                <w:sz w:val="20"/>
+                <w:szCs w:val="20"/>
+                <w:color w:val="000000"/>
+              </w:rPr>
+              <w:t xml:space="preserve">Indicator</w:t>
+            </w:r>
+          </w:p>
+        </w:tc>
+        <w:tc>
+          <w:tcPr>
+            <w:tcBorders>
+              <w:bottom w:val="single" w:sz="12" w:space="0" w:color="666666"/>
+              <w:top w:val="single" w:sz="12" w:space="0" w:color="666666"/>
+              <w:left w:val="none" w:sz="0" w:space="0" w:color="000000"/>
+              <w:right w:val="none" w:sz="0" w:space="0" w:color="000000"/>
+            </w:tcBorders>
+            <w:shd w:val="clear" w:color="auto" w:fill="FFFFFF"/>
+            <w:tcMar>
+              <w:top w:w="0" w:type="dxa"/>
+              <w:bottom w:w="0" w:type="dxa"/>
+              <w:left w:w="0" w:type="dxa"/>
+              <w:right w:w="0" w:type="dxa"/>
+            </w:tcMar>
+            <w:vAlign w:val="top"/>
+          </w:tcPr>
+          <w:p>
+            <w:pPr>
+              <w:pStyle w:val="Normal"/>
+              <w:jc w:val="left"/>
+              <w:pBdr>
+                <w:bottom w:val="none" w:sz="0" w:space="0" w:color="000000"/>
+                <w:top w:val="none" w:sz="0" w:space="0" w:color="000000"/>
+                <w:left w:val="none" w:sz="0" w:space="0" w:color="000000"/>
+                <w:right w:val="none" w:sz="0" w:space="0" w:color="000000"/>
+              </w:pBdr>
+              <w:spacing w:after="100" w:before="100" w:line="240"/>
+              <w:ind w:left="100" w:right="100" w:firstLine="0" w:firstLineChars="0"/>
+              <w:rPr>
+                <w:rFonts w:ascii="Arial" w:hAnsi="Arial" w:eastAsia="Arial" w:cs="Arial"/>
+                <w:i w:val="false"/>
+                <w:b w:val="false"/>
+                <w:u w:val="none"/>
+                <w:strike w:val="false"/>
+                <w:sz w:val="20"/>
+                <w:szCs w:val="20"/>
+                <w:color w:val="000000"/>
+              </w:rPr>
+            </w:pPr>
+            <w:r>
+              <w:rPr>
+                <w:rFonts w:ascii="Arial" w:hAnsi="Arial" w:eastAsia="Arial" w:cs="Arial"/>
+                <w:i w:val="false"/>
+                <w:b w:val="false"/>
+                <w:u w:val="none"/>
+                <w:strike w:val="false"/>
+                <w:sz w:val="20"/>
+                <w:szCs w:val="20"/>
+                <w:color w:val="000000"/>
+              </w:rPr>
+              <w:t xml:space="preserve">n (Studies)</w:t>
+            </w:r>
+          </w:p>
+        </w:tc>
+        <w:tc>
+          <w:tcPr>
+            <w:tcBorders>
+              <w:bottom w:val="single" w:sz="12" w:space="0" w:color="666666"/>
+              <w:top w:val="single" w:sz="12" w:space="0" w:color="666666"/>
+              <w:left w:val="none" w:sz="0" w:space="0" w:color="000000"/>
+              <w:right w:val="none" w:sz="0" w:space="0" w:color="000000"/>
+            </w:tcBorders>
+            <w:shd w:val="clear" w:color="auto" w:fill="FFFFFF"/>
+            <w:tcMar>
+              <w:top w:w="0" w:type="dxa"/>
+              <w:bottom w:w="0" w:type="dxa"/>
+              <w:left w:w="0" w:type="dxa"/>
+              <w:right w:w="0" w:type="dxa"/>
+            </w:tcMar>
+            <w:vAlign w:val="top"/>
+          </w:tcPr>
+          <w:p>
+            <w:pPr>
+              <w:pStyle w:val="Normal"/>
+              <w:jc w:val="left"/>
+              <w:pBdr>
+                <w:bottom w:val="none" w:sz="0" w:space="0" w:color="000000"/>
+                <w:top w:val="none" w:sz="0" w:space="0" w:color="000000"/>
+                <w:left w:val="none" w:sz="0" w:space="0" w:color="000000"/>
+                <w:right w:val="none" w:sz="0" w:space="0" w:color="000000"/>
+              </w:pBdr>
+              <w:spacing w:after="100" w:before="100" w:line="240"/>
+              <w:ind w:left="100" w:right="100" w:firstLine="0" w:firstLineChars="0"/>
+              <w:rPr>
+                <w:rFonts w:ascii="Arial" w:hAnsi="Arial" w:eastAsia="Arial" w:cs="Arial"/>
+                <w:i w:val="false"/>
+                <w:b w:val="false"/>
+                <w:u w:val="none"/>
+                <w:strike w:val="false"/>
+                <w:sz w:val="20"/>
+                <w:szCs w:val="20"/>
+                <w:color w:val="000000"/>
+              </w:rPr>
+            </w:pPr>
+            <w:r>
+              <w:rPr>
+                <w:rFonts w:ascii="Arial" w:hAnsi="Arial" w:eastAsia="Arial" w:cs="Arial"/>
+                <w:i w:val="false"/>
+                <w:b w:val="false"/>
+                <w:u w:val="none"/>
+                <w:strike w:val="false"/>
+                <w:sz w:val="20"/>
+                <w:szCs w:val="20"/>
+                <w:color w:val="000000"/>
+              </w:rPr>
+              <w:t xml:space="preserve">Proportion (n/N)</w:t>
+            </w:r>
+          </w:p>
+        </w:tc>
+        <w:tc>
+          <w:tcPr>
+            <w:tcBorders>
+              <w:bottom w:val="single" w:sz="12" w:space="0" w:color="666666"/>
+              <w:top w:val="single" w:sz="12" w:space="0" w:color="666666"/>
+              <w:left w:val="none" w:sz="0" w:space="0" w:color="000000"/>
+              <w:right w:val="none" w:sz="0" w:space="0" w:color="000000"/>
+            </w:tcBorders>
+            <w:shd w:val="clear" w:color="auto" w:fill="FFFFFF"/>
+            <w:tcMar>
+              <w:top w:w="0" w:type="dxa"/>
+              <w:bottom w:w="0" w:type="dxa"/>
+              <w:left w:w="0" w:type="dxa"/>
+              <w:right w:w="0" w:type="dxa"/>
+            </w:tcMar>
+            <w:vAlign w:val="top"/>
+          </w:tcPr>
+          <w:p>
+            <w:pPr>
+              <w:pStyle w:val="Normal"/>
+              <w:jc w:val="left"/>
+              <w:pBdr>
+                <w:bottom w:val="none" w:sz="0" w:space="0" w:color="000000"/>
+                <w:top w:val="none" w:sz="0" w:space="0" w:color="000000"/>
+                <w:left w:val="none" w:sz="0" w:space="0" w:color="000000"/>
+                <w:right w:val="none" w:sz="0" w:space="0" w:color="000000"/>
+              </w:pBdr>
+              <w:spacing w:after="100" w:before="100" w:line="240"/>
+              <w:ind w:left="100" w:right="100" w:firstLine="0" w:firstLineChars="0"/>
+              <w:rPr>
+                <w:rFonts w:ascii="Arial" w:hAnsi="Arial" w:eastAsia="Arial" w:cs="Arial"/>
+                <w:i w:val="false"/>
+                <w:b w:val="false"/>
+                <w:u w:val="none"/>
+                <w:strike w:val="false"/>
+                <w:sz w:val="20"/>
+                <w:szCs w:val="20"/>
+                <w:color w:val="000000"/>
+              </w:rPr>
+            </w:pPr>
+            <w:r>
+              <w:rPr>
+                <w:rFonts w:ascii="Arial" w:hAnsi="Arial" w:eastAsia="Arial" w:cs="Arial"/>
+                <w:i w:val="false"/>
+                <w:b w:val="false"/>
+                <w:u w:val="none"/>
+                <w:strike w:val="false"/>
+                <w:sz w:val="20"/>
+                <w:szCs w:val="20"/>
+                <w:color w:val="000000"/>
+              </w:rPr>
+              <w:t xml:space="preserve">Percent</w:t>
+            </w:r>
+          </w:p>
+        </w:tc>
+      </w:tr>
+      <w:tr>
+        <w:trPr>
+          <w:trHeight w:val="612" w:hRule="auto"/>
+        </w:trPr>
+        <w:tc>
+          <w:tcPr>
+            <w:tcBorders>
+              <w:bottom w:val="none" w:sz="0" w:space="0" w:color="000000"/>
+              <w:top w:val="single" w:sz="12" w:space="0" w:color="666666"/>
+              <w:left w:val="none" w:sz="0" w:space="0" w:color="000000"/>
+              <w:right w:val="none" w:sz="0" w:space="0" w:color="000000"/>
+            </w:tcBorders>
+            <w:shd w:val="clear" w:color="auto" w:fill="FFFFFF"/>
+            <w:tcMar>
+              <w:top w:w="0" w:type="dxa"/>
+              <w:bottom w:w="0" w:type="dxa"/>
+              <w:left w:w="0" w:type="dxa"/>
+              <w:right w:w="0" w:type="dxa"/>
+            </w:tcMar>
+            <w:vAlign w:val="top"/>
+          </w:tcPr>
+          <w:p>
+            <w:pPr>
+              <w:pStyle w:val="Normal"/>
+              <w:jc w:val="left"/>
+              <w:pBdr>
+                <w:bottom w:val="none" w:sz="0" w:space="0" w:color="000000"/>
+                <w:top w:val="none" w:sz="0" w:space="0" w:color="000000"/>
+                <w:left w:val="none" w:sz="0" w:space="0" w:color="000000"/>
+                <w:right w:val="none" w:sz="0" w:space="0" w:color="000000"/>
+              </w:pBdr>
+              <w:spacing w:after="100" w:before="100" w:line="240"/>
+              <w:ind w:left="100" w:right="100" w:firstLine="0" w:firstLineChars="0"/>
+              <w:rPr>
+                <w:rFonts w:ascii="Arial" w:hAnsi="Arial" w:eastAsia="Arial" w:cs="Arial"/>
+                <w:i w:val="false"/>
+                <w:b w:val="false"/>
+                <w:u w:val="none"/>
+                <w:strike w:val="false"/>
+                <w:sz w:val="20"/>
+                <w:szCs w:val="20"/>
+                <w:color w:val="000000"/>
+              </w:rPr>
+            </w:pPr>
+            <w:r>
+              <w:rPr>
+                <w:rFonts w:ascii="Arial" w:hAnsi="Arial" w:eastAsia="Arial" w:cs="Arial"/>
+                <w:i w:val="false"/>
+                <w:b w:val="false"/>
+                <w:u w:val="none"/>
+                <w:strike w:val="false"/>
+                <w:sz w:val="20"/>
+                <w:szCs w:val="20"/>
+                <w:color w:val="000000"/>
+              </w:rPr>
+              <w:t xml:space="preserve">Mean overlap reported</w:t>
+            </w:r>
+          </w:p>
+        </w:tc>
+        <w:tc>
+          <w:tcPr>
+            <w:tcBorders>
+              <w:bottom w:val="none" w:sz="0" w:space="0" w:color="000000"/>
+              <w:top w:val="single" w:sz="12" w:space="0" w:color="666666"/>
+              <w:left w:val="none" w:sz="0" w:space="0" w:color="000000"/>
+              <w:right w:val="none" w:sz="0" w:space="0" w:color="000000"/>
+            </w:tcBorders>
+            <w:shd w:val="clear" w:color="auto" w:fill="FFFFFF"/>
+            <w:tcMar>
+              <w:top w:w="0" w:type="dxa"/>
+              <w:bottom w:w="0" w:type="dxa"/>
+              <w:left w:w="0" w:type="dxa"/>
+              <w:right w:w="0" w:type="dxa"/>
+            </w:tcMar>
+            <w:vAlign w:val="top"/>
+          </w:tcPr>
+          <w:p>
+            <w:pPr>
+              <w:pStyle w:val="Normal"/>
+              <w:jc w:val="left"/>
+              <w:pBdr>
+                <w:bottom w:val="none" w:sz="0" w:space="0" w:color="000000"/>
+                <w:top w:val="none" w:sz="0" w:space="0" w:color="000000"/>
+                <w:left w:val="none" w:sz="0" w:space="0" w:color="000000"/>
+                <w:right w:val="none" w:sz="0" w:space="0" w:color="000000"/>
+              </w:pBdr>
+              <w:spacing w:after="100" w:before="100" w:line="240"/>
+              <w:ind w:left="100" w:right="100" w:firstLine="0" w:firstLineChars="0"/>
+              <w:rPr>
+                <w:rFonts w:ascii="Arial" w:hAnsi="Arial" w:eastAsia="Arial" w:cs="Arial"/>
+                <w:i w:val="false"/>
+                <w:b w:val="false"/>
+                <w:u w:val="none"/>
+                <w:strike w:val="false"/>
+                <w:sz w:val="20"/>
+                <w:szCs w:val="20"/>
+                <w:color w:val="000000"/>
+              </w:rPr>
+            </w:pPr>
+            <w:r>
+              <w:rPr>
+                <w:rFonts w:ascii="Arial" w:hAnsi="Arial" w:eastAsia="Arial" w:cs="Arial"/>
+                <w:i w:val="false"/>
+                <w:b w:val="false"/>
+                <w:u w:val="none"/>
+                <w:strike w:val="false"/>
+                <w:sz w:val="20"/>
+                <w:szCs w:val="20"/>
+                <w:color w:val="000000"/>
+              </w:rPr>
+              <w:t xml:space="preserve">26</w:t>
+            </w:r>
+          </w:p>
+        </w:tc>
+        <w:tc>
+          <w:tcPr>
+            <w:tcBorders>
+              <w:bottom w:val="none" w:sz="0" w:space="0" w:color="000000"/>
+              <w:top w:val="single" w:sz="12" w:space="0" w:color="666666"/>
+              <w:left w:val="none" w:sz="0" w:space="0" w:color="000000"/>
+              <w:right w:val="none" w:sz="0" w:space="0" w:color="000000"/>
+            </w:tcBorders>
+            <w:shd w:val="clear" w:color="auto" w:fill="FFFFFF"/>
+            <w:tcMar>
+              <w:top w:w="0" w:type="dxa"/>
+              <w:bottom w:w="0" w:type="dxa"/>
+              <w:left w:w="0" w:type="dxa"/>
+              <w:right w:w="0" w:type="dxa"/>
+            </w:tcMar>
+            <w:vAlign w:val="top"/>
+          </w:tcPr>
+          <w:p>
+            <w:pPr>
+              <w:pStyle w:val="Normal"/>
+              <w:jc w:val="left"/>
+              <w:pBdr>
+                <w:bottom w:val="none" w:sz="0" w:space="0" w:color="000000"/>
+                <w:top w:val="none" w:sz="0" w:space="0" w:color="000000"/>
+                <w:left w:val="none" w:sz="0" w:space="0" w:color="000000"/>
+                <w:right w:val="none" w:sz="0" w:space="0" w:color="000000"/>
+              </w:pBdr>
+              <w:spacing w:after="100" w:before="100" w:line="240"/>
+              <w:ind w:left="100" w:right="100" w:firstLine="0" w:firstLineChars="0"/>
+              <w:rPr>
+                <w:rFonts w:ascii="Arial" w:hAnsi="Arial" w:eastAsia="Arial" w:cs="Arial"/>
+                <w:i w:val="false"/>
+                <w:b w:val="false"/>
+                <w:u w:val="none"/>
+                <w:strike w:val="false"/>
+                <w:sz w:val="20"/>
+                <w:szCs w:val="20"/>
+                <w:color w:val="000000"/>
+              </w:rPr>
+            </w:pPr>
+            <w:r>
+              <w:rPr>
+                <w:rFonts w:ascii="Arial" w:hAnsi="Arial" w:eastAsia="Arial" w:cs="Arial"/>
+                <w:i w:val="false"/>
+                <w:b w:val="false"/>
+                <w:u w:val="none"/>
+                <w:strike w:val="false"/>
+                <w:sz w:val="20"/>
+                <w:szCs w:val="20"/>
+                <w:color w:val="000000"/>
+              </w:rPr>
+              <w:t xml:space="preserve">26/37</w:t>
+            </w:r>
+          </w:p>
+        </w:tc>
+        <w:tc>
+          <w:tcPr>
+            <w:tcBorders>
+              <w:bottom w:val="none" w:sz="0" w:space="0" w:color="000000"/>
+              <w:top w:val="single" w:sz="12" w:space="0" w:color="666666"/>
+              <w:left w:val="none" w:sz="0" w:space="0" w:color="000000"/>
+              <w:right w:val="none" w:sz="0" w:space="0" w:color="000000"/>
+            </w:tcBorders>
+            <w:shd w:val="clear" w:color="auto" w:fill="FFFFFF"/>
+            <w:tcMar>
+              <w:top w:w="0" w:type="dxa"/>
+              <w:bottom w:w="0" w:type="dxa"/>
+              <w:left w:w="0" w:type="dxa"/>
+              <w:right w:w="0" w:type="dxa"/>
+            </w:tcMar>
+            <w:vAlign w:val="top"/>
+          </w:tcPr>
+          <w:p>
+            <w:pPr>
+              <w:pStyle w:val="Normal"/>
+              <w:jc w:val="left"/>
+              <w:pBdr>
+                <w:bottom w:val="none" w:sz="0" w:space="0" w:color="000000"/>
+                <w:top w:val="none" w:sz="0" w:space="0" w:color="000000"/>
+                <w:left w:val="none" w:sz="0" w:space="0" w:color="000000"/>
+                <w:right w:val="none" w:sz="0" w:space="0" w:color="000000"/>
+              </w:pBdr>
+              <w:spacing w:after="100" w:before="100" w:line="240"/>
+              <w:ind w:left="100" w:right="100" w:firstLine="0" w:firstLineChars="0"/>
+              <w:rPr>
+                <w:rFonts w:ascii="Arial" w:hAnsi="Arial" w:eastAsia="Arial" w:cs="Arial"/>
+                <w:i w:val="false"/>
+                <w:b w:val="false"/>
+                <w:u w:val="none"/>
+                <w:strike w:val="false"/>
+                <w:sz w:val="20"/>
+                <w:szCs w:val="20"/>
+                <w:color w:val="000000"/>
+              </w:rPr>
+            </w:pPr>
+            <w:r>
+              <w:rPr>
+                <w:rFonts w:ascii="Arial" w:hAnsi="Arial" w:eastAsia="Arial" w:cs="Arial"/>
+                <w:i w:val="false"/>
+                <w:b w:val="false"/>
+                <w:u w:val="none"/>
+                <w:strike w:val="false"/>
+                <w:sz w:val="20"/>
+                <w:szCs w:val="20"/>
+                <w:color w:val="000000"/>
+              </w:rPr>
+              <w:t xml:space="preserve">70.3%</w:t>
+            </w:r>
+          </w:p>
+        </w:tc>
+      </w:tr>
+      <w:tr>
+        <w:trPr>
+          <w:trHeight w:val="612" w:hRule="auto"/>
+        </w:trPr>
+        <w:tc>
+          <w:tcPr>
+            <w:tcBorders>
+              <w:bottom w:val="none" w:sz="0" w:space="0" w:color="000000"/>
+              <w:top w:val="none" w:sz="0" w:space="0" w:color="000000"/>
+              <w:left w:val="none" w:sz="0" w:space="0" w:color="000000"/>
+              <w:right w:val="none" w:sz="0" w:space="0" w:color="000000"/>
+            </w:tcBorders>
+            <w:shd w:val="clear" w:color="auto" w:fill="FFFFFF"/>
+            <w:tcMar>
+              <w:top w:w="0" w:type="dxa"/>
+              <w:bottom w:w="0" w:type="dxa"/>
+              <w:left w:w="0" w:type="dxa"/>
+              <w:right w:w="0" w:type="dxa"/>
+            </w:tcMar>
+            <w:vAlign w:val="top"/>
+          </w:tcPr>
+          <w:p>
+            <w:pPr>
+              <w:pStyle w:val="Normal"/>
+              <w:jc w:val="left"/>
+              <w:pBdr>
+                <w:bottom w:val="none" w:sz="0" w:space="0" w:color="000000"/>
+                <w:top w:val="none" w:sz="0" w:space="0" w:color="000000"/>
+                <w:left w:val="none" w:sz="0" w:space="0" w:color="000000"/>
+                <w:right w:val="none" w:sz="0" w:space="0" w:color="000000"/>
+              </w:pBdr>
+              <w:spacing w:after="100" w:before="100" w:line="240"/>
+              <w:ind w:left="100" w:right="100" w:firstLine="0" w:firstLineChars="0"/>
+              <w:rPr>
+                <w:rFonts w:ascii="Arial" w:hAnsi="Arial" w:eastAsia="Arial" w:cs="Arial"/>
+                <w:i w:val="false"/>
+                <w:b w:val="false"/>
+                <w:u w:val="none"/>
+                <w:strike w:val="false"/>
+                <w:sz w:val="20"/>
+                <w:szCs w:val="20"/>
+                <w:color w:val="000000"/>
+              </w:rPr>
+            </w:pPr>
+            <w:r>
+              <w:rPr>
+                <w:rFonts w:ascii="Arial" w:hAnsi="Arial" w:eastAsia="Arial" w:cs="Arial"/>
+                <w:i w:val="false"/>
+                <w:b w:val="false"/>
+                <w:u w:val="none"/>
+                <w:strike w:val="false"/>
+                <w:sz w:val="20"/>
+                <w:szCs w:val="20"/>
+                <w:color w:val="000000"/>
+              </w:rPr>
+              <w:t xml:space="preserve">Minimum overlap reported</w:t>
+            </w:r>
+          </w:p>
+        </w:tc>
+        <w:tc>
+          <w:tcPr>
+            <w:tcBorders>
+              <w:bottom w:val="none" w:sz="0" w:space="0" w:color="000000"/>
+              <w:top w:val="none" w:sz="0" w:space="0" w:color="000000"/>
+              <w:left w:val="none" w:sz="0" w:space="0" w:color="000000"/>
+              <w:right w:val="none" w:sz="0" w:space="0" w:color="000000"/>
+            </w:tcBorders>
+            <w:shd w:val="clear" w:color="auto" w:fill="FFFFFF"/>
+            <w:tcMar>
+              <w:top w:w="0" w:type="dxa"/>
+              <w:bottom w:w="0" w:type="dxa"/>
+              <w:left w:w="0" w:type="dxa"/>
+              <w:right w:w="0" w:type="dxa"/>
+            </w:tcMar>
+            <w:vAlign w:val="top"/>
+          </w:tcPr>
+          <w:p>
+            <w:pPr>
+              <w:pStyle w:val="Normal"/>
+              <w:jc w:val="left"/>
+              <w:pBdr>
+                <w:bottom w:val="none" w:sz="0" w:space="0" w:color="000000"/>
+                <w:top w:val="none" w:sz="0" w:space="0" w:color="000000"/>
+                <w:left w:val="none" w:sz="0" w:space="0" w:color="000000"/>
+                <w:right w:val="none" w:sz="0" w:space="0" w:color="000000"/>
+              </w:pBdr>
+              <w:spacing w:after="100" w:before="100" w:line="240"/>
+              <w:ind w:left="100" w:right="100" w:firstLine="0" w:firstLineChars="0"/>
+              <w:rPr>
+                <w:rFonts w:ascii="Arial" w:hAnsi="Arial" w:eastAsia="Arial" w:cs="Arial"/>
+                <w:i w:val="false"/>
+                <w:b w:val="false"/>
+                <w:u w:val="none"/>
+                <w:strike w:val="false"/>
+                <w:sz w:val="20"/>
+                <w:szCs w:val="20"/>
+                <w:color w:val="000000"/>
+              </w:rPr>
+            </w:pPr>
+            <w:r>
+              <w:rPr>
+                <w:rFonts w:ascii="Arial" w:hAnsi="Arial" w:eastAsia="Arial" w:cs="Arial"/>
+                <w:i w:val="false"/>
+                <w:b w:val="false"/>
+                <w:u w:val="none"/>
+                <w:strike w:val="false"/>
+                <w:sz w:val="20"/>
+                <w:szCs w:val="20"/>
+                <w:color w:val="000000"/>
+              </w:rPr>
+              <w:t xml:space="preserve">26</w:t>
+            </w:r>
+          </w:p>
+        </w:tc>
+        <w:tc>
+          <w:tcPr>
+            <w:tcBorders>
+              <w:bottom w:val="none" w:sz="0" w:space="0" w:color="000000"/>
+              <w:top w:val="none" w:sz="0" w:space="0" w:color="000000"/>
+              <w:left w:val="none" w:sz="0" w:space="0" w:color="000000"/>
+              <w:right w:val="none" w:sz="0" w:space="0" w:color="000000"/>
+            </w:tcBorders>
+            <w:shd w:val="clear" w:color="auto" w:fill="FFFFFF"/>
+            <w:tcMar>
+              <w:top w:w="0" w:type="dxa"/>
+              <w:bottom w:w="0" w:type="dxa"/>
+              <w:left w:w="0" w:type="dxa"/>
+              <w:right w:w="0" w:type="dxa"/>
+            </w:tcMar>
+            <w:vAlign w:val="top"/>
+          </w:tcPr>
+          <w:p>
+            <w:pPr>
+              <w:pStyle w:val="Normal"/>
+              <w:jc w:val="left"/>
+              <w:pBdr>
+                <w:bottom w:val="none" w:sz="0" w:space="0" w:color="000000"/>
+                <w:top w:val="none" w:sz="0" w:space="0" w:color="000000"/>
+                <w:left w:val="none" w:sz="0" w:space="0" w:color="000000"/>
+                <w:right w:val="none" w:sz="0" w:space="0" w:color="000000"/>
+              </w:pBdr>
+              <w:spacing w:after="100" w:before="100" w:line="240"/>
+              <w:ind w:left="100" w:right="100" w:firstLine="0" w:firstLineChars="0"/>
+              <w:rPr>
+                <w:rFonts w:ascii="Arial" w:hAnsi="Arial" w:eastAsia="Arial" w:cs="Arial"/>
+                <w:i w:val="false"/>
+                <w:b w:val="false"/>
+                <w:u w:val="none"/>
+                <w:strike w:val="false"/>
+                <w:sz w:val="20"/>
+                <w:szCs w:val="20"/>
+                <w:color w:val="000000"/>
+              </w:rPr>
+            </w:pPr>
+            <w:r>
+              <w:rPr>
+                <w:rFonts w:ascii="Arial" w:hAnsi="Arial" w:eastAsia="Arial" w:cs="Arial"/>
+                <w:i w:val="false"/>
+                <w:b w:val="false"/>
+                <w:u w:val="none"/>
+                <w:strike w:val="false"/>
+                <w:sz w:val="20"/>
+                <w:szCs w:val="20"/>
+                <w:color w:val="000000"/>
+              </w:rPr>
+              <w:t xml:space="preserve">26/37</w:t>
+            </w:r>
+          </w:p>
+        </w:tc>
+        <w:tc>
+          <w:tcPr>
+            <w:tcBorders>
+              <w:bottom w:val="none" w:sz="0" w:space="0" w:color="000000"/>
+              <w:top w:val="none" w:sz="0" w:space="0" w:color="000000"/>
+              <w:left w:val="none" w:sz="0" w:space="0" w:color="000000"/>
+              <w:right w:val="none" w:sz="0" w:space="0" w:color="000000"/>
+            </w:tcBorders>
+            <w:shd w:val="clear" w:color="auto" w:fill="FFFFFF"/>
+            <w:tcMar>
+              <w:top w:w="0" w:type="dxa"/>
+              <w:bottom w:w="0" w:type="dxa"/>
+              <w:left w:w="0" w:type="dxa"/>
+              <w:right w:w="0" w:type="dxa"/>
+            </w:tcMar>
+            <w:vAlign w:val="top"/>
+          </w:tcPr>
+          <w:p>
+            <w:pPr>
+              <w:pStyle w:val="Normal"/>
+              <w:jc w:val="left"/>
+              <w:pBdr>
+                <w:bottom w:val="none" w:sz="0" w:space="0" w:color="000000"/>
+                <w:top w:val="none" w:sz="0" w:space="0" w:color="000000"/>
+                <w:left w:val="none" w:sz="0" w:space="0" w:color="000000"/>
+                <w:right w:val="none" w:sz="0" w:space="0" w:color="000000"/>
+              </w:pBdr>
+              <w:spacing w:after="100" w:before="100" w:line="240"/>
+              <w:ind w:left="100" w:right="100" w:firstLine="0" w:firstLineChars="0"/>
+              <w:rPr>
+                <w:rFonts w:ascii="Arial" w:hAnsi="Arial" w:eastAsia="Arial" w:cs="Arial"/>
+                <w:i w:val="false"/>
+                <w:b w:val="false"/>
+                <w:u w:val="none"/>
+                <w:strike w:val="false"/>
+                <w:sz w:val="20"/>
+                <w:szCs w:val="20"/>
+                <w:color w:val="000000"/>
+              </w:rPr>
+            </w:pPr>
+            <w:r>
+              <w:rPr>
+                <w:rFonts w:ascii="Arial" w:hAnsi="Arial" w:eastAsia="Arial" w:cs="Arial"/>
+                <w:i w:val="false"/>
+                <w:b w:val="false"/>
+                <w:u w:val="none"/>
+                <w:strike w:val="false"/>
+                <w:sz w:val="20"/>
+                <w:szCs w:val="20"/>
+                <w:color w:val="000000"/>
+              </w:rPr>
+              <w:t xml:space="preserve">70.3%</w:t>
+            </w:r>
+          </w:p>
+        </w:tc>
+      </w:tr>
+      <w:tr>
+        <w:trPr>
+          <w:trHeight w:val="612" w:hRule="auto"/>
+        </w:trPr>
+        <w:tc>
+          <w:tcPr>
+            <w:tcBorders>
+              <w:bottom w:val="none" w:sz="0" w:space="0" w:color="000000"/>
+              <w:top w:val="none" w:sz="0" w:space="0" w:color="000000"/>
+              <w:left w:val="none" w:sz="0" w:space="0" w:color="000000"/>
+              <w:right w:val="none" w:sz="0" w:space="0" w:color="000000"/>
+            </w:tcBorders>
+            <w:shd w:val="clear" w:color="auto" w:fill="FFFFFF"/>
+            <w:tcMar>
+              <w:top w:w="0" w:type="dxa"/>
+              <w:bottom w:w="0" w:type="dxa"/>
+              <w:left w:w="0" w:type="dxa"/>
+              <w:right w:w="0" w:type="dxa"/>
+            </w:tcMar>
+            <w:vAlign w:val="top"/>
+          </w:tcPr>
+          <w:p>
+            <w:pPr>
+              <w:pStyle w:val="Normal"/>
+              <w:jc w:val="left"/>
+              <w:pBdr>
+                <w:bottom w:val="none" w:sz="0" w:space="0" w:color="000000"/>
+                <w:top w:val="none" w:sz="0" w:space="0" w:color="000000"/>
+                <w:left w:val="none" w:sz="0" w:space="0" w:color="000000"/>
+                <w:right w:val="none" w:sz="0" w:space="0" w:color="000000"/>
+              </w:pBdr>
+              <w:spacing w:after="100" w:before="100" w:line="240"/>
+              <w:ind w:left="100" w:right="100" w:firstLine="0" w:firstLineChars="0"/>
+              <w:rPr>
+                <w:rFonts w:ascii="Arial" w:hAnsi="Arial" w:eastAsia="Arial" w:cs="Arial"/>
+                <w:i w:val="false"/>
+                <w:b w:val="false"/>
+                <w:u w:val="none"/>
+                <w:strike w:val="false"/>
+                <w:sz w:val="20"/>
+                <w:szCs w:val="20"/>
+                <w:color w:val="000000"/>
+              </w:rPr>
+            </w:pPr>
+            <w:r>
+              <w:rPr>
+                <w:rFonts w:ascii="Arial" w:hAnsi="Arial" w:eastAsia="Arial" w:cs="Arial"/>
+                <w:i w:val="false"/>
+                <w:b w:val="false"/>
+                <w:u w:val="none"/>
+                <w:strike w:val="false"/>
+                <w:sz w:val="20"/>
+                <w:szCs w:val="20"/>
+                <w:color w:val="000000"/>
+              </w:rPr>
+              <w:t xml:space="preserve">Maximum overlap reported</w:t>
+            </w:r>
+          </w:p>
+        </w:tc>
+        <w:tc>
+          <w:tcPr>
+            <w:tcBorders>
+              <w:bottom w:val="none" w:sz="0" w:space="0" w:color="000000"/>
+              <w:top w:val="none" w:sz="0" w:space="0" w:color="000000"/>
+              <w:left w:val="none" w:sz="0" w:space="0" w:color="000000"/>
+              <w:right w:val="none" w:sz="0" w:space="0" w:color="000000"/>
+            </w:tcBorders>
+            <w:shd w:val="clear" w:color="auto" w:fill="FFFFFF"/>
+            <w:tcMar>
+              <w:top w:w="0" w:type="dxa"/>
+              <w:bottom w:w="0" w:type="dxa"/>
+              <w:left w:w="0" w:type="dxa"/>
+              <w:right w:w="0" w:type="dxa"/>
+            </w:tcMar>
+            <w:vAlign w:val="top"/>
+          </w:tcPr>
+          <w:p>
+            <w:pPr>
+              <w:pStyle w:val="Normal"/>
+              <w:jc w:val="left"/>
+              <w:pBdr>
+                <w:bottom w:val="none" w:sz="0" w:space="0" w:color="000000"/>
+                <w:top w:val="none" w:sz="0" w:space="0" w:color="000000"/>
+                <w:left w:val="none" w:sz="0" w:space="0" w:color="000000"/>
+                <w:right w:val="none" w:sz="0" w:space="0" w:color="000000"/>
+              </w:pBdr>
+              <w:spacing w:after="100" w:before="100" w:line="240"/>
+              <w:ind w:left="100" w:right="100" w:firstLine="0" w:firstLineChars="0"/>
+              <w:rPr>
+                <w:rFonts w:ascii="Arial" w:hAnsi="Arial" w:eastAsia="Arial" w:cs="Arial"/>
+                <w:i w:val="false"/>
+                <w:b w:val="false"/>
+                <w:u w:val="none"/>
+                <w:strike w:val="false"/>
+                <w:sz w:val="20"/>
+                <w:szCs w:val="20"/>
+                <w:color w:val="000000"/>
+              </w:rPr>
+            </w:pPr>
+            <w:r>
+              <w:rPr>
+                <w:rFonts w:ascii="Arial" w:hAnsi="Arial" w:eastAsia="Arial" w:cs="Arial"/>
+                <w:i w:val="false"/>
+                <w:b w:val="false"/>
+                <w:u w:val="none"/>
+                <w:strike w:val="false"/>
+                <w:sz w:val="20"/>
+                <w:szCs w:val="20"/>
+                <w:color w:val="000000"/>
+              </w:rPr>
+              <w:t xml:space="preserve">30</w:t>
+            </w:r>
+          </w:p>
+        </w:tc>
+        <w:tc>
+          <w:tcPr>
+            <w:tcBorders>
+              <w:bottom w:val="none" w:sz="0" w:space="0" w:color="000000"/>
+              <w:top w:val="none" w:sz="0" w:space="0" w:color="000000"/>
+              <w:left w:val="none" w:sz="0" w:space="0" w:color="000000"/>
+              <w:right w:val="none" w:sz="0" w:space="0" w:color="000000"/>
+            </w:tcBorders>
+            <w:shd w:val="clear" w:color="auto" w:fill="FFFFFF"/>
+            <w:tcMar>
+              <w:top w:w="0" w:type="dxa"/>
+              <w:bottom w:w="0" w:type="dxa"/>
+              <w:left w:w="0" w:type="dxa"/>
+              <w:right w:w="0" w:type="dxa"/>
+            </w:tcMar>
+            <w:vAlign w:val="top"/>
+          </w:tcPr>
+          <w:p>
+            <w:pPr>
+              <w:pStyle w:val="Normal"/>
+              <w:jc w:val="left"/>
+              <w:pBdr>
+                <w:bottom w:val="none" w:sz="0" w:space="0" w:color="000000"/>
+                <w:top w:val="none" w:sz="0" w:space="0" w:color="000000"/>
+                <w:left w:val="none" w:sz="0" w:space="0" w:color="000000"/>
+                <w:right w:val="none" w:sz="0" w:space="0" w:color="000000"/>
+              </w:pBdr>
+              <w:spacing w:after="100" w:before="100" w:line="240"/>
+              <w:ind w:left="100" w:right="100" w:firstLine="0" w:firstLineChars="0"/>
+              <w:rPr>
+                <w:rFonts w:ascii="Arial" w:hAnsi="Arial" w:eastAsia="Arial" w:cs="Arial"/>
+                <w:i w:val="false"/>
+                <w:b w:val="false"/>
+                <w:u w:val="none"/>
+                <w:strike w:val="false"/>
+                <w:sz w:val="20"/>
+                <w:szCs w:val="20"/>
+                <w:color w:val="000000"/>
+              </w:rPr>
+            </w:pPr>
+            <w:r>
+              <w:rPr>
+                <w:rFonts w:ascii="Arial" w:hAnsi="Arial" w:eastAsia="Arial" w:cs="Arial"/>
+                <w:i w:val="false"/>
+                <w:b w:val="false"/>
+                <w:u w:val="none"/>
+                <w:strike w:val="false"/>
+                <w:sz w:val="20"/>
+                <w:szCs w:val="20"/>
+                <w:color w:val="000000"/>
+              </w:rPr>
+              <w:t xml:space="preserve">30/37</w:t>
+            </w:r>
+          </w:p>
+        </w:tc>
+        <w:tc>
+          <w:tcPr>
+            <w:tcBorders>
+              <w:bottom w:val="none" w:sz="0" w:space="0" w:color="000000"/>
+              <w:top w:val="none" w:sz="0" w:space="0" w:color="000000"/>
+              <w:left w:val="none" w:sz="0" w:space="0" w:color="000000"/>
+              <w:right w:val="none" w:sz="0" w:space="0" w:color="000000"/>
+            </w:tcBorders>
+            <w:shd w:val="clear" w:color="auto" w:fill="FFFFFF"/>
+            <w:tcMar>
+              <w:top w:w="0" w:type="dxa"/>
+              <w:bottom w:w="0" w:type="dxa"/>
+              <w:left w:w="0" w:type="dxa"/>
+              <w:right w:w="0" w:type="dxa"/>
+            </w:tcMar>
+            <w:vAlign w:val="top"/>
+          </w:tcPr>
+          <w:p>
+            <w:pPr>
+              <w:pStyle w:val="Normal"/>
+              <w:jc w:val="left"/>
+              <w:pBdr>
+                <w:bottom w:val="none" w:sz="0" w:space="0" w:color="000000"/>
+                <w:top w:val="none" w:sz="0" w:space="0" w:color="000000"/>
+                <w:left w:val="none" w:sz="0" w:space="0" w:color="000000"/>
+                <w:right w:val="none" w:sz="0" w:space="0" w:color="000000"/>
+              </w:pBdr>
+              <w:spacing w:after="100" w:before="100" w:line="240"/>
+              <w:ind w:left="100" w:right="100" w:firstLine="0" w:firstLineChars="0"/>
+              <w:rPr>
+                <w:rFonts w:ascii="Arial" w:hAnsi="Arial" w:eastAsia="Arial" w:cs="Arial"/>
+                <w:i w:val="false"/>
+                <w:b w:val="false"/>
+                <w:u w:val="none"/>
+                <w:strike w:val="false"/>
+                <w:sz w:val="20"/>
+                <w:szCs w:val="20"/>
+                <w:color w:val="000000"/>
+              </w:rPr>
+            </w:pPr>
+            <w:r>
+              <w:rPr>
+                <w:rFonts w:ascii="Arial" w:hAnsi="Arial" w:eastAsia="Arial" w:cs="Arial"/>
+                <w:i w:val="false"/>
+                <w:b w:val="false"/>
+                <w:u w:val="none"/>
+                <w:strike w:val="false"/>
+                <w:sz w:val="20"/>
+                <w:szCs w:val="20"/>
+                <w:color w:val="000000"/>
+              </w:rPr>
+              <w:t xml:space="preserve">81.1%</w:t>
+            </w:r>
+          </w:p>
+        </w:tc>
+      </w:tr>
+      <w:tr>
+        <w:trPr>
+          <w:trHeight w:val="614" w:hRule="auto"/>
+        </w:trPr>
+        <w:tc>
+          <w:tcPr>
+            <w:tcBorders>
+              <w:bottom w:val="single" w:sz="12" w:space="0" w:color="666666"/>
+              <w:top w:val="none" w:sz="0" w:space="0" w:color="000000"/>
+              <w:left w:val="none" w:sz="0" w:space="0" w:color="000000"/>
+              <w:right w:val="none" w:sz="0" w:space="0" w:color="000000"/>
+            </w:tcBorders>
+            <w:shd w:val="clear" w:color="auto" w:fill="FFFFFF"/>
+            <w:tcMar>
+              <w:top w:w="0" w:type="dxa"/>
+              <w:bottom w:w="0" w:type="dxa"/>
+              <w:left w:w="0" w:type="dxa"/>
+              <w:right w:w="0" w:type="dxa"/>
+            </w:tcMar>
+            <w:vAlign w:val="top"/>
+          </w:tcPr>
+          <w:p>
+            <w:pPr>
+              <w:pStyle w:val="Normal"/>
+              <w:jc w:val="left"/>
+              <w:pBdr>
+                <w:bottom w:val="none" w:sz="0" w:space="0" w:color="000000"/>
+                <w:top w:val="none" w:sz="0" w:space="0" w:color="000000"/>
+                <w:left w:val="none" w:sz="0" w:space="0" w:color="000000"/>
+                <w:right w:val="none" w:sz="0" w:space="0" w:color="000000"/>
+              </w:pBdr>
+              <w:spacing w:after="100" w:before="100" w:line="240"/>
+              <w:ind w:left="100" w:right="100" w:firstLine="0" w:firstLineChars="0"/>
+              <w:rPr>
+                <w:rFonts w:ascii="Arial" w:hAnsi="Arial" w:eastAsia="Arial" w:cs="Arial"/>
+                <w:i w:val="false"/>
+                <w:b w:val="false"/>
+                <w:u w:val="none"/>
+                <w:strike w:val="false"/>
+                <w:sz w:val="20"/>
+                <w:szCs w:val="20"/>
+                <w:color w:val="000000"/>
+              </w:rPr>
+            </w:pPr>
+            <w:r>
+              <w:rPr>
+                <w:rFonts w:ascii="Arial" w:hAnsi="Arial" w:eastAsia="Arial" w:cs="Arial"/>
+                <w:i w:val="false"/>
+                <w:b w:val="false"/>
+                <w:u w:val="none"/>
+                <w:strike w:val="false"/>
+                <w:sz w:val="20"/>
+                <w:szCs w:val="20"/>
+                <w:color w:val="000000"/>
+              </w:rPr>
+              <w:t xml:space="preserve">Length × mean-overlap relation noted</w:t>
+            </w:r>
+          </w:p>
+        </w:tc>
+        <w:tc>
+          <w:tcPr>
+            <w:tcBorders>
+              <w:bottom w:val="single" w:sz="12" w:space="0" w:color="666666"/>
+              <w:top w:val="none" w:sz="0" w:space="0" w:color="000000"/>
+              <w:left w:val="none" w:sz="0" w:space="0" w:color="000000"/>
+              <w:right w:val="none" w:sz="0" w:space="0" w:color="000000"/>
+            </w:tcBorders>
+            <w:shd w:val="clear" w:color="auto" w:fill="FFFFFF"/>
+            <w:tcMar>
+              <w:top w:w="0" w:type="dxa"/>
+              <w:bottom w:w="0" w:type="dxa"/>
+              <w:left w:w="0" w:type="dxa"/>
+              <w:right w:w="0" w:type="dxa"/>
+            </w:tcMar>
+            <w:vAlign w:val="top"/>
+          </w:tcPr>
+          <w:p>
+            <w:pPr>
+              <w:pStyle w:val="Normal"/>
+              <w:jc w:val="left"/>
+              <w:pBdr>
+                <w:bottom w:val="none" w:sz="0" w:space="0" w:color="000000"/>
+                <w:top w:val="none" w:sz="0" w:space="0" w:color="000000"/>
+                <w:left w:val="none" w:sz="0" w:space="0" w:color="000000"/>
+                <w:right w:val="none" w:sz="0" w:space="0" w:color="000000"/>
+              </w:pBdr>
+              <w:spacing w:after="100" w:before="100" w:line="240"/>
+              <w:ind w:left="100" w:right="100" w:firstLine="0" w:firstLineChars="0"/>
+              <w:rPr>
+                <w:rFonts w:ascii="Arial" w:hAnsi="Arial" w:eastAsia="Arial" w:cs="Arial"/>
+                <w:i w:val="false"/>
+                <w:b w:val="false"/>
+                <w:u w:val="none"/>
+                <w:strike w:val="false"/>
+                <w:sz w:val="20"/>
+                <w:szCs w:val="20"/>
+                <w:color w:val="000000"/>
+              </w:rPr>
+            </w:pPr>
+            <w:r>
+              <w:rPr>
+                <w:rFonts w:ascii="Arial" w:hAnsi="Arial" w:eastAsia="Arial" w:cs="Arial"/>
+                <w:i w:val="false"/>
+                <w:b w:val="false"/>
+                <w:u w:val="none"/>
+                <w:strike w:val="false"/>
+                <w:sz w:val="20"/>
+                <w:szCs w:val="20"/>
+                <w:color w:val="000000"/>
+              </w:rPr>
+              <w:t xml:space="preserve">17</w:t>
+            </w:r>
+          </w:p>
+        </w:tc>
+        <w:tc>
+          <w:tcPr>
+            <w:tcBorders>
+              <w:bottom w:val="single" w:sz="12" w:space="0" w:color="666666"/>
+              <w:top w:val="none" w:sz="0" w:space="0" w:color="000000"/>
+              <w:left w:val="none" w:sz="0" w:space="0" w:color="000000"/>
+              <w:right w:val="none" w:sz="0" w:space="0" w:color="000000"/>
+            </w:tcBorders>
+            <w:shd w:val="clear" w:color="auto" w:fill="FFFFFF"/>
+            <w:tcMar>
+              <w:top w:w="0" w:type="dxa"/>
+              <w:bottom w:w="0" w:type="dxa"/>
+              <w:left w:w="0" w:type="dxa"/>
+              <w:right w:w="0" w:type="dxa"/>
+            </w:tcMar>
+            <w:vAlign w:val="top"/>
+          </w:tcPr>
+          <w:p>
+            <w:pPr>
+              <w:pStyle w:val="Normal"/>
+              <w:jc w:val="left"/>
+              <w:pBdr>
+                <w:bottom w:val="none" w:sz="0" w:space="0" w:color="000000"/>
+                <w:top w:val="none" w:sz="0" w:space="0" w:color="000000"/>
+                <w:left w:val="none" w:sz="0" w:space="0" w:color="000000"/>
+                <w:right w:val="none" w:sz="0" w:space="0" w:color="000000"/>
+              </w:pBdr>
+              <w:spacing w:after="100" w:before="100" w:line="240"/>
+              <w:ind w:left="100" w:right="100" w:firstLine="0" w:firstLineChars="0"/>
+              <w:rPr>
+                <w:rFonts w:ascii="Arial" w:hAnsi="Arial" w:eastAsia="Arial" w:cs="Arial"/>
+                <w:i w:val="false"/>
+                <w:b w:val="false"/>
+                <w:u w:val="none"/>
+                <w:strike w:val="false"/>
+                <w:sz w:val="20"/>
+                <w:szCs w:val="20"/>
+                <w:color w:val="000000"/>
+              </w:rPr>
+            </w:pPr>
+            <w:r>
+              <w:rPr>
+                <w:rFonts w:ascii="Arial" w:hAnsi="Arial" w:eastAsia="Arial" w:cs="Arial"/>
+                <w:i w:val="false"/>
+                <w:b w:val="false"/>
+                <w:u w:val="none"/>
+                <w:strike w:val="false"/>
+                <w:sz w:val="20"/>
+                <w:szCs w:val="20"/>
+                <w:color w:val="000000"/>
+              </w:rPr>
+              <w:t xml:space="preserve">17/37</w:t>
+            </w:r>
+          </w:p>
+        </w:tc>
+        <w:tc>
+          <w:tcPr>
+            <w:tcBorders>
+              <w:bottom w:val="single" w:sz="12" w:space="0" w:color="666666"/>
+              <w:top w:val="none" w:sz="0" w:space="0" w:color="000000"/>
+              <w:left w:val="none" w:sz="0" w:space="0" w:color="000000"/>
+              <w:right w:val="none" w:sz="0" w:space="0" w:color="000000"/>
+            </w:tcBorders>
+            <w:shd w:val="clear" w:color="auto" w:fill="FFFFFF"/>
+            <w:tcMar>
+              <w:top w:w="0" w:type="dxa"/>
+              <w:bottom w:w="0" w:type="dxa"/>
+              <w:left w:w="0" w:type="dxa"/>
+              <w:right w:w="0" w:type="dxa"/>
+            </w:tcMar>
+            <w:vAlign w:val="top"/>
+          </w:tcPr>
+          <w:p>
+            <w:pPr>
+              <w:pStyle w:val="Normal"/>
+              <w:jc w:val="left"/>
+              <w:pBdr>
+                <w:bottom w:val="none" w:sz="0" w:space="0" w:color="000000"/>
+                <w:top w:val="none" w:sz="0" w:space="0" w:color="000000"/>
+                <w:left w:val="none" w:sz="0" w:space="0" w:color="000000"/>
+                <w:right w:val="none" w:sz="0" w:space="0" w:color="000000"/>
+              </w:pBdr>
+              <w:spacing w:after="100" w:before="100" w:line="240"/>
+              <w:ind w:left="100" w:right="100" w:firstLine="0" w:firstLineChars="0"/>
+              <w:rPr>
+                <w:rFonts w:ascii="Arial" w:hAnsi="Arial" w:eastAsia="Arial" w:cs="Arial"/>
+                <w:i w:val="false"/>
+                <w:b w:val="false"/>
+                <w:u w:val="none"/>
+                <w:strike w:val="false"/>
+                <w:sz w:val="20"/>
+                <w:szCs w:val="20"/>
+                <w:color w:val="000000"/>
+              </w:rPr>
+            </w:pPr>
+            <w:r>
+              <w:rPr>
+                <w:rFonts w:ascii="Arial" w:hAnsi="Arial" w:eastAsia="Arial" w:cs="Arial"/>
+                <w:i w:val="false"/>
+                <w:b w:val="false"/>
+                <w:u w:val="none"/>
+                <w:strike w:val="false"/>
+                <w:sz w:val="20"/>
+                <w:szCs w:val="20"/>
+                <w:color w:val="000000"/>
+              </w:rPr>
+              <w:t xml:space="preserve">45.9%</w:t>
+            </w:r>
+          </w:p>
+        </w:tc>
+      </w:tr>
+    </w:tbl>
+    <w:p>
+      <w:pPr>
+        <w:pStyle w:val="Normal"/>
+      </w:pPr>
+      <w:r>
+        <w:t xml:space="preserve"/>
+      </w:r>
+    </w:p>
+    <w:p>
+      <w:pPr>
+        <w:pStyle w:val="TableCaption"/>
+        <w:jc w:val="center"/>
+        <w:keepNext/>
+        <w:pBdr>
+          <w:bottom w:val="none" w:sz="0" w:space="0" w:color="000000"/>
+          <w:top w:val="none" w:sz="0" w:space="0" w:color="000000"/>
+          <w:left w:val="none" w:sz="0" w:space="0" w:color="000000"/>
+          <w:right w:val="none" w:sz="0" w:space="0" w:color="000000"/>
+        </w:pBdr>
+        <w:spacing w:after="60" w:before="60" w:line="240"/>
+        <w:ind w:left="60" w:right="60" w:firstLine="0" w:firstLineChars="0"/>
+      </w:pPr>
+      <w:r>
+        <w:t xml:space="preserve">Location of overlap matrix</w:t>
+      </w:r>
+    </w:p>
+    <w:tbl xmlns:a="http://schemas.openxmlformats.org/drawingml/2006/main" xmlns:pic="http://schemas.openxmlformats.org/drawingml/2006/picture">
+      <w:tblPr>
+        <w:tblLayout w:type="fixed"/>
+        <w:jc w:val="center"/>
+        <w:tblLook w:firstRow="1" w:lastRow="0" w:firstColumn="0" w:lastColumn="0" w:noHBand="0" w:noVBand="1"/>
+      </w:tblPr>
+      <w:tblGrid>
+        <w:gridCol w:w="4165"/>
+        <w:gridCol w:w="1474"/>
+        <w:gridCol w:w="1976"/>
+        <w:gridCol w:w="1169"/>
+      </w:tblGrid>
+      <w:tr>
+        <w:trPr>
+          <w:trHeight w:val="617" w:hRule="auto"/>
+          <w:tblHeader/>
+        </w:trPr>
+        <w:tc>
+          <w:tcPr>
+            <w:tcBorders>
+              <w:bottom w:val="single" w:sz="12" w:space="0" w:color="666666"/>
+              <w:top w:val="single" w:sz="12" w:space="0" w:color="666666"/>
+              <w:left w:val="none" w:sz="0" w:space="0" w:color="000000"/>
+              <w:right w:val="none" w:sz="0" w:space="0" w:color="000000"/>
+            </w:tcBorders>
+            <w:shd w:val="clear" w:color="auto" w:fill="FFFFFF"/>
+            <w:tcMar>
+              <w:top w:w="0" w:type="dxa"/>
+              <w:bottom w:w="0" w:type="dxa"/>
+              <w:left w:w="0" w:type="dxa"/>
+              <w:right w:w="0" w:type="dxa"/>
+            </w:tcMar>
+            <w:vAlign w:val="top"/>
+          </w:tcPr>
+          <w:p>
+            <w:pPr>
+              <w:pStyle w:val="Normal"/>
+              <w:jc w:val="left"/>
+              <w:pBdr>
+                <w:bottom w:val="none" w:sz="0" w:space="0" w:color="000000"/>
+                <w:top w:val="none" w:sz="0" w:space="0" w:color="000000"/>
+                <w:left w:val="none" w:sz="0" w:space="0" w:color="000000"/>
+                <w:right w:val="none" w:sz="0" w:space="0" w:color="000000"/>
+              </w:pBdr>
+              <w:spacing w:after="100" w:before="100" w:line="240"/>
+              <w:ind w:left="100" w:right="100" w:firstLine="0" w:firstLineChars="0"/>
+              <w:rPr>
+                <w:rFonts w:ascii="Arial" w:hAnsi="Arial" w:eastAsia="Arial" w:cs="Arial"/>
+                <w:i w:val="false"/>
+                <w:b w:val="false"/>
+                <w:u w:val="none"/>
+                <w:strike w:val="false"/>
+                <w:sz w:val="20"/>
+                <w:szCs w:val="20"/>
+                <w:color w:val="000000"/>
+              </w:rPr>
+            </w:pPr>
+            <w:r>
+              <w:rPr>
+                <w:rFonts w:ascii="Arial" w:hAnsi="Arial" w:eastAsia="Arial" w:cs="Arial"/>
+                <w:i w:val="false"/>
+                <w:b w:val="false"/>
+                <w:u w:val="none"/>
+                <w:strike w:val="false"/>
+                <w:sz w:val="20"/>
+                <w:szCs w:val="20"/>
+                <w:color w:val="000000"/>
+              </w:rPr>
+              <w:t xml:space="preserve">Matrix source</w:t>
+            </w:r>
+          </w:p>
+        </w:tc>
+        <w:tc>
+          <w:tcPr>
+            <w:tcBorders>
+              <w:bottom w:val="single" w:sz="12" w:space="0" w:color="666666"/>
+              <w:top w:val="single" w:sz="12" w:space="0" w:color="666666"/>
+              <w:left w:val="none" w:sz="0" w:space="0" w:color="000000"/>
+              <w:right w:val="none" w:sz="0" w:space="0" w:color="000000"/>
+            </w:tcBorders>
+            <w:shd w:val="clear" w:color="auto" w:fill="FFFFFF"/>
+            <w:tcMar>
+              <w:top w:w="0" w:type="dxa"/>
+              <w:bottom w:w="0" w:type="dxa"/>
+              <w:left w:w="0" w:type="dxa"/>
+              <w:right w:w="0" w:type="dxa"/>
+            </w:tcMar>
+            <w:vAlign w:val="top"/>
+          </w:tcPr>
+          <w:p>
+            <w:pPr>
+              <w:pStyle w:val="Normal"/>
+              <w:jc w:val="left"/>
+              <w:pBdr>
+                <w:bottom w:val="none" w:sz="0" w:space="0" w:color="000000"/>
+                <w:top w:val="none" w:sz="0" w:space="0" w:color="000000"/>
+                <w:left w:val="none" w:sz="0" w:space="0" w:color="000000"/>
+                <w:right w:val="none" w:sz="0" w:space="0" w:color="000000"/>
+              </w:pBdr>
+              <w:spacing w:after="100" w:before="100" w:line="240"/>
+              <w:ind w:left="100" w:right="100" w:firstLine="0" w:firstLineChars="0"/>
+              <w:rPr>
+                <w:rFonts w:ascii="Arial" w:hAnsi="Arial" w:eastAsia="Arial" w:cs="Arial"/>
+                <w:i w:val="false"/>
+                <w:b w:val="false"/>
+                <w:u w:val="none"/>
+                <w:strike w:val="false"/>
+                <w:sz w:val="20"/>
+                <w:szCs w:val="20"/>
+                <w:color w:val="000000"/>
+              </w:rPr>
+            </w:pPr>
+            <w:r>
+              <w:rPr>
+                <w:rFonts w:ascii="Arial" w:hAnsi="Arial" w:eastAsia="Arial" w:cs="Arial"/>
+                <w:i w:val="false"/>
+                <w:b w:val="false"/>
+                <w:u w:val="none"/>
+                <w:strike w:val="false"/>
+                <w:sz w:val="20"/>
+                <w:szCs w:val="20"/>
+                <w:color w:val="000000"/>
+              </w:rPr>
+              <w:t xml:space="preserve">n (Studies)</w:t>
+            </w:r>
+          </w:p>
+        </w:tc>
+        <w:tc>
+          <w:tcPr>
+            <w:tcBorders>
+              <w:bottom w:val="single" w:sz="12" w:space="0" w:color="666666"/>
+              <w:top w:val="single" w:sz="12" w:space="0" w:color="666666"/>
+              <w:left w:val="none" w:sz="0" w:space="0" w:color="000000"/>
+              <w:right w:val="none" w:sz="0" w:space="0" w:color="000000"/>
+            </w:tcBorders>
+            <w:shd w:val="clear" w:color="auto" w:fill="FFFFFF"/>
+            <w:tcMar>
+              <w:top w:w="0" w:type="dxa"/>
+              <w:bottom w:w="0" w:type="dxa"/>
+              <w:left w:w="0" w:type="dxa"/>
+              <w:right w:w="0" w:type="dxa"/>
+            </w:tcMar>
+            <w:vAlign w:val="top"/>
+          </w:tcPr>
+          <w:p>
+            <w:pPr>
+              <w:pStyle w:val="Normal"/>
+              <w:jc w:val="left"/>
+              <w:pBdr>
+                <w:bottom w:val="none" w:sz="0" w:space="0" w:color="000000"/>
+                <w:top w:val="none" w:sz="0" w:space="0" w:color="000000"/>
+                <w:left w:val="none" w:sz="0" w:space="0" w:color="000000"/>
+                <w:right w:val="none" w:sz="0" w:space="0" w:color="000000"/>
+              </w:pBdr>
+              <w:spacing w:after="100" w:before="100" w:line="240"/>
+              <w:ind w:left="100" w:right="100" w:firstLine="0" w:firstLineChars="0"/>
+              <w:rPr>
+                <w:rFonts w:ascii="Arial" w:hAnsi="Arial" w:eastAsia="Arial" w:cs="Arial"/>
+                <w:i w:val="false"/>
+                <w:b w:val="false"/>
+                <w:u w:val="none"/>
+                <w:strike w:val="false"/>
+                <w:sz w:val="20"/>
+                <w:szCs w:val="20"/>
+                <w:color w:val="000000"/>
+              </w:rPr>
+            </w:pPr>
+            <w:r>
+              <w:rPr>
+                <w:rFonts w:ascii="Arial" w:hAnsi="Arial" w:eastAsia="Arial" w:cs="Arial"/>
+                <w:i w:val="false"/>
+                <w:b w:val="false"/>
+                <w:u w:val="none"/>
+                <w:strike w:val="false"/>
+                <w:sz w:val="20"/>
+                <w:szCs w:val="20"/>
+                <w:color w:val="000000"/>
+              </w:rPr>
+              <w:t xml:space="preserve">Proportion (n/N)</w:t>
+            </w:r>
+          </w:p>
+        </w:tc>
+        <w:tc>
+          <w:tcPr>
+            <w:tcBorders>
+              <w:bottom w:val="single" w:sz="12" w:space="0" w:color="666666"/>
+              <w:top w:val="single" w:sz="12" w:space="0" w:color="666666"/>
+              <w:left w:val="none" w:sz="0" w:space="0" w:color="000000"/>
+              <w:right w:val="none" w:sz="0" w:space="0" w:color="000000"/>
+            </w:tcBorders>
+            <w:shd w:val="clear" w:color="auto" w:fill="FFFFFF"/>
+            <w:tcMar>
+              <w:top w:w="0" w:type="dxa"/>
+              <w:bottom w:w="0" w:type="dxa"/>
+              <w:left w:w="0" w:type="dxa"/>
+              <w:right w:w="0" w:type="dxa"/>
+            </w:tcMar>
+            <w:vAlign w:val="top"/>
+          </w:tcPr>
+          <w:p>
+            <w:pPr>
+              <w:pStyle w:val="Normal"/>
+              <w:jc w:val="left"/>
+              <w:pBdr>
+                <w:bottom w:val="none" w:sz="0" w:space="0" w:color="000000"/>
+                <w:top w:val="none" w:sz="0" w:space="0" w:color="000000"/>
+                <w:left w:val="none" w:sz="0" w:space="0" w:color="000000"/>
+                <w:right w:val="none" w:sz="0" w:space="0" w:color="000000"/>
+              </w:pBdr>
+              <w:spacing w:after="100" w:before="100" w:line="240"/>
+              <w:ind w:left="100" w:right="100" w:firstLine="0" w:firstLineChars="0"/>
+              <w:rPr>
+                <w:rFonts w:ascii="Arial" w:hAnsi="Arial" w:eastAsia="Arial" w:cs="Arial"/>
+                <w:i w:val="false"/>
+                <w:b w:val="false"/>
+                <w:u w:val="none"/>
+                <w:strike w:val="false"/>
+                <w:sz w:val="20"/>
+                <w:szCs w:val="20"/>
+                <w:color w:val="000000"/>
+              </w:rPr>
+            </w:pPr>
+            <w:r>
+              <w:rPr>
+                <w:rFonts w:ascii="Arial" w:hAnsi="Arial" w:eastAsia="Arial" w:cs="Arial"/>
+                <w:i w:val="false"/>
+                <w:b w:val="false"/>
+                <w:u w:val="none"/>
+                <w:strike w:val="false"/>
+                <w:sz w:val="20"/>
+                <w:szCs w:val="20"/>
+                <w:color w:val="000000"/>
+              </w:rPr>
+              <w:t xml:space="preserve">Percent</w:t>
+            </w:r>
+          </w:p>
+        </w:tc>
+      </w:tr>
+      <w:tr>
+        <w:trPr>
+          <w:trHeight w:val="577" w:hRule="auto"/>
+        </w:trPr>
+        <w:tc>
+          <w:tcPr>
+            <w:tcBorders>
+              <w:bottom w:val="none" w:sz="0" w:space="0" w:color="000000"/>
+              <w:top w:val="single" w:sz="12" w:space="0" w:color="666666"/>
+              <w:left w:val="none" w:sz="0" w:space="0" w:color="000000"/>
+              <w:right w:val="none" w:sz="0" w:space="0" w:color="000000"/>
+            </w:tcBorders>
+            <w:shd w:val="clear" w:color="auto" w:fill="FFFFFF"/>
+            <w:tcMar>
+              <w:top w:w="0" w:type="dxa"/>
+              <w:bottom w:w="0" w:type="dxa"/>
+              <w:left w:w="0" w:type="dxa"/>
+              <w:right w:w="0" w:type="dxa"/>
+            </w:tcMar>
+            <w:vAlign w:val="top"/>
+          </w:tcPr>
+          <w:p>
+            <w:pPr>
+              <w:pStyle w:val="Normal"/>
+              <w:jc w:val="left"/>
+              <w:pBdr>
+                <w:bottom w:val="none" w:sz="0" w:space="0" w:color="000000"/>
+                <w:top w:val="none" w:sz="0" w:space="0" w:color="000000"/>
+                <w:left w:val="none" w:sz="0" w:space="0" w:color="000000"/>
+                <w:right w:val="none" w:sz="0" w:space="0" w:color="000000"/>
+              </w:pBdr>
+              <w:spacing w:after="100" w:before="100" w:line="240"/>
+              <w:ind w:left="100" w:right="100" w:firstLine="0" w:firstLineChars="0"/>
+              <w:rPr>
+                <w:rFonts w:ascii="Arial" w:hAnsi="Arial" w:eastAsia="Arial" w:cs="Arial"/>
+                <w:i w:val="false"/>
+                <w:b w:val="false"/>
+                <w:u w:val="none"/>
+                <w:strike w:val="false"/>
+                <w:sz w:val="20"/>
+                <w:szCs w:val="20"/>
+                <w:color w:val="000000"/>
+              </w:rPr>
+            </w:pPr>
+            <w:r>
+              <w:rPr>
+                <w:rFonts w:ascii="Arial" w:hAnsi="Arial" w:eastAsia="Arial" w:cs="Arial"/>
+                <w:i w:val="false"/>
+                <w:b w:val="false"/>
+                <w:u w:val="none"/>
+                <w:strike w:val="false"/>
+                <w:sz w:val="20"/>
+                <w:szCs w:val="20"/>
+                <w:color w:val="000000"/>
+              </w:rPr>
+              <w:t xml:space="preserve">Main text</w:t>
+            </w:r>
+          </w:p>
+        </w:tc>
+        <w:tc>
+          <w:tcPr>
+            <w:tcBorders>
+              <w:bottom w:val="none" w:sz="0" w:space="0" w:color="000000"/>
+              <w:top w:val="single" w:sz="12" w:space="0" w:color="666666"/>
+              <w:left w:val="none" w:sz="0" w:space="0" w:color="000000"/>
+              <w:right w:val="none" w:sz="0" w:space="0" w:color="000000"/>
+            </w:tcBorders>
+            <w:shd w:val="clear" w:color="auto" w:fill="FFFFFF"/>
+            <w:tcMar>
+              <w:top w:w="0" w:type="dxa"/>
+              <w:bottom w:w="0" w:type="dxa"/>
+              <w:left w:w="0" w:type="dxa"/>
+              <w:right w:w="0" w:type="dxa"/>
+            </w:tcMar>
+            <w:vAlign w:val="top"/>
+          </w:tcPr>
+          <w:p>
+            <w:pPr>
+              <w:pStyle w:val="Normal"/>
+              <w:jc w:val="left"/>
+              <w:pBdr>
+                <w:bottom w:val="none" w:sz="0" w:space="0" w:color="000000"/>
+                <w:top w:val="none" w:sz="0" w:space="0" w:color="000000"/>
+                <w:left w:val="none" w:sz="0" w:space="0" w:color="000000"/>
+                <w:right w:val="none" w:sz="0" w:space="0" w:color="000000"/>
+              </w:pBdr>
+              <w:spacing w:after="100" w:before="100" w:line="240"/>
+              <w:ind w:left="100" w:right="100" w:firstLine="0" w:firstLineChars="0"/>
+              <w:rPr>
+                <w:rFonts w:ascii="Arial" w:hAnsi="Arial" w:eastAsia="Arial" w:cs="Arial"/>
+                <w:i w:val="false"/>
+                <w:b w:val="false"/>
+                <w:u w:val="none"/>
+                <w:strike w:val="false"/>
+                <w:sz w:val="20"/>
+                <w:szCs w:val="20"/>
+                <w:color w:val="000000"/>
+              </w:rPr>
+            </w:pPr>
+            <w:r>
+              <w:rPr>
+                <w:rFonts w:ascii="Arial" w:hAnsi="Arial" w:eastAsia="Arial" w:cs="Arial"/>
+                <w:i w:val="false"/>
+                <w:b w:val="false"/>
+                <w:u w:val="none"/>
+                <w:strike w:val="false"/>
+                <w:sz w:val="20"/>
+                <w:szCs w:val="20"/>
+                <w:color w:val="000000"/>
+              </w:rPr>
+              <w:t xml:space="preserve">28</w:t>
+            </w:r>
+          </w:p>
+        </w:tc>
+        <w:tc>
+          <w:tcPr>
+            <w:tcBorders>
+              <w:bottom w:val="none" w:sz="0" w:space="0" w:color="000000"/>
+              <w:top w:val="single" w:sz="12" w:space="0" w:color="666666"/>
+              <w:left w:val="none" w:sz="0" w:space="0" w:color="000000"/>
+              <w:right w:val="none" w:sz="0" w:space="0" w:color="000000"/>
+            </w:tcBorders>
+            <w:shd w:val="clear" w:color="auto" w:fill="FFFFFF"/>
+            <w:tcMar>
+              <w:top w:w="0" w:type="dxa"/>
+              <w:bottom w:w="0" w:type="dxa"/>
+              <w:left w:w="0" w:type="dxa"/>
+              <w:right w:w="0" w:type="dxa"/>
+            </w:tcMar>
+            <w:vAlign w:val="top"/>
+          </w:tcPr>
+          <w:p>
+            <w:pPr>
+              <w:pStyle w:val="Normal"/>
+              <w:jc w:val="left"/>
+              <w:pBdr>
+                <w:bottom w:val="none" w:sz="0" w:space="0" w:color="000000"/>
+                <w:top w:val="none" w:sz="0" w:space="0" w:color="000000"/>
+                <w:left w:val="none" w:sz="0" w:space="0" w:color="000000"/>
+                <w:right w:val="none" w:sz="0" w:space="0" w:color="000000"/>
+              </w:pBdr>
+              <w:spacing w:after="100" w:before="100" w:line="240"/>
+              <w:ind w:left="100" w:right="100" w:firstLine="0" w:firstLineChars="0"/>
+              <w:rPr>
+                <w:rFonts w:ascii="Arial" w:hAnsi="Arial" w:eastAsia="Arial" w:cs="Arial"/>
+                <w:i w:val="false"/>
+                <w:b w:val="false"/>
+                <w:u w:val="none"/>
+                <w:strike w:val="false"/>
+                <w:sz w:val="20"/>
+                <w:szCs w:val="20"/>
+                <w:color w:val="000000"/>
+              </w:rPr>
+            </w:pPr>
+            <w:r>
+              <w:rPr>
+                <w:rFonts w:ascii="Arial" w:hAnsi="Arial" w:eastAsia="Arial" w:cs="Arial"/>
+                <w:i w:val="false"/>
+                <w:b w:val="false"/>
+                <w:u w:val="none"/>
+                <w:strike w:val="false"/>
+                <w:sz w:val="20"/>
+                <w:szCs w:val="20"/>
+                <w:color w:val="000000"/>
+              </w:rPr>
+              <w:t xml:space="preserve">28/37</w:t>
+            </w:r>
+          </w:p>
+        </w:tc>
+        <w:tc>
+          <w:tcPr>
+            <w:tcBorders>
+              <w:bottom w:val="none" w:sz="0" w:space="0" w:color="000000"/>
+              <w:top w:val="single" w:sz="12" w:space="0" w:color="666666"/>
+              <w:left w:val="none" w:sz="0" w:space="0" w:color="000000"/>
+              <w:right w:val="none" w:sz="0" w:space="0" w:color="000000"/>
+            </w:tcBorders>
+            <w:shd w:val="clear" w:color="auto" w:fill="FFFFFF"/>
+            <w:tcMar>
+              <w:top w:w="0" w:type="dxa"/>
+              <w:bottom w:w="0" w:type="dxa"/>
+              <w:left w:w="0" w:type="dxa"/>
+              <w:right w:w="0" w:type="dxa"/>
+            </w:tcMar>
+            <w:vAlign w:val="top"/>
+          </w:tcPr>
+          <w:p>
+            <w:pPr>
+              <w:pStyle w:val="Normal"/>
+              <w:jc w:val="left"/>
+              <w:pBdr>
+                <w:bottom w:val="none" w:sz="0" w:space="0" w:color="000000"/>
+                <w:top w:val="none" w:sz="0" w:space="0" w:color="000000"/>
+                <w:left w:val="none" w:sz="0" w:space="0" w:color="000000"/>
+                <w:right w:val="none" w:sz="0" w:space="0" w:color="000000"/>
+              </w:pBdr>
+              <w:spacing w:after="100" w:before="100" w:line="240"/>
+              <w:ind w:left="100" w:right="100" w:firstLine="0" w:firstLineChars="0"/>
+              <w:rPr>
+                <w:rFonts w:ascii="Arial" w:hAnsi="Arial" w:eastAsia="Arial" w:cs="Arial"/>
+                <w:i w:val="false"/>
+                <w:b w:val="false"/>
+                <w:u w:val="none"/>
+                <w:strike w:val="false"/>
+                <w:sz w:val="20"/>
+                <w:szCs w:val="20"/>
+                <w:color w:val="000000"/>
+              </w:rPr>
+            </w:pPr>
+            <w:r>
+              <w:rPr>
+                <w:rFonts w:ascii="Arial" w:hAnsi="Arial" w:eastAsia="Arial" w:cs="Arial"/>
+                <w:i w:val="false"/>
+                <w:b w:val="false"/>
+                <w:u w:val="none"/>
+                <w:strike w:val="false"/>
+                <w:sz w:val="20"/>
+                <w:szCs w:val="20"/>
+                <w:color w:val="000000"/>
+              </w:rPr>
+              <w:t xml:space="preserve">75.7%</w:t>
+            </w:r>
+          </w:p>
+        </w:tc>
+      </w:tr>
+      <w:tr>
+        <w:trPr>
+          <w:trHeight w:val="615" w:hRule="auto"/>
+        </w:trPr>
+        <w:tc>
+          <w:tcPr>
+            <w:tcBorders>
+              <w:bottom w:val="none" w:sz="0" w:space="0" w:color="000000"/>
+              <w:top w:val="none" w:sz="0" w:space="0" w:color="000000"/>
+              <w:left w:val="none" w:sz="0" w:space="0" w:color="000000"/>
+              <w:right w:val="none" w:sz="0" w:space="0" w:color="000000"/>
+            </w:tcBorders>
+            <w:shd w:val="clear" w:color="auto" w:fill="FFFFFF"/>
+            <w:tcMar>
+              <w:top w:w="0" w:type="dxa"/>
+              <w:bottom w:w="0" w:type="dxa"/>
+              <w:left w:w="0" w:type="dxa"/>
+              <w:right w:w="0" w:type="dxa"/>
+            </w:tcMar>
+            <w:vAlign w:val="top"/>
+          </w:tcPr>
+          <w:p>
+            <w:pPr>
+              <w:pStyle w:val="Normal"/>
+              <w:jc w:val="left"/>
+              <w:pBdr>
+                <w:bottom w:val="none" w:sz="0" w:space="0" w:color="000000"/>
+                <w:top w:val="none" w:sz="0" w:space="0" w:color="000000"/>
+                <w:left w:val="none" w:sz="0" w:space="0" w:color="000000"/>
+                <w:right w:val="none" w:sz="0" w:space="0" w:color="000000"/>
+              </w:pBdr>
+              <w:spacing w:after="100" w:before="100" w:line="240"/>
+              <w:ind w:left="100" w:right="100" w:firstLine="0" w:firstLineChars="0"/>
+              <w:rPr>
+                <w:rFonts w:ascii="Arial" w:hAnsi="Arial" w:eastAsia="Arial" w:cs="Arial"/>
+                <w:i w:val="false"/>
+                <w:b w:val="false"/>
+                <w:u w:val="none"/>
+                <w:strike w:val="false"/>
+                <w:sz w:val="20"/>
+                <w:szCs w:val="20"/>
+                <w:color w:val="000000"/>
+              </w:rPr>
+            </w:pPr>
+            <w:r>
+              <w:rPr>
+                <w:rFonts w:ascii="Arial" w:hAnsi="Arial" w:eastAsia="Arial" w:cs="Arial"/>
+                <w:i w:val="false"/>
+                <w:b w:val="false"/>
+                <w:u w:val="none"/>
+                <w:strike w:val="false"/>
+                <w:sz w:val="20"/>
+                <w:szCs w:val="20"/>
+                <w:color w:val="000000"/>
+              </w:rPr>
+              <w:t xml:space="preserve">Supplement</w:t>
+            </w:r>
+          </w:p>
+        </w:tc>
+        <w:tc>
+          <w:tcPr>
+            <w:tcBorders>
+              <w:bottom w:val="none" w:sz="0" w:space="0" w:color="000000"/>
+              <w:top w:val="none" w:sz="0" w:space="0" w:color="000000"/>
+              <w:left w:val="none" w:sz="0" w:space="0" w:color="000000"/>
+              <w:right w:val="none" w:sz="0" w:space="0" w:color="000000"/>
+            </w:tcBorders>
+            <w:shd w:val="clear" w:color="auto" w:fill="FFFFFF"/>
+            <w:tcMar>
+              <w:top w:w="0" w:type="dxa"/>
+              <w:bottom w:w="0" w:type="dxa"/>
+              <w:left w:w="0" w:type="dxa"/>
+              <w:right w:w="0" w:type="dxa"/>
+            </w:tcMar>
+            <w:vAlign w:val="top"/>
+          </w:tcPr>
+          <w:p>
+            <w:pPr>
+              <w:pStyle w:val="Normal"/>
+              <w:jc w:val="left"/>
+              <w:pBdr>
+                <w:bottom w:val="none" w:sz="0" w:space="0" w:color="000000"/>
+                <w:top w:val="none" w:sz="0" w:space="0" w:color="000000"/>
+                <w:left w:val="none" w:sz="0" w:space="0" w:color="000000"/>
+                <w:right w:val="none" w:sz="0" w:space="0" w:color="000000"/>
+              </w:pBdr>
+              <w:spacing w:after="100" w:before="100" w:line="240"/>
+              <w:ind w:left="100" w:right="100" w:firstLine="0" w:firstLineChars="0"/>
+              <w:rPr>
+                <w:rFonts w:ascii="Arial" w:hAnsi="Arial" w:eastAsia="Arial" w:cs="Arial"/>
+                <w:i w:val="false"/>
+                <w:b w:val="false"/>
+                <w:u w:val="none"/>
+                <w:strike w:val="false"/>
+                <w:sz w:val="20"/>
+                <w:szCs w:val="20"/>
+                <w:color w:val="000000"/>
+              </w:rPr>
+            </w:pPr>
+            <w:r>
+              <w:rPr>
+                <w:rFonts w:ascii="Arial" w:hAnsi="Arial" w:eastAsia="Arial" w:cs="Arial"/>
+                <w:i w:val="false"/>
+                <w:b w:val="false"/>
+                <w:u w:val="none"/>
+                <w:strike w:val="false"/>
+                <w:sz w:val="20"/>
+                <w:szCs w:val="20"/>
+                <w:color w:val="000000"/>
+              </w:rPr>
+              <w:t xml:space="preserve">1</w:t>
+            </w:r>
+          </w:p>
+        </w:tc>
+        <w:tc>
+          <w:tcPr>
+            <w:tcBorders>
+              <w:bottom w:val="none" w:sz="0" w:space="0" w:color="000000"/>
+              <w:top w:val="none" w:sz="0" w:space="0" w:color="000000"/>
+              <w:left w:val="none" w:sz="0" w:space="0" w:color="000000"/>
+              <w:right w:val="none" w:sz="0" w:space="0" w:color="000000"/>
+            </w:tcBorders>
+            <w:shd w:val="clear" w:color="auto" w:fill="FFFFFF"/>
+            <w:tcMar>
+              <w:top w:w="0" w:type="dxa"/>
+              <w:bottom w:w="0" w:type="dxa"/>
+              <w:left w:w="0" w:type="dxa"/>
+              <w:right w:w="0" w:type="dxa"/>
+            </w:tcMar>
+            <w:vAlign w:val="top"/>
+          </w:tcPr>
+          <w:p>
+            <w:pPr>
+              <w:pStyle w:val="Normal"/>
+              <w:jc w:val="left"/>
+              <w:pBdr>
+                <w:bottom w:val="none" w:sz="0" w:space="0" w:color="000000"/>
+                <w:top w:val="none" w:sz="0" w:space="0" w:color="000000"/>
+                <w:left w:val="none" w:sz="0" w:space="0" w:color="000000"/>
+                <w:right w:val="none" w:sz="0" w:space="0" w:color="000000"/>
+              </w:pBdr>
+              <w:spacing w:after="100" w:before="100" w:line="240"/>
+              <w:ind w:left="100" w:right="100" w:firstLine="0" w:firstLineChars="0"/>
+              <w:rPr>
+                <w:rFonts w:ascii="Arial" w:hAnsi="Arial" w:eastAsia="Arial" w:cs="Arial"/>
+                <w:i w:val="false"/>
+                <w:b w:val="false"/>
+                <w:u w:val="none"/>
+                <w:strike w:val="false"/>
+                <w:sz w:val="20"/>
+                <w:szCs w:val="20"/>
+                <w:color w:val="000000"/>
+              </w:rPr>
+            </w:pPr>
+            <w:r>
+              <w:rPr>
+                <w:rFonts w:ascii="Arial" w:hAnsi="Arial" w:eastAsia="Arial" w:cs="Arial"/>
+                <w:i w:val="false"/>
+                <w:b w:val="false"/>
+                <w:u w:val="none"/>
+                <w:strike w:val="false"/>
+                <w:sz w:val="20"/>
+                <w:szCs w:val="20"/>
+                <w:color w:val="000000"/>
+              </w:rPr>
+              <w:t xml:space="preserve">1/37</w:t>
+            </w:r>
+          </w:p>
+        </w:tc>
+        <w:tc>
+          <w:tcPr>
+            <w:tcBorders>
+              <w:bottom w:val="none" w:sz="0" w:space="0" w:color="000000"/>
+              <w:top w:val="none" w:sz="0" w:space="0" w:color="000000"/>
+              <w:left w:val="none" w:sz="0" w:space="0" w:color="000000"/>
+              <w:right w:val="none" w:sz="0" w:space="0" w:color="000000"/>
+            </w:tcBorders>
+            <w:shd w:val="clear" w:color="auto" w:fill="FFFFFF"/>
+            <w:tcMar>
+              <w:top w:w="0" w:type="dxa"/>
+              <w:bottom w:w="0" w:type="dxa"/>
+              <w:left w:w="0" w:type="dxa"/>
+              <w:right w:w="0" w:type="dxa"/>
+            </w:tcMar>
+            <w:vAlign w:val="top"/>
+          </w:tcPr>
+          <w:p>
+            <w:pPr>
+              <w:pStyle w:val="Normal"/>
+              <w:jc w:val="left"/>
+              <w:pBdr>
+                <w:bottom w:val="none" w:sz="0" w:space="0" w:color="000000"/>
+                <w:top w:val="none" w:sz="0" w:space="0" w:color="000000"/>
+                <w:left w:val="none" w:sz="0" w:space="0" w:color="000000"/>
+                <w:right w:val="none" w:sz="0" w:space="0" w:color="000000"/>
+              </w:pBdr>
+              <w:spacing w:after="100" w:before="100" w:line="240"/>
+              <w:ind w:left="100" w:right="100" w:firstLine="0" w:firstLineChars="0"/>
+              <w:rPr>
+                <w:rFonts w:ascii="Arial" w:hAnsi="Arial" w:eastAsia="Arial" w:cs="Arial"/>
+                <w:i w:val="false"/>
+                <w:b w:val="false"/>
+                <w:u w:val="none"/>
+                <w:strike w:val="false"/>
+                <w:sz w:val="20"/>
+                <w:szCs w:val="20"/>
+                <w:color w:val="000000"/>
+              </w:rPr>
+            </w:pPr>
+            <w:r>
+              <w:rPr>
+                <w:rFonts w:ascii="Arial" w:hAnsi="Arial" w:eastAsia="Arial" w:cs="Arial"/>
+                <w:i w:val="false"/>
+                <w:b w:val="false"/>
+                <w:u w:val="none"/>
+                <w:strike w:val="false"/>
+                <w:sz w:val="20"/>
+                <w:szCs w:val="20"/>
+                <w:color w:val="000000"/>
+              </w:rPr>
+              <w:t xml:space="preserve">2.7%</w:t>
+            </w:r>
+          </w:p>
+        </w:tc>
+      </w:tr>
+      <w:tr>
+        <w:trPr>
+          <w:trHeight w:val="614" w:hRule="auto"/>
+        </w:trPr>
+        <w:tc>
+          <w:tcPr>
+            <w:tcBorders>
+              <w:bottom w:val="none" w:sz="0" w:space="0" w:color="000000"/>
+              <w:top w:val="none" w:sz="0" w:space="0" w:color="000000"/>
+              <w:left w:val="none" w:sz="0" w:space="0" w:color="000000"/>
+              <w:right w:val="none" w:sz="0" w:space="0" w:color="000000"/>
+            </w:tcBorders>
+            <w:shd w:val="clear" w:color="auto" w:fill="FFFFFF"/>
+            <w:tcMar>
+              <w:top w:w="0" w:type="dxa"/>
+              <w:bottom w:w="0" w:type="dxa"/>
+              <w:left w:w="0" w:type="dxa"/>
+              <w:right w:w="0" w:type="dxa"/>
+            </w:tcMar>
+            <w:vAlign w:val="top"/>
+          </w:tcPr>
+          <w:p>
+            <w:pPr>
+              <w:pStyle w:val="Normal"/>
+              <w:jc w:val="left"/>
+              <w:pBdr>
+                <w:bottom w:val="none" w:sz="0" w:space="0" w:color="000000"/>
+                <w:top w:val="none" w:sz="0" w:space="0" w:color="000000"/>
+                <w:left w:val="none" w:sz="0" w:space="0" w:color="000000"/>
+                <w:right w:val="none" w:sz="0" w:space="0" w:color="000000"/>
+              </w:pBdr>
+              <w:spacing w:after="100" w:before="100" w:line="240"/>
+              <w:ind w:left="100" w:right="100" w:firstLine="0" w:firstLineChars="0"/>
+              <w:rPr>
+                <w:rFonts w:ascii="Arial" w:hAnsi="Arial" w:eastAsia="Arial" w:cs="Arial"/>
+                <w:i w:val="false"/>
+                <w:b w:val="false"/>
+                <w:u w:val="none"/>
+                <w:strike w:val="false"/>
+                <w:sz w:val="20"/>
+                <w:szCs w:val="20"/>
+                <w:color w:val="000000"/>
+              </w:rPr>
+            </w:pPr>
+            <w:r>
+              <w:rPr>
+                <w:rFonts w:ascii="Arial" w:hAnsi="Arial" w:eastAsia="Arial" w:cs="Arial"/>
+                <w:i w:val="false"/>
+                <w:b w:val="false"/>
+                <w:u w:val="none"/>
+                <w:strike w:val="false"/>
+                <w:sz w:val="20"/>
+                <w:szCs w:val="20"/>
+                <w:color w:val="000000"/>
+              </w:rPr>
+              <w:t xml:space="preserve">Not available despite overlap reporting</w:t>
+            </w:r>
+          </w:p>
+        </w:tc>
+        <w:tc>
+          <w:tcPr>
+            <w:tcBorders>
+              <w:bottom w:val="none" w:sz="0" w:space="0" w:color="000000"/>
+              <w:top w:val="none" w:sz="0" w:space="0" w:color="000000"/>
+              <w:left w:val="none" w:sz="0" w:space="0" w:color="000000"/>
+              <w:right w:val="none" w:sz="0" w:space="0" w:color="000000"/>
+            </w:tcBorders>
+            <w:shd w:val="clear" w:color="auto" w:fill="FFFFFF"/>
+            <w:tcMar>
+              <w:top w:w="0" w:type="dxa"/>
+              <w:bottom w:w="0" w:type="dxa"/>
+              <w:left w:w="0" w:type="dxa"/>
+              <w:right w:w="0" w:type="dxa"/>
+            </w:tcMar>
+            <w:vAlign w:val="top"/>
+          </w:tcPr>
+          <w:p>
+            <w:pPr>
+              <w:pStyle w:val="Normal"/>
+              <w:jc w:val="left"/>
+              <w:pBdr>
+                <w:bottom w:val="none" w:sz="0" w:space="0" w:color="000000"/>
+                <w:top w:val="none" w:sz="0" w:space="0" w:color="000000"/>
+                <w:left w:val="none" w:sz="0" w:space="0" w:color="000000"/>
+                <w:right w:val="none" w:sz="0" w:space="0" w:color="000000"/>
+              </w:pBdr>
+              <w:spacing w:after="100" w:before="100" w:line="240"/>
+              <w:ind w:left="100" w:right="100" w:firstLine="0" w:firstLineChars="0"/>
+              <w:rPr>
+                <w:rFonts w:ascii="Arial" w:hAnsi="Arial" w:eastAsia="Arial" w:cs="Arial"/>
+                <w:i w:val="false"/>
+                <w:b w:val="false"/>
+                <w:u w:val="none"/>
+                <w:strike w:val="false"/>
+                <w:sz w:val="20"/>
+                <w:szCs w:val="20"/>
+                <w:color w:val="000000"/>
+              </w:rPr>
+            </w:pPr>
+            <w:r>
+              <w:rPr>
+                <w:rFonts w:ascii="Arial" w:hAnsi="Arial" w:eastAsia="Arial" w:cs="Arial"/>
+                <w:i w:val="false"/>
+                <w:b w:val="false"/>
+                <w:u w:val="none"/>
+                <w:strike w:val="false"/>
+                <w:sz w:val="20"/>
+                <w:szCs w:val="20"/>
+                <w:color w:val="000000"/>
+              </w:rPr>
+              <w:t xml:space="preserve">3</w:t>
+            </w:r>
+          </w:p>
+        </w:tc>
+        <w:tc>
+          <w:tcPr>
+            <w:tcBorders>
+              <w:bottom w:val="none" w:sz="0" w:space="0" w:color="000000"/>
+              <w:top w:val="none" w:sz="0" w:space="0" w:color="000000"/>
+              <w:left w:val="none" w:sz="0" w:space="0" w:color="000000"/>
+              <w:right w:val="none" w:sz="0" w:space="0" w:color="000000"/>
+            </w:tcBorders>
+            <w:shd w:val="clear" w:color="auto" w:fill="FFFFFF"/>
+            <w:tcMar>
+              <w:top w:w="0" w:type="dxa"/>
+              <w:bottom w:w="0" w:type="dxa"/>
+              <w:left w:w="0" w:type="dxa"/>
+              <w:right w:w="0" w:type="dxa"/>
+            </w:tcMar>
+            <w:vAlign w:val="top"/>
+          </w:tcPr>
+          <w:p>
+            <w:pPr>
+              <w:pStyle w:val="Normal"/>
+              <w:jc w:val="left"/>
+              <w:pBdr>
+                <w:bottom w:val="none" w:sz="0" w:space="0" w:color="000000"/>
+                <w:top w:val="none" w:sz="0" w:space="0" w:color="000000"/>
+                <w:left w:val="none" w:sz="0" w:space="0" w:color="000000"/>
+                <w:right w:val="none" w:sz="0" w:space="0" w:color="000000"/>
+              </w:pBdr>
+              <w:spacing w:after="100" w:before="100" w:line="240"/>
+              <w:ind w:left="100" w:right="100" w:firstLine="0" w:firstLineChars="0"/>
+              <w:rPr>
+                <w:rFonts w:ascii="Arial" w:hAnsi="Arial" w:eastAsia="Arial" w:cs="Arial"/>
+                <w:i w:val="false"/>
+                <w:b w:val="false"/>
+                <w:u w:val="none"/>
+                <w:strike w:val="false"/>
+                <w:sz w:val="20"/>
+                <w:szCs w:val="20"/>
+                <w:color w:val="000000"/>
+              </w:rPr>
+            </w:pPr>
+            <w:r>
+              <w:rPr>
+                <w:rFonts w:ascii="Arial" w:hAnsi="Arial" w:eastAsia="Arial" w:cs="Arial"/>
+                <w:i w:val="false"/>
+                <w:b w:val="false"/>
+                <w:u w:val="none"/>
+                <w:strike w:val="false"/>
+                <w:sz w:val="20"/>
+                <w:szCs w:val="20"/>
+                <w:color w:val="000000"/>
+              </w:rPr>
+              <w:t xml:space="preserve">3/37</w:t>
+            </w:r>
+          </w:p>
+        </w:tc>
+        <w:tc>
+          <w:tcPr>
+            <w:tcBorders>
+              <w:bottom w:val="none" w:sz="0" w:space="0" w:color="000000"/>
+              <w:top w:val="none" w:sz="0" w:space="0" w:color="000000"/>
+              <w:left w:val="none" w:sz="0" w:space="0" w:color="000000"/>
+              <w:right w:val="none" w:sz="0" w:space="0" w:color="000000"/>
+            </w:tcBorders>
+            <w:shd w:val="clear" w:color="auto" w:fill="FFFFFF"/>
+            <w:tcMar>
+              <w:top w:w="0" w:type="dxa"/>
+              <w:bottom w:w="0" w:type="dxa"/>
+              <w:left w:w="0" w:type="dxa"/>
+              <w:right w:w="0" w:type="dxa"/>
+            </w:tcMar>
+            <w:vAlign w:val="top"/>
+          </w:tcPr>
+          <w:p>
+            <w:pPr>
+              <w:pStyle w:val="Normal"/>
+              <w:jc w:val="left"/>
+              <w:pBdr>
+                <w:bottom w:val="none" w:sz="0" w:space="0" w:color="000000"/>
+                <w:top w:val="none" w:sz="0" w:space="0" w:color="000000"/>
+                <w:left w:val="none" w:sz="0" w:space="0" w:color="000000"/>
+                <w:right w:val="none" w:sz="0" w:space="0" w:color="000000"/>
+              </w:pBdr>
+              <w:spacing w:after="100" w:before="100" w:line="240"/>
+              <w:ind w:left="100" w:right="100" w:firstLine="0" w:firstLineChars="0"/>
+              <w:rPr>
+                <w:rFonts w:ascii="Arial" w:hAnsi="Arial" w:eastAsia="Arial" w:cs="Arial"/>
+                <w:i w:val="false"/>
+                <w:b w:val="false"/>
+                <w:u w:val="none"/>
+                <w:strike w:val="false"/>
+                <w:sz w:val="20"/>
+                <w:szCs w:val="20"/>
+                <w:color w:val="000000"/>
+              </w:rPr>
+            </w:pPr>
+            <w:r>
+              <w:rPr>
+                <w:rFonts w:ascii="Arial" w:hAnsi="Arial" w:eastAsia="Arial" w:cs="Arial"/>
+                <w:i w:val="false"/>
+                <w:b w:val="false"/>
+                <w:u w:val="none"/>
+                <w:strike w:val="false"/>
+                <w:sz w:val="20"/>
+                <w:szCs w:val="20"/>
+                <w:color w:val="000000"/>
+              </w:rPr>
+              <w:t xml:space="preserve">8.1%</w:t>
+            </w:r>
+          </w:p>
+        </w:tc>
+      </w:tr>
+      <w:tr>
+        <w:trPr>
+          <w:trHeight w:val="577" w:hRule="auto"/>
+        </w:trPr>
+        <w:tc>
+          <w:tcPr>
+            <w:tcBorders>
+              <w:bottom w:val="single" w:sz="12" w:space="0" w:color="666666"/>
+              <w:top w:val="none" w:sz="0" w:space="0" w:color="000000"/>
+              <w:left w:val="none" w:sz="0" w:space="0" w:color="000000"/>
+              <w:right w:val="none" w:sz="0" w:space="0" w:color="000000"/>
+            </w:tcBorders>
+            <w:shd w:val="clear" w:color="auto" w:fill="FFFFFF"/>
+            <w:tcMar>
+              <w:top w:w="0" w:type="dxa"/>
+              <w:bottom w:w="0" w:type="dxa"/>
+              <w:left w:w="0" w:type="dxa"/>
+              <w:right w:w="0" w:type="dxa"/>
+            </w:tcMar>
+            <w:vAlign w:val="top"/>
+          </w:tcPr>
+          <w:p>
+            <w:pPr>
+              <w:pStyle w:val="Normal"/>
+              <w:jc w:val="left"/>
+              <w:pBdr>
+                <w:bottom w:val="none" w:sz="0" w:space="0" w:color="000000"/>
+                <w:top w:val="none" w:sz="0" w:space="0" w:color="000000"/>
+                <w:left w:val="none" w:sz="0" w:space="0" w:color="000000"/>
+                <w:right w:val="none" w:sz="0" w:space="0" w:color="000000"/>
+              </w:pBdr>
+              <w:spacing w:after="100" w:before="100" w:line="240"/>
+              <w:ind w:left="100" w:right="100" w:firstLine="0" w:firstLineChars="0"/>
+              <w:rPr>
+                <w:rFonts w:ascii="Arial" w:hAnsi="Arial" w:eastAsia="Arial" w:cs="Arial"/>
+                <w:i w:val="false"/>
+                <w:b w:val="false"/>
+                <w:u w:val="none"/>
+                <w:strike w:val="false"/>
+                <w:sz w:val="20"/>
+                <w:szCs w:val="20"/>
+                <w:color w:val="000000"/>
+              </w:rPr>
+            </w:pPr>
+            <w:r>
+              <w:rPr>
+                <w:rFonts w:ascii="Arial" w:hAnsi="Arial" w:eastAsia="Arial" w:cs="Arial"/>
+                <w:i w:val="false"/>
+                <w:b w:val="false"/>
+                <w:u w:val="none"/>
+                <w:strike w:val="false"/>
+                <w:sz w:val="20"/>
+                <w:szCs w:val="20"/>
+                <w:color w:val="000000"/>
+              </w:rPr>
+              <w:t xml:space="preserve"/>
+            </w:r>
+          </w:p>
+        </w:tc>
+        <w:tc>
+          <w:tcPr>
+            <w:tcBorders>
+              <w:bottom w:val="single" w:sz="12" w:space="0" w:color="666666"/>
+              <w:top w:val="none" w:sz="0" w:space="0" w:color="000000"/>
+              <w:left w:val="none" w:sz="0" w:space="0" w:color="000000"/>
+              <w:right w:val="none" w:sz="0" w:space="0" w:color="000000"/>
+            </w:tcBorders>
+            <w:shd w:val="clear" w:color="auto" w:fill="FFFFFF"/>
+            <w:tcMar>
+              <w:top w:w="0" w:type="dxa"/>
+              <w:bottom w:w="0" w:type="dxa"/>
+              <w:left w:w="0" w:type="dxa"/>
+              <w:right w:w="0" w:type="dxa"/>
+            </w:tcMar>
+            <w:vAlign w:val="top"/>
+          </w:tcPr>
+          <w:p>
+            <w:pPr>
+              <w:pStyle w:val="Normal"/>
+              <w:jc w:val="left"/>
+              <w:pBdr>
+                <w:bottom w:val="none" w:sz="0" w:space="0" w:color="000000"/>
+                <w:top w:val="none" w:sz="0" w:space="0" w:color="000000"/>
+                <w:left w:val="none" w:sz="0" w:space="0" w:color="000000"/>
+                <w:right w:val="none" w:sz="0" w:space="0" w:color="000000"/>
+              </w:pBdr>
+              <w:spacing w:after="100" w:before="100" w:line="240"/>
+              <w:ind w:left="100" w:right="100" w:firstLine="0" w:firstLineChars="0"/>
+              <w:rPr>
+                <w:rFonts w:ascii="Arial" w:hAnsi="Arial" w:eastAsia="Arial" w:cs="Arial"/>
+                <w:i w:val="false"/>
+                <w:b w:val="false"/>
+                <w:u w:val="none"/>
+                <w:strike w:val="false"/>
+                <w:sz w:val="20"/>
+                <w:szCs w:val="20"/>
+                <w:color w:val="000000"/>
+              </w:rPr>
+            </w:pPr>
+            <w:r>
+              <w:rPr>
+                <w:rFonts w:ascii="Arial" w:hAnsi="Arial" w:eastAsia="Arial" w:cs="Arial"/>
+                <w:i w:val="false"/>
+                <w:b w:val="false"/>
+                <w:u w:val="none"/>
+                <w:strike w:val="false"/>
+                <w:sz w:val="20"/>
+                <w:szCs w:val="20"/>
+                <w:color w:val="000000"/>
+              </w:rPr>
+              <w:t xml:space="preserve">5</w:t>
+            </w:r>
+          </w:p>
+        </w:tc>
+        <w:tc>
+          <w:tcPr>
+            <w:tcBorders>
+              <w:bottom w:val="single" w:sz="12" w:space="0" w:color="666666"/>
+              <w:top w:val="none" w:sz="0" w:space="0" w:color="000000"/>
+              <w:left w:val="none" w:sz="0" w:space="0" w:color="000000"/>
+              <w:right w:val="none" w:sz="0" w:space="0" w:color="000000"/>
+            </w:tcBorders>
+            <w:shd w:val="clear" w:color="auto" w:fill="FFFFFF"/>
+            <w:tcMar>
+              <w:top w:w="0" w:type="dxa"/>
+              <w:bottom w:w="0" w:type="dxa"/>
+              <w:left w:w="0" w:type="dxa"/>
+              <w:right w:w="0" w:type="dxa"/>
+            </w:tcMar>
+            <w:vAlign w:val="top"/>
+          </w:tcPr>
+          <w:p>
+            <w:pPr>
+              <w:pStyle w:val="Normal"/>
+              <w:jc w:val="left"/>
+              <w:pBdr>
+                <w:bottom w:val="none" w:sz="0" w:space="0" w:color="000000"/>
+                <w:top w:val="none" w:sz="0" w:space="0" w:color="000000"/>
+                <w:left w:val="none" w:sz="0" w:space="0" w:color="000000"/>
+                <w:right w:val="none" w:sz="0" w:space="0" w:color="000000"/>
+              </w:pBdr>
+              <w:spacing w:after="100" w:before="100" w:line="240"/>
+              <w:ind w:left="100" w:right="100" w:firstLine="0" w:firstLineChars="0"/>
+              <w:rPr>
+                <w:rFonts w:ascii="Arial" w:hAnsi="Arial" w:eastAsia="Arial" w:cs="Arial"/>
+                <w:i w:val="false"/>
+                <w:b w:val="false"/>
+                <w:u w:val="none"/>
+                <w:strike w:val="false"/>
+                <w:sz w:val="20"/>
+                <w:szCs w:val="20"/>
+                <w:color w:val="000000"/>
+              </w:rPr>
+            </w:pPr>
+            <w:r>
+              <w:rPr>
+                <w:rFonts w:ascii="Arial" w:hAnsi="Arial" w:eastAsia="Arial" w:cs="Arial"/>
+                <w:i w:val="false"/>
+                <w:b w:val="false"/>
+                <w:u w:val="none"/>
+                <w:strike w:val="false"/>
+                <w:sz w:val="20"/>
+                <w:szCs w:val="20"/>
+                <w:color w:val="000000"/>
+              </w:rPr>
+              <w:t xml:space="preserve">5/37</w:t>
+            </w:r>
+          </w:p>
+        </w:tc>
+        <w:tc>
+          <w:tcPr>
+            <w:tcBorders>
+              <w:bottom w:val="single" w:sz="12" w:space="0" w:color="666666"/>
+              <w:top w:val="none" w:sz="0" w:space="0" w:color="000000"/>
+              <w:left w:val="none" w:sz="0" w:space="0" w:color="000000"/>
+              <w:right w:val="none" w:sz="0" w:space="0" w:color="000000"/>
+            </w:tcBorders>
+            <w:shd w:val="clear" w:color="auto" w:fill="FFFFFF"/>
+            <w:tcMar>
+              <w:top w:w="0" w:type="dxa"/>
+              <w:bottom w:w="0" w:type="dxa"/>
+              <w:left w:w="0" w:type="dxa"/>
+              <w:right w:w="0" w:type="dxa"/>
+            </w:tcMar>
+            <w:vAlign w:val="top"/>
+          </w:tcPr>
+          <w:p>
+            <w:pPr>
+              <w:pStyle w:val="Normal"/>
+              <w:jc w:val="left"/>
+              <w:pBdr>
+                <w:bottom w:val="none" w:sz="0" w:space="0" w:color="000000"/>
+                <w:top w:val="none" w:sz="0" w:space="0" w:color="000000"/>
+                <w:left w:val="none" w:sz="0" w:space="0" w:color="000000"/>
+                <w:right w:val="none" w:sz="0" w:space="0" w:color="000000"/>
+              </w:pBdr>
+              <w:spacing w:after="100" w:before="100" w:line="240"/>
+              <w:ind w:left="100" w:right="100" w:firstLine="0" w:firstLineChars="0"/>
+              <w:rPr>
+                <w:rFonts w:ascii="Arial" w:hAnsi="Arial" w:eastAsia="Arial" w:cs="Arial"/>
+                <w:i w:val="false"/>
+                <w:b w:val="false"/>
+                <w:u w:val="none"/>
+                <w:strike w:val="false"/>
+                <w:sz w:val="20"/>
+                <w:szCs w:val="20"/>
+                <w:color w:val="000000"/>
+              </w:rPr>
+            </w:pPr>
+            <w:r>
+              <w:rPr>
+                <w:rFonts w:ascii="Arial" w:hAnsi="Arial" w:eastAsia="Arial" w:cs="Arial"/>
+                <w:i w:val="false"/>
+                <w:b w:val="false"/>
+                <w:u w:val="none"/>
+                <w:strike w:val="false"/>
+                <w:sz w:val="20"/>
+                <w:szCs w:val="20"/>
+                <w:color w:val="000000"/>
+              </w:rPr>
+              <w:t xml:space="preserve">13.5%</w:t>
             </w:r>
           </w:p>
         </w:tc>

</xml_diff>

<commit_message>
full citation for all 37 papers of the corpus added
</commit_message>
<xml_diff>
--- a/outputs/tables_methods_synthesis_simpler.docx
+++ b/outputs/tables_methods_synthesis_simpler.docx
@@ -24124,6 +24124,721 @@
         <w:ind w:left="60" w:right="60" w:firstLine="0" w:firstLineChars="0"/>
       </w:pPr>
       <w:r>
+        <w:t xml:space="preserve">Additional Coding Descriptives</w:t>
+      </w:r>
+    </w:p>
+    <w:tbl xmlns:a="http://schemas.openxmlformats.org/drawingml/2006/main" xmlns:pic="http://schemas.openxmlformats.org/drawingml/2006/picture">
+      <w:tblPr>
+        <w:tblLayout w:type="fixed"/>
+        <w:jc w:val="center"/>
+        <w:tblLook w:firstRow="1" w:lastRow="0" w:firstColumn="0" w:lastColumn="0" w:noHBand="0" w:noVBand="1"/>
+      </w:tblPr>
+      <w:tblGrid>
+        <w:gridCol w:w="2991"/>
+        <w:gridCol w:w="533"/>
+        <w:gridCol w:w="1634"/>
+        <w:gridCol w:w="1670"/>
+      </w:tblGrid>
+      <w:tr>
+        <w:trPr>
+          <w:trHeight w:val="608" w:hRule="auto"/>
+          <w:tblHeader/>
+        </w:trPr>
+        <w:tc>
+          <w:tcPr>
+            <w:tcBorders>
+              <w:bottom w:val="single" w:sz="12" w:space="0" w:color="666666"/>
+              <w:top w:val="single" w:sz="12" w:space="0" w:color="666666"/>
+              <w:left w:val="none" w:sz="0" w:space="0" w:color="000000"/>
+              <w:right w:val="none" w:sz="0" w:space="0" w:color="000000"/>
+            </w:tcBorders>
+            <w:shd w:val="clear" w:color="auto" w:fill="FFFFFF"/>
+            <w:tcMar>
+              <w:top w:w="0" w:type="dxa"/>
+              <w:bottom w:w="0" w:type="dxa"/>
+              <w:left w:w="0" w:type="dxa"/>
+              <w:right w:w="0" w:type="dxa"/>
+            </w:tcMar>
+            <w:vAlign w:val="top"/>
+          </w:tcPr>
+          <w:p>
+            <w:pPr>
+              <w:pStyle w:val="Normal"/>
+              <w:jc w:val="left"/>
+              <w:pBdr>
+                <w:bottom w:val="none" w:sz="0" w:space="0" w:color="000000"/>
+                <w:top w:val="none" w:sz="0" w:space="0" w:color="000000"/>
+                <w:left w:val="none" w:sz="0" w:space="0" w:color="000000"/>
+                <w:right w:val="none" w:sz="0" w:space="0" w:color="000000"/>
+              </w:pBdr>
+              <w:spacing w:after="100" w:before="100" w:line="240"/>
+              <w:ind w:left="100" w:right="100" w:firstLine="0" w:firstLineChars="0"/>
+              <w:rPr>
+                <w:rFonts w:ascii="Arial" w:hAnsi="Arial" w:eastAsia="Arial" w:cs="Arial"/>
+                <w:i w:val="false"/>
+                <w:b w:val="false"/>
+                <w:u w:val="none"/>
+                <w:strike w:val="false"/>
+                <w:sz w:val="20"/>
+                <w:szCs w:val="20"/>
+                <w:color w:val="000000"/>
+              </w:rPr>
+            </w:pPr>
+            <w:r>
+              <w:rPr>
+                <w:rFonts w:ascii="Arial" w:hAnsi="Arial" w:eastAsia="Arial" w:cs="Arial"/>
+                <w:i w:val="false"/>
+                <w:b w:val="false"/>
+                <w:u w:val="none"/>
+                <w:strike w:val="false"/>
+                <w:sz w:val="20"/>
+                <w:szCs w:val="20"/>
+                <w:color w:val="000000"/>
+              </w:rPr>
+              <w:t xml:space="preserve">Indicator</w:t>
+            </w:r>
+          </w:p>
+        </w:tc>
+        <w:tc>
+          <w:tcPr>
+            <w:tcBorders>
+              <w:bottom w:val="single" w:sz="12" w:space="0" w:color="666666"/>
+              <w:top w:val="single" w:sz="12" w:space="0" w:color="666666"/>
+              <w:left w:val="none" w:sz="0" w:space="0" w:color="000000"/>
+              <w:right w:val="none" w:sz="0" w:space="0" w:color="000000"/>
+            </w:tcBorders>
+            <w:shd w:val="clear" w:color="auto" w:fill="FFFFFF"/>
+            <w:tcMar>
+              <w:top w:w="0" w:type="dxa"/>
+              <w:bottom w:w="0" w:type="dxa"/>
+              <w:left w:w="0" w:type="dxa"/>
+              <w:right w:w="0" w:type="dxa"/>
+            </w:tcMar>
+            <w:vAlign w:val="top"/>
+          </w:tcPr>
+          <w:p>
+            <w:pPr>
+              <w:pStyle w:val="Normal"/>
+              <w:jc w:val="left"/>
+              <w:pBdr>
+                <w:bottom w:val="none" w:sz="0" w:space="0" w:color="000000"/>
+                <w:top w:val="none" w:sz="0" w:space="0" w:color="000000"/>
+                <w:left w:val="none" w:sz="0" w:space="0" w:color="000000"/>
+                <w:right w:val="none" w:sz="0" w:space="0" w:color="000000"/>
+              </w:pBdr>
+              <w:spacing w:after="100" w:before="100" w:line="240"/>
+              <w:ind w:left="100" w:right="100" w:firstLine="0" w:firstLineChars="0"/>
+              <w:rPr>
+                <w:rFonts w:ascii="Arial" w:hAnsi="Arial" w:eastAsia="Arial" w:cs="Arial"/>
+                <w:i w:val="false"/>
+                <w:b w:val="false"/>
+                <w:u w:val="none"/>
+                <w:strike w:val="false"/>
+                <w:sz w:val="20"/>
+                <w:szCs w:val="20"/>
+                <w:color w:val="000000"/>
+              </w:rPr>
+            </w:pPr>
+            <w:r>
+              <w:rPr>
+                <w:rFonts w:ascii="Arial" w:hAnsi="Arial" w:eastAsia="Arial" w:cs="Arial"/>
+                <w:i w:val="false"/>
+                <w:b w:val="false"/>
+                <w:u w:val="none"/>
+                <w:strike w:val="false"/>
+                <w:sz w:val="20"/>
+                <w:szCs w:val="20"/>
+                <w:color w:val="000000"/>
+              </w:rPr>
+              <w:t xml:space="preserve">n</w:t>
+            </w:r>
+          </w:p>
+        </w:tc>
+        <w:tc>
+          <w:tcPr>
+            <w:tcBorders>
+              <w:bottom w:val="single" w:sz="12" w:space="0" w:color="666666"/>
+              <w:top w:val="single" w:sz="12" w:space="0" w:color="666666"/>
+              <w:left w:val="none" w:sz="0" w:space="0" w:color="000000"/>
+              <w:right w:val="none" w:sz="0" w:space="0" w:color="000000"/>
+            </w:tcBorders>
+            <w:shd w:val="clear" w:color="auto" w:fill="FFFFFF"/>
+            <w:tcMar>
+              <w:top w:w="0" w:type="dxa"/>
+              <w:bottom w:w="0" w:type="dxa"/>
+              <w:left w:w="0" w:type="dxa"/>
+              <w:right w:w="0" w:type="dxa"/>
+            </w:tcMar>
+            <w:vAlign w:val="top"/>
+          </w:tcPr>
+          <w:p>
+            <w:pPr>
+              <w:pStyle w:val="Normal"/>
+              <w:jc w:val="left"/>
+              <w:pBdr>
+                <w:bottom w:val="none" w:sz="0" w:space="0" w:color="000000"/>
+                <w:top w:val="none" w:sz="0" w:space="0" w:color="000000"/>
+                <w:left w:val="none" w:sz="0" w:space="0" w:color="000000"/>
+                <w:right w:val="none" w:sz="0" w:space="0" w:color="000000"/>
+              </w:pBdr>
+              <w:spacing w:after="100" w:before="100" w:line="240"/>
+              <w:ind w:left="100" w:right="100" w:firstLine="0" w:firstLineChars="0"/>
+              <w:rPr>
+                <w:rFonts w:ascii="Arial" w:hAnsi="Arial" w:eastAsia="Arial" w:cs="Arial"/>
+                <w:i w:val="false"/>
+                <w:b w:val="false"/>
+                <w:u w:val="none"/>
+                <w:strike w:val="false"/>
+                <w:sz w:val="20"/>
+                <w:szCs w:val="20"/>
+                <w:color w:val="000000"/>
+              </w:rPr>
+            </w:pPr>
+            <w:r>
+              <w:rPr>
+                <w:rFonts w:ascii="Arial" w:hAnsi="Arial" w:eastAsia="Arial" w:cs="Arial"/>
+                <w:i w:val="false"/>
+                <w:b w:val="false"/>
+                <w:u w:val="none"/>
+                <w:strike w:val="false"/>
+                <w:sz w:val="20"/>
+                <w:szCs w:val="20"/>
+                <w:color w:val="000000"/>
+              </w:rPr>
+              <w:t xml:space="preserve">denominator</w:t>
+            </w:r>
+          </w:p>
+        </w:tc>
+        <w:tc>
+          <w:tcPr>
+            <w:tcBorders>
+              <w:bottom w:val="single" w:sz="12" w:space="0" w:color="666666"/>
+              <w:top w:val="single" w:sz="12" w:space="0" w:color="666666"/>
+              <w:left w:val="none" w:sz="0" w:space="0" w:color="000000"/>
+              <w:right w:val="none" w:sz="0" w:space="0" w:color="000000"/>
+            </w:tcBorders>
+            <w:shd w:val="clear" w:color="auto" w:fill="FFFFFF"/>
+            <w:tcMar>
+              <w:top w:w="0" w:type="dxa"/>
+              <w:bottom w:w="0" w:type="dxa"/>
+              <w:left w:w="0" w:type="dxa"/>
+              <w:right w:w="0" w:type="dxa"/>
+            </w:tcMar>
+            <w:vAlign w:val="top"/>
+          </w:tcPr>
+          <w:p>
+            <w:pPr>
+              <w:pStyle w:val="Normal"/>
+              <w:jc w:val="left"/>
+              <w:pBdr>
+                <w:bottom w:val="none" w:sz="0" w:space="0" w:color="000000"/>
+                <w:top w:val="none" w:sz="0" w:space="0" w:color="000000"/>
+                <w:left w:val="none" w:sz="0" w:space="0" w:color="000000"/>
+                <w:right w:val="none" w:sz="0" w:space="0" w:color="000000"/>
+              </w:pBdr>
+              <w:spacing w:after="100" w:before="100" w:line="240"/>
+              <w:ind w:left="100" w:right="100" w:firstLine="0" w:firstLineChars="0"/>
+              <w:rPr>
+                <w:rFonts w:ascii="Arial" w:hAnsi="Arial" w:eastAsia="Arial" w:cs="Arial"/>
+                <w:i w:val="false"/>
+                <w:b w:val="false"/>
+                <w:u w:val="none"/>
+                <w:strike w:val="false"/>
+                <w:sz w:val="20"/>
+                <w:szCs w:val="20"/>
+                <w:color w:val="000000"/>
+              </w:rPr>
+            </w:pPr>
+            <w:r>
+              <w:rPr>
+                <w:rFonts w:ascii="Arial" w:hAnsi="Arial" w:eastAsia="Arial" w:cs="Arial"/>
+                <w:i w:val="false"/>
+                <w:b w:val="false"/>
+                <w:u w:val="none"/>
+                <w:strike w:val="false"/>
+                <w:sz w:val="20"/>
+                <w:szCs w:val="20"/>
+                <w:color w:val="000000"/>
+              </w:rPr>
+              <w:t xml:space="preserve">report</w:t>
+            </w:r>
+          </w:p>
+        </w:tc>
+      </w:tr>
+      <w:tr>
+        <w:trPr>
+          <w:trHeight w:val="617" w:hRule="auto"/>
+        </w:trPr>
+        <w:tc>
+          <w:tcPr>
+            <w:tcBorders>
+              <w:bottom w:val="none" w:sz="0" w:space="0" w:color="000000"/>
+              <w:top w:val="single" w:sz="12" w:space="0" w:color="666666"/>
+              <w:left w:val="none" w:sz="0" w:space="0" w:color="000000"/>
+              <w:right w:val="none" w:sz="0" w:space="0" w:color="000000"/>
+            </w:tcBorders>
+            <w:shd w:val="clear" w:color="auto" w:fill="FFFFFF"/>
+            <w:tcMar>
+              <w:top w:w="0" w:type="dxa"/>
+              <w:bottom w:w="0" w:type="dxa"/>
+              <w:left w:w="0" w:type="dxa"/>
+              <w:right w:w="0" w:type="dxa"/>
+            </w:tcMar>
+            <w:vAlign w:val="top"/>
+          </w:tcPr>
+          <w:p>
+            <w:pPr>
+              <w:pStyle w:val="Normal"/>
+              <w:jc w:val="left"/>
+              <w:pBdr>
+                <w:bottom w:val="none" w:sz="0" w:space="0" w:color="000000"/>
+                <w:top w:val="none" w:sz="0" w:space="0" w:color="000000"/>
+                <w:left w:val="none" w:sz="0" w:space="0" w:color="000000"/>
+                <w:right w:val="none" w:sz="0" w:space="0" w:color="000000"/>
+              </w:pBdr>
+              <w:spacing w:after="100" w:before="100" w:line="240"/>
+              <w:ind w:left="100" w:right="100" w:firstLine="0" w:firstLineChars="0"/>
+              <w:rPr>
+                <w:rFonts w:ascii="Arial" w:hAnsi="Arial" w:eastAsia="Arial" w:cs="Arial"/>
+                <w:i w:val="false"/>
+                <w:b w:val="false"/>
+                <w:u w:val="none"/>
+                <w:strike w:val="false"/>
+                <w:sz w:val="20"/>
+                <w:szCs w:val="20"/>
+                <w:color w:val="000000"/>
+              </w:rPr>
+            </w:pPr>
+            <w:r>
+              <w:rPr>
+                <w:rFonts w:ascii="Arial" w:hAnsi="Arial" w:eastAsia="Arial" w:cs="Arial"/>
+                <w:i w:val="false"/>
+                <w:b w:val="false"/>
+                <w:u w:val="none"/>
+                <w:strike w:val="false"/>
+                <w:sz w:val="20"/>
+                <w:szCs w:val="20"/>
+                <w:color w:val="000000"/>
+              </w:rPr>
+              <w:t xml:space="preserve">Rater expertise mentioned</w:t>
+            </w:r>
+          </w:p>
+        </w:tc>
+        <w:tc>
+          <w:tcPr>
+            <w:tcBorders>
+              <w:bottom w:val="none" w:sz="0" w:space="0" w:color="000000"/>
+              <w:top w:val="single" w:sz="12" w:space="0" w:color="666666"/>
+              <w:left w:val="none" w:sz="0" w:space="0" w:color="000000"/>
+              <w:right w:val="none" w:sz="0" w:space="0" w:color="000000"/>
+            </w:tcBorders>
+            <w:shd w:val="clear" w:color="auto" w:fill="FFFFFF"/>
+            <w:tcMar>
+              <w:top w:w="0" w:type="dxa"/>
+              <w:bottom w:w="0" w:type="dxa"/>
+              <w:left w:w="0" w:type="dxa"/>
+              <w:right w:w="0" w:type="dxa"/>
+            </w:tcMar>
+            <w:vAlign w:val="top"/>
+          </w:tcPr>
+          <w:p>
+            <w:pPr>
+              <w:pStyle w:val="Normal"/>
+              <w:jc w:val="left"/>
+              <w:pBdr>
+                <w:bottom w:val="none" w:sz="0" w:space="0" w:color="000000"/>
+                <w:top w:val="none" w:sz="0" w:space="0" w:color="000000"/>
+                <w:left w:val="none" w:sz="0" w:space="0" w:color="000000"/>
+                <w:right w:val="none" w:sz="0" w:space="0" w:color="000000"/>
+              </w:pBdr>
+              <w:spacing w:after="100" w:before="100" w:line="240"/>
+              <w:ind w:left="100" w:right="100" w:firstLine="0" w:firstLineChars="0"/>
+              <w:rPr>
+                <w:rFonts w:ascii="Arial" w:hAnsi="Arial" w:eastAsia="Arial" w:cs="Arial"/>
+                <w:i w:val="false"/>
+                <w:b w:val="false"/>
+                <w:u w:val="none"/>
+                <w:strike w:val="false"/>
+                <w:sz w:val="20"/>
+                <w:szCs w:val="20"/>
+                <w:color w:val="000000"/>
+              </w:rPr>
+            </w:pPr>
+            <w:r>
+              <w:rPr>
+                <w:rFonts w:ascii="Arial" w:hAnsi="Arial" w:eastAsia="Arial" w:cs="Arial"/>
+                <w:i w:val="false"/>
+                <w:b w:val="false"/>
+                <w:u w:val="none"/>
+                <w:strike w:val="false"/>
+                <w:sz w:val="20"/>
+                <w:szCs w:val="20"/>
+                <w:color w:val="000000"/>
+              </w:rPr>
+              <w:t xml:space="preserve">8</w:t>
+            </w:r>
+          </w:p>
+        </w:tc>
+        <w:tc>
+          <w:tcPr>
+            <w:tcBorders>
+              <w:bottom w:val="none" w:sz="0" w:space="0" w:color="000000"/>
+              <w:top w:val="single" w:sz="12" w:space="0" w:color="666666"/>
+              <w:left w:val="none" w:sz="0" w:space="0" w:color="000000"/>
+              <w:right w:val="none" w:sz="0" w:space="0" w:color="000000"/>
+            </w:tcBorders>
+            <w:shd w:val="clear" w:color="auto" w:fill="FFFFFF"/>
+            <w:tcMar>
+              <w:top w:w="0" w:type="dxa"/>
+              <w:bottom w:w="0" w:type="dxa"/>
+              <w:left w:w="0" w:type="dxa"/>
+              <w:right w:w="0" w:type="dxa"/>
+            </w:tcMar>
+            <w:vAlign w:val="top"/>
+          </w:tcPr>
+          <w:p>
+            <w:pPr>
+              <w:pStyle w:val="Normal"/>
+              <w:jc w:val="left"/>
+              <w:pBdr>
+                <w:bottom w:val="none" w:sz="0" w:space="0" w:color="000000"/>
+                <w:top w:val="none" w:sz="0" w:space="0" w:color="000000"/>
+                <w:left w:val="none" w:sz="0" w:space="0" w:color="000000"/>
+                <w:right w:val="none" w:sz="0" w:space="0" w:color="000000"/>
+              </w:pBdr>
+              <w:spacing w:after="100" w:before="100" w:line="240"/>
+              <w:ind w:left="100" w:right="100" w:firstLine="0" w:firstLineChars="0"/>
+              <w:rPr>
+                <w:rFonts w:ascii="Arial" w:hAnsi="Arial" w:eastAsia="Arial" w:cs="Arial"/>
+                <w:i w:val="false"/>
+                <w:b w:val="false"/>
+                <w:u w:val="none"/>
+                <w:strike w:val="false"/>
+                <w:sz w:val="20"/>
+                <w:szCs w:val="20"/>
+                <w:color w:val="000000"/>
+              </w:rPr>
+            </w:pPr>
+            <w:r>
+              <w:rPr>
+                <w:rFonts w:ascii="Arial" w:hAnsi="Arial" w:eastAsia="Arial" w:cs="Arial"/>
+                <w:i w:val="false"/>
+                <w:b w:val="false"/>
+                <w:u w:val="none"/>
+                <w:strike w:val="false"/>
+                <w:sz w:val="20"/>
+                <w:szCs w:val="20"/>
+                <w:color w:val="000000"/>
+              </w:rPr>
+              <w:t xml:space="preserve">37</w:t>
+            </w:r>
+          </w:p>
+        </w:tc>
+        <w:tc>
+          <w:tcPr>
+            <w:tcBorders>
+              <w:bottom w:val="none" w:sz="0" w:space="0" w:color="000000"/>
+              <w:top w:val="single" w:sz="12" w:space="0" w:color="666666"/>
+              <w:left w:val="none" w:sz="0" w:space="0" w:color="000000"/>
+              <w:right w:val="none" w:sz="0" w:space="0" w:color="000000"/>
+            </w:tcBorders>
+            <w:shd w:val="clear" w:color="auto" w:fill="FFFFFF"/>
+            <w:tcMar>
+              <w:top w:w="0" w:type="dxa"/>
+              <w:bottom w:w="0" w:type="dxa"/>
+              <w:left w:w="0" w:type="dxa"/>
+              <w:right w:w="0" w:type="dxa"/>
+            </w:tcMar>
+            <w:vAlign w:val="top"/>
+          </w:tcPr>
+          <w:p>
+            <w:pPr>
+              <w:pStyle w:val="Normal"/>
+              <w:jc w:val="left"/>
+              <w:pBdr>
+                <w:bottom w:val="none" w:sz="0" w:space="0" w:color="000000"/>
+                <w:top w:val="none" w:sz="0" w:space="0" w:color="000000"/>
+                <w:left w:val="none" w:sz="0" w:space="0" w:color="000000"/>
+                <w:right w:val="none" w:sz="0" w:space="0" w:color="000000"/>
+              </w:pBdr>
+              <w:spacing w:after="100" w:before="100" w:line="240"/>
+              <w:ind w:left="100" w:right="100" w:firstLine="0" w:firstLineChars="0"/>
+              <w:rPr>
+                <w:rFonts w:ascii="Arial" w:hAnsi="Arial" w:eastAsia="Arial" w:cs="Arial"/>
+                <w:i w:val="false"/>
+                <w:b w:val="false"/>
+                <w:u w:val="none"/>
+                <w:strike w:val="false"/>
+                <w:sz w:val="20"/>
+                <w:szCs w:val="20"/>
+                <w:color w:val="000000"/>
+              </w:rPr>
+            </w:pPr>
+            <w:r>
+              <w:rPr>
+                <w:rFonts w:ascii="Arial" w:hAnsi="Arial" w:eastAsia="Arial" w:cs="Arial"/>
+                <w:i w:val="false"/>
+                <w:b w:val="false"/>
+                <w:u w:val="none"/>
+                <w:strike w:val="false"/>
+                <w:sz w:val="20"/>
+                <w:szCs w:val="20"/>
+                <w:color w:val="000000"/>
+              </w:rPr>
+              <w:t xml:space="preserve">8/37 (21.6%)</w:t>
+            </w:r>
+          </w:p>
+        </w:tc>
+      </w:tr>
+      <w:tr>
+        <w:trPr>
+          <w:trHeight w:val="617" w:hRule="auto"/>
+        </w:trPr>
+        <w:tc>
+          <w:tcPr>
+            <w:tcBorders>
+              <w:bottom w:val="single" w:sz="12" w:space="0" w:color="666666"/>
+              <w:top w:val="none" w:sz="0" w:space="0" w:color="000000"/>
+              <w:left w:val="none" w:sz="0" w:space="0" w:color="000000"/>
+              <w:right w:val="none" w:sz="0" w:space="0" w:color="000000"/>
+            </w:tcBorders>
+            <w:shd w:val="clear" w:color="auto" w:fill="FFFFFF"/>
+            <w:tcMar>
+              <w:top w:w="0" w:type="dxa"/>
+              <w:bottom w:w="0" w:type="dxa"/>
+              <w:left w:w="0" w:type="dxa"/>
+              <w:right w:w="0" w:type="dxa"/>
+            </w:tcMar>
+            <w:vAlign w:val="top"/>
+          </w:tcPr>
+          <w:p>
+            <w:pPr>
+              <w:pStyle w:val="Normal"/>
+              <w:jc w:val="left"/>
+              <w:pBdr>
+                <w:bottom w:val="none" w:sz="0" w:space="0" w:color="000000"/>
+                <w:top w:val="none" w:sz="0" w:space="0" w:color="000000"/>
+                <w:left w:val="none" w:sz="0" w:space="0" w:color="000000"/>
+                <w:right w:val="none" w:sz="0" w:space="0" w:color="000000"/>
+              </w:pBdr>
+              <w:spacing w:after="100" w:before="100" w:line="240"/>
+              <w:ind w:left="100" w:right="100" w:firstLine="0" w:firstLineChars="0"/>
+              <w:rPr>
+                <w:rFonts w:ascii="Arial" w:hAnsi="Arial" w:eastAsia="Arial" w:cs="Arial"/>
+                <w:i w:val="false"/>
+                <w:b w:val="false"/>
+                <w:u w:val="none"/>
+                <w:strike w:val="false"/>
+                <w:sz w:val="20"/>
+                <w:szCs w:val="20"/>
+                <w:color w:val="000000"/>
+              </w:rPr>
+            </w:pPr>
+            <w:r>
+              <w:rPr>
+                <w:rFonts w:ascii="Arial" w:hAnsi="Arial" w:eastAsia="Arial" w:cs="Arial"/>
+                <w:i w:val="false"/>
+                <w:b w:val="false"/>
+                <w:u w:val="none"/>
+                <w:strike w:val="false"/>
+                <w:sz w:val="20"/>
+                <w:szCs w:val="20"/>
+                <w:color w:val="000000"/>
+              </w:rPr>
+              <w:t xml:space="preserve">Blinded</w:t>
+            </w:r>
+          </w:p>
+        </w:tc>
+        <w:tc>
+          <w:tcPr>
+            <w:tcBorders>
+              <w:bottom w:val="single" w:sz="12" w:space="0" w:color="666666"/>
+              <w:top w:val="none" w:sz="0" w:space="0" w:color="000000"/>
+              <w:left w:val="none" w:sz="0" w:space="0" w:color="000000"/>
+              <w:right w:val="none" w:sz="0" w:space="0" w:color="000000"/>
+            </w:tcBorders>
+            <w:shd w:val="clear" w:color="auto" w:fill="FFFFFF"/>
+            <w:tcMar>
+              <w:top w:w="0" w:type="dxa"/>
+              <w:bottom w:w="0" w:type="dxa"/>
+              <w:left w:w="0" w:type="dxa"/>
+              <w:right w:w="0" w:type="dxa"/>
+            </w:tcMar>
+            <w:vAlign w:val="top"/>
+          </w:tcPr>
+          <w:p>
+            <w:pPr>
+              <w:pStyle w:val="Normal"/>
+              <w:jc w:val="left"/>
+              <w:pBdr>
+                <w:bottom w:val="none" w:sz="0" w:space="0" w:color="000000"/>
+                <w:top w:val="none" w:sz="0" w:space="0" w:color="000000"/>
+                <w:left w:val="none" w:sz="0" w:space="0" w:color="000000"/>
+                <w:right w:val="none" w:sz="0" w:space="0" w:color="000000"/>
+              </w:pBdr>
+              <w:spacing w:after="100" w:before="100" w:line="240"/>
+              <w:ind w:left="100" w:right="100" w:firstLine="0" w:firstLineChars="0"/>
+              <w:rPr>
+                <w:rFonts w:ascii="Arial" w:hAnsi="Arial" w:eastAsia="Arial" w:cs="Arial"/>
+                <w:i w:val="false"/>
+                <w:b w:val="false"/>
+                <w:u w:val="none"/>
+                <w:strike w:val="false"/>
+                <w:sz w:val="20"/>
+                <w:szCs w:val="20"/>
+                <w:color w:val="000000"/>
+              </w:rPr>
+            </w:pPr>
+            <w:r>
+              <w:rPr>
+                <w:rFonts w:ascii="Arial" w:hAnsi="Arial" w:eastAsia="Arial" w:cs="Arial"/>
+                <w:i w:val="false"/>
+                <w:b w:val="false"/>
+                <w:u w:val="none"/>
+                <w:strike w:val="false"/>
+                <w:sz w:val="20"/>
+                <w:szCs w:val="20"/>
+                <w:color w:val="000000"/>
+              </w:rPr>
+              <w:t xml:space="preserve">2</w:t>
+            </w:r>
+          </w:p>
+        </w:tc>
+        <w:tc>
+          <w:tcPr>
+            <w:tcBorders>
+              <w:bottom w:val="single" w:sz="12" w:space="0" w:color="666666"/>
+              <w:top w:val="none" w:sz="0" w:space="0" w:color="000000"/>
+              <w:left w:val="none" w:sz="0" w:space="0" w:color="000000"/>
+              <w:right w:val="none" w:sz="0" w:space="0" w:color="000000"/>
+            </w:tcBorders>
+            <w:shd w:val="clear" w:color="auto" w:fill="FFFFFF"/>
+            <w:tcMar>
+              <w:top w:w="0" w:type="dxa"/>
+              <w:bottom w:w="0" w:type="dxa"/>
+              <w:left w:w="0" w:type="dxa"/>
+              <w:right w:w="0" w:type="dxa"/>
+            </w:tcMar>
+            <w:vAlign w:val="top"/>
+          </w:tcPr>
+          <w:p>
+            <w:pPr>
+              <w:pStyle w:val="Normal"/>
+              <w:jc w:val="left"/>
+              <w:pBdr>
+                <w:bottom w:val="none" w:sz="0" w:space="0" w:color="000000"/>
+                <w:top w:val="none" w:sz="0" w:space="0" w:color="000000"/>
+                <w:left w:val="none" w:sz="0" w:space="0" w:color="000000"/>
+                <w:right w:val="none" w:sz="0" w:space="0" w:color="000000"/>
+              </w:pBdr>
+              <w:spacing w:after="100" w:before="100" w:line="240"/>
+              <w:ind w:left="100" w:right="100" w:firstLine="0" w:firstLineChars="0"/>
+              <w:rPr>
+                <w:rFonts w:ascii="Arial" w:hAnsi="Arial" w:eastAsia="Arial" w:cs="Arial"/>
+                <w:i w:val="false"/>
+                <w:b w:val="false"/>
+                <w:u w:val="none"/>
+                <w:strike w:val="false"/>
+                <w:sz w:val="20"/>
+                <w:szCs w:val="20"/>
+                <w:color w:val="000000"/>
+              </w:rPr>
+            </w:pPr>
+            <w:r>
+              <w:rPr>
+                <w:rFonts w:ascii="Arial" w:hAnsi="Arial" w:eastAsia="Arial" w:cs="Arial"/>
+                <w:i w:val="false"/>
+                <w:b w:val="false"/>
+                <w:u w:val="none"/>
+                <w:strike w:val="false"/>
+                <w:sz w:val="20"/>
+                <w:szCs w:val="20"/>
+                <w:color w:val="000000"/>
+              </w:rPr>
+              <w:t xml:space="preserve">37</w:t>
+            </w:r>
+          </w:p>
+        </w:tc>
+        <w:tc>
+          <w:tcPr>
+            <w:tcBorders>
+              <w:bottom w:val="single" w:sz="12" w:space="0" w:color="666666"/>
+              <w:top w:val="none" w:sz="0" w:space="0" w:color="000000"/>
+              <w:left w:val="none" w:sz="0" w:space="0" w:color="000000"/>
+              <w:right w:val="none" w:sz="0" w:space="0" w:color="000000"/>
+            </w:tcBorders>
+            <w:shd w:val="clear" w:color="auto" w:fill="FFFFFF"/>
+            <w:tcMar>
+              <w:top w:w="0" w:type="dxa"/>
+              <w:bottom w:w="0" w:type="dxa"/>
+              <w:left w:w="0" w:type="dxa"/>
+              <w:right w:w="0" w:type="dxa"/>
+            </w:tcMar>
+            <w:vAlign w:val="top"/>
+          </w:tcPr>
+          <w:p>
+            <w:pPr>
+              <w:pStyle w:val="Normal"/>
+              <w:jc w:val="left"/>
+              <w:pBdr>
+                <w:bottom w:val="none" w:sz="0" w:space="0" w:color="000000"/>
+                <w:top w:val="none" w:sz="0" w:space="0" w:color="000000"/>
+                <w:left w:val="none" w:sz="0" w:space="0" w:color="000000"/>
+                <w:right w:val="none" w:sz="0" w:space="0" w:color="000000"/>
+              </w:pBdr>
+              <w:spacing w:after="100" w:before="100" w:line="240"/>
+              <w:ind w:left="100" w:right="100" w:firstLine="0" w:firstLineChars="0"/>
+              <w:rPr>
+                <w:rFonts w:ascii="Arial" w:hAnsi="Arial" w:eastAsia="Arial" w:cs="Arial"/>
+                <w:i w:val="false"/>
+                <w:b w:val="false"/>
+                <w:u w:val="none"/>
+                <w:strike w:val="false"/>
+                <w:sz w:val="20"/>
+                <w:szCs w:val="20"/>
+                <w:color w:val="000000"/>
+              </w:rPr>
+            </w:pPr>
+            <w:r>
+              <w:rPr>
+                <w:rFonts w:ascii="Arial" w:hAnsi="Arial" w:eastAsia="Arial" w:cs="Arial"/>
+                <w:i w:val="false"/>
+                <w:b w:val="false"/>
+                <w:u w:val="none"/>
+                <w:strike w:val="false"/>
+                <w:sz w:val="20"/>
+                <w:szCs w:val="20"/>
+                <w:color w:val="000000"/>
+              </w:rPr>
+              <w:t xml:space="preserve">2/37 (5.4%)</w:t>
+            </w:r>
+          </w:p>
+        </w:tc>
+      </w:tr>
+    </w:tbl>
+    <w:p>
+      <w:pPr>
+        <w:pStyle w:val="Normal"/>
+      </w:pPr>
+      <w:r>
+        <w:t xml:space="preserve"/>
+      </w:r>
+    </w:p>
+    <w:p>
+      <w:pPr>
+        <w:pStyle w:val="TableCaption"/>
+        <w:jc w:val="center"/>
+        <w:keepNext/>
+        <w:pBdr>
+          <w:bottom w:val="none" w:sz="0" w:space="0" w:color="000000"/>
+          <w:top w:val="none" w:sz="0" w:space="0" w:color="000000"/>
+          <w:left w:val="none" w:sz="0" w:space="0" w:color="000000"/>
+          <w:right w:val="none" w:sz="0" w:space="0" w:color="000000"/>
+        </w:pBdr>
+        <w:spacing w:after="60" w:before="60" w:line="240"/>
+        <w:ind w:left="60" w:right="60" w:firstLine="0" w:firstLineChars="0"/>
+      </w:pPr>
+      <w:r>
         <w:t xml:space="preserve">Coding reliability indicators</w:t>
       </w:r>
     </w:p>
@@ -29238,6 +29953,1388 @@
                 <w:color w:val="000000"/>
               </w:rPr>
               <w:t xml:space="preserve">13.5%</w:t>
+            </w:r>
+          </w:p>
+        </w:tc>
+      </w:tr>
+    </w:tbl>
+    <w:p>
+      <w:pPr>
+        <w:pStyle w:val="Normal"/>
+      </w:pPr>
+      <w:r>
+        <w:t xml:space="preserve"/>
+      </w:r>
+    </w:p>
+    <w:p>
+      <w:pPr>
+        <w:pStyle w:val="TableCaption"/>
+        <w:jc w:val="center"/>
+        <w:keepNext/>
+        <w:pBdr>
+          <w:bottom w:val="none" w:sz="0" w:space="0" w:color="000000"/>
+          <w:top w:val="none" w:sz="0" w:space="0" w:color="000000"/>
+          <w:left w:val="none" w:sz="0" w:space="0" w:color="000000"/>
+          <w:right w:val="none" w:sz="0" w:space="0" w:color="000000"/>
+        </w:pBdr>
+        <w:spacing w:after="60" w:before="60" w:line="240"/>
+        <w:ind w:left="60" w:right="60" w:firstLine="0" w:firstLineChars="0"/>
+      </w:pPr>
+      <w:r>
+        <w:t xml:space="preserve">Summary of Overlap Values</w:t>
+      </w:r>
+    </w:p>
+    <w:tbl xmlns:a="http://schemas.openxmlformats.org/drawingml/2006/main" xmlns:pic="http://schemas.openxmlformats.org/drawingml/2006/picture">
+      <w:tblPr>
+        <w:tblLayout w:type="fixed"/>
+        <w:jc w:val="center"/>
+        <w:tblLook w:firstRow="1" w:lastRow="0" w:firstColumn="0" w:lastColumn="0" w:noHBand="0" w:noVBand="1"/>
+      </w:tblPr>
+      <w:tblGrid>
+        <w:gridCol w:w="2147"/>
+        <w:gridCol w:w="655"/>
+        <w:gridCol w:w="961"/>
+        <w:gridCol w:w="1132"/>
+        <w:gridCol w:w="839"/>
+        <w:gridCol w:w="839"/>
+      </w:tblGrid>
+      <w:tr>
+        <w:trPr>
+          <w:trHeight w:val="571" w:hRule="auto"/>
+          <w:tblHeader/>
+        </w:trPr>
+        <w:tc>
+          <w:tcPr>
+            <w:tcBorders>
+              <w:bottom w:val="single" w:sz="12" w:space="0" w:color="666666"/>
+              <w:top w:val="single" w:sz="12" w:space="0" w:color="666666"/>
+              <w:left w:val="none" w:sz="0" w:space="0" w:color="000000"/>
+              <w:right w:val="none" w:sz="0" w:space="0" w:color="000000"/>
+            </w:tcBorders>
+            <w:shd w:val="clear" w:color="auto" w:fill="FFFFFF"/>
+            <w:tcMar>
+              <w:top w:w="0" w:type="dxa"/>
+              <w:bottom w:w="0" w:type="dxa"/>
+              <w:left w:w="0" w:type="dxa"/>
+              <w:right w:w="0" w:type="dxa"/>
+            </w:tcMar>
+            <w:vAlign w:val="top"/>
+          </w:tcPr>
+          <w:p>
+            <w:pPr>
+              <w:pStyle w:val="Normal"/>
+              <w:jc w:val="left"/>
+              <w:pBdr>
+                <w:bottom w:val="none" w:sz="0" w:space="0" w:color="000000"/>
+                <w:top w:val="none" w:sz="0" w:space="0" w:color="000000"/>
+                <w:left w:val="none" w:sz="0" w:space="0" w:color="000000"/>
+                <w:right w:val="none" w:sz="0" w:space="0" w:color="000000"/>
+              </w:pBdr>
+              <w:spacing w:after="100" w:before="100" w:line="240"/>
+              <w:ind w:left="100" w:right="100" w:firstLine="0" w:firstLineChars="0"/>
+              <w:rPr>
+                <w:rFonts w:ascii="Arial" w:hAnsi="Arial" w:eastAsia="Arial" w:cs="Arial"/>
+                <w:i w:val="false"/>
+                <w:b w:val="false"/>
+                <w:u w:val="none"/>
+                <w:strike w:val="false"/>
+                <w:sz w:val="20"/>
+                <w:szCs w:val="20"/>
+                <w:color w:val="000000"/>
+              </w:rPr>
+            </w:pPr>
+            <w:r>
+              <w:rPr>
+                <w:rFonts w:ascii="Arial" w:hAnsi="Arial" w:eastAsia="Arial" w:cs="Arial"/>
+                <w:i w:val="false"/>
+                <w:b w:val="false"/>
+                <w:u w:val="none"/>
+                <w:strike w:val="false"/>
+                <w:sz w:val="20"/>
+                <w:szCs w:val="20"/>
+                <w:color w:val="000000"/>
+              </w:rPr>
+              <w:t xml:space="preserve">metric</w:t>
+            </w:r>
+          </w:p>
+        </w:tc>
+        <w:tc>
+          <w:tcPr>
+            <w:tcBorders>
+              <w:bottom w:val="single" w:sz="12" w:space="0" w:color="666666"/>
+              <w:top w:val="single" w:sz="12" w:space="0" w:color="666666"/>
+              <w:left w:val="none" w:sz="0" w:space="0" w:color="000000"/>
+              <w:right w:val="none" w:sz="0" w:space="0" w:color="000000"/>
+            </w:tcBorders>
+            <w:shd w:val="clear" w:color="auto" w:fill="FFFFFF"/>
+            <w:tcMar>
+              <w:top w:w="0" w:type="dxa"/>
+              <w:bottom w:w="0" w:type="dxa"/>
+              <w:left w:w="0" w:type="dxa"/>
+              <w:right w:w="0" w:type="dxa"/>
+            </w:tcMar>
+            <w:vAlign w:val="top"/>
+          </w:tcPr>
+          <w:p>
+            <w:pPr>
+              <w:pStyle w:val="Normal"/>
+              <w:jc w:val="left"/>
+              <w:pBdr>
+                <w:bottom w:val="none" w:sz="0" w:space="0" w:color="000000"/>
+                <w:top w:val="none" w:sz="0" w:space="0" w:color="000000"/>
+                <w:left w:val="none" w:sz="0" w:space="0" w:color="000000"/>
+                <w:right w:val="none" w:sz="0" w:space="0" w:color="000000"/>
+              </w:pBdr>
+              <w:spacing w:after="100" w:before="100" w:line="240"/>
+              <w:ind w:left="100" w:right="100" w:firstLine="0" w:firstLineChars="0"/>
+              <w:rPr>
+                <w:rFonts w:ascii="Arial" w:hAnsi="Arial" w:eastAsia="Arial" w:cs="Arial"/>
+                <w:i w:val="false"/>
+                <w:b w:val="false"/>
+                <w:u w:val="none"/>
+                <w:strike w:val="false"/>
+                <w:sz w:val="20"/>
+                <w:szCs w:val="20"/>
+                <w:color w:val="000000"/>
+              </w:rPr>
+            </w:pPr>
+            <w:r>
+              <w:rPr>
+                <w:rFonts w:ascii="Arial" w:hAnsi="Arial" w:eastAsia="Arial" w:cs="Arial"/>
+                <w:i w:val="false"/>
+                <w:b w:val="false"/>
+                <w:u w:val="none"/>
+                <w:strike w:val="false"/>
+                <w:sz w:val="20"/>
+                <w:szCs w:val="20"/>
+                <w:color w:val="000000"/>
+              </w:rPr>
+              <w:t xml:space="preserve">n</w:t>
+            </w:r>
+          </w:p>
+        </w:tc>
+        <w:tc>
+          <w:tcPr>
+            <w:tcBorders>
+              <w:bottom w:val="single" w:sz="12" w:space="0" w:color="666666"/>
+              <w:top w:val="single" w:sz="12" w:space="0" w:color="666666"/>
+              <w:left w:val="none" w:sz="0" w:space="0" w:color="000000"/>
+              <w:right w:val="none" w:sz="0" w:space="0" w:color="000000"/>
+            </w:tcBorders>
+            <w:shd w:val="clear" w:color="auto" w:fill="FFFFFF"/>
+            <w:tcMar>
+              <w:top w:w="0" w:type="dxa"/>
+              <w:bottom w:w="0" w:type="dxa"/>
+              <w:left w:w="0" w:type="dxa"/>
+              <w:right w:w="0" w:type="dxa"/>
+            </w:tcMar>
+            <w:vAlign w:val="top"/>
+          </w:tcPr>
+          <w:p>
+            <w:pPr>
+              <w:pStyle w:val="Normal"/>
+              <w:jc w:val="left"/>
+              <w:pBdr>
+                <w:bottom w:val="none" w:sz="0" w:space="0" w:color="000000"/>
+                <w:top w:val="none" w:sz="0" w:space="0" w:color="000000"/>
+                <w:left w:val="none" w:sz="0" w:space="0" w:color="000000"/>
+                <w:right w:val="none" w:sz="0" w:space="0" w:color="000000"/>
+              </w:pBdr>
+              <w:spacing w:after="100" w:before="100" w:line="240"/>
+              <w:ind w:left="100" w:right="100" w:firstLine="0" w:firstLineChars="0"/>
+              <w:rPr>
+                <w:rFonts w:ascii="Arial" w:hAnsi="Arial" w:eastAsia="Arial" w:cs="Arial"/>
+                <w:i w:val="false"/>
+                <w:b w:val="false"/>
+                <w:u w:val="none"/>
+                <w:strike w:val="false"/>
+                <w:sz w:val="20"/>
+                <w:szCs w:val="20"/>
+                <w:color w:val="000000"/>
+              </w:rPr>
+            </w:pPr>
+            <w:r>
+              <w:rPr>
+                <w:rFonts w:ascii="Arial" w:hAnsi="Arial" w:eastAsia="Arial" w:cs="Arial"/>
+                <w:i w:val="false"/>
+                <w:b w:val="false"/>
+                <w:u w:val="none"/>
+                <w:strike w:val="false"/>
+                <w:sz w:val="20"/>
+                <w:szCs w:val="20"/>
+                <w:color w:val="000000"/>
+              </w:rPr>
+              <w:t xml:space="preserve">mean</w:t>
+            </w:r>
+          </w:p>
+        </w:tc>
+        <w:tc>
+          <w:tcPr>
+            <w:tcBorders>
+              <w:bottom w:val="single" w:sz="12" w:space="0" w:color="666666"/>
+              <w:top w:val="single" w:sz="12" w:space="0" w:color="666666"/>
+              <w:left w:val="none" w:sz="0" w:space="0" w:color="000000"/>
+              <w:right w:val="none" w:sz="0" w:space="0" w:color="000000"/>
+            </w:tcBorders>
+            <w:shd w:val="clear" w:color="auto" w:fill="FFFFFF"/>
+            <w:tcMar>
+              <w:top w:w="0" w:type="dxa"/>
+              <w:bottom w:w="0" w:type="dxa"/>
+              <w:left w:w="0" w:type="dxa"/>
+              <w:right w:w="0" w:type="dxa"/>
+            </w:tcMar>
+            <w:vAlign w:val="top"/>
+          </w:tcPr>
+          <w:p>
+            <w:pPr>
+              <w:pStyle w:val="Normal"/>
+              <w:jc w:val="left"/>
+              <w:pBdr>
+                <w:bottom w:val="none" w:sz="0" w:space="0" w:color="000000"/>
+                <w:top w:val="none" w:sz="0" w:space="0" w:color="000000"/>
+                <w:left w:val="none" w:sz="0" w:space="0" w:color="000000"/>
+                <w:right w:val="none" w:sz="0" w:space="0" w:color="000000"/>
+              </w:pBdr>
+              <w:spacing w:after="100" w:before="100" w:line="240"/>
+              <w:ind w:left="100" w:right="100" w:firstLine="0" w:firstLineChars="0"/>
+              <w:rPr>
+                <w:rFonts w:ascii="Arial" w:hAnsi="Arial" w:eastAsia="Arial" w:cs="Arial"/>
+                <w:i w:val="false"/>
+                <w:b w:val="false"/>
+                <w:u w:val="none"/>
+                <w:strike w:val="false"/>
+                <w:sz w:val="20"/>
+                <w:szCs w:val="20"/>
+                <w:color w:val="000000"/>
+              </w:rPr>
+            </w:pPr>
+            <w:r>
+              <w:rPr>
+                <w:rFonts w:ascii="Arial" w:hAnsi="Arial" w:eastAsia="Arial" w:cs="Arial"/>
+                <w:i w:val="false"/>
+                <w:b w:val="false"/>
+                <w:u w:val="none"/>
+                <w:strike w:val="false"/>
+                <w:sz w:val="20"/>
+                <w:szCs w:val="20"/>
+                <w:color w:val="000000"/>
+              </w:rPr>
+              <w:t xml:space="preserve">median</w:t>
+            </w:r>
+          </w:p>
+        </w:tc>
+        <w:tc>
+          <w:tcPr>
+            <w:tcBorders>
+              <w:bottom w:val="single" w:sz="12" w:space="0" w:color="666666"/>
+              <w:top w:val="single" w:sz="12" w:space="0" w:color="666666"/>
+              <w:left w:val="none" w:sz="0" w:space="0" w:color="000000"/>
+              <w:right w:val="none" w:sz="0" w:space="0" w:color="000000"/>
+            </w:tcBorders>
+            <w:shd w:val="clear" w:color="auto" w:fill="FFFFFF"/>
+            <w:tcMar>
+              <w:top w:w="0" w:type="dxa"/>
+              <w:bottom w:w="0" w:type="dxa"/>
+              <w:left w:w="0" w:type="dxa"/>
+              <w:right w:w="0" w:type="dxa"/>
+            </w:tcMar>
+            <w:vAlign w:val="top"/>
+          </w:tcPr>
+          <w:p>
+            <w:pPr>
+              <w:pStyle w:val="Normal"/>
+              <w:jc w:val="left"/>
+              <w:pBdr>
+                <w:bottom w:val="none" w:sz="0" w:space="0" w:color="000000"/>
+                <w:top w:val="none" w:sz="0" w:space="0" w:color="000000"/>
+                <w:left w:val="none" w:sz="0" w:space="0" w:color="000000"/>
+                <w:right w:val="none" w:sz="0" w:space="0" w:color="000000"/>
+              </w:pBdr>
+              <w:spacing w:after="100" w:before="100" w:line="240"/>
+              <w:ind w:left="100" w:right="100" w:firstLine="0" w:firstLineChars="0"/>
+              <w:rPr>
+                <w:rFonts w:ascii="Arial" w:hAnsi="Arial" w:eastAsia="Arial" w:cs="Arial"/>
+                <w:i w:val="false"/>
+                <w:b w:val="false"/>
+                <w:u w:val="none"/>
+                <w:strike w:val="false"/>
+                <w:sz w:val="20"/>
+                <w:szCs w:val="20"/>
+                <w:color w:val="000000"/>
+              </w:rPr>
+            </w:pPr>
+            <w:r>
+              <w:rPr>
+                <w:rFonts w:ascii="Arial" w:hAnsi="Arial" w:eastAsia="Arial" w:cs="Arial"/>
+                <w:i w:val="false"/>
+                <w:b w:val="false"/>
+                <w:u w:val="none"/>
+                <w:strike w:val="false"/>
+                <w:sz w:val="20"/>
+                <w:szCs w:val="20"/>
+                <w:color w:val="000000"/>
+              </w:rPr>
+              <w:t xml:space="preserve">min</w:t>
+            </w:r>
+          </w:p>
+        </w:tc>
+        <w:tc>
+          <w:tcPr>
+            <w:tcBorders>
+              <w:bottom w:val="single" w:sz="12" w:space="0" w:color="666666"/>
+              <w:top w:val="single" w:sz="12" w:space="0" w:color="666666"/>
+              <w:left w:val="none" w:sz="0" w:space="0" w:color="000000"/>
+              <w:right w:val="none" w:sz="0" w:space="0" w:color="000000"/>
+            </w:tcBorders>
+            <w:shd w:val="clear" w:color="auto" w:fill="FFFFFF"/>
+            <w:tcMar>
+              <w:top w:w="0" w:type="dxa"/>
+              <w:bottom w:w="0" w:type="dxa"/>
+              <w:left w:w="0" w:type="dxa"/>
+              <w:right w:w="0" w:type="dxa"/>
+            </w:tcMar>
+            <w:vAlign w:val="top"/>
+          </w:tcPr>
+          <w:p>
+            <w:pPr>
+              <w:pStyle w:val="Normal"/>
+              <w:jc w:val="left"/>
+              <w:pBdr>
+                <w:bottom w:val="none" w:sz="0" w:space="0" w:color="000000"/>
+                <w:top w:val="none" w:sz="0" w:space="0" w:color="000000"/>
+                <w:left w:val="none" w:sz="0" w:space="0" w:color="000000"/>
+                <w:right w:val="none" w:sz="0" w:space="0" w:color="000000"/>
+              </w:pBdr>
+              <w:spacing w:after="100" w:before="100" w:line="240"/>
+              <w:ind w:left="100" w:right="100" w:firstLine="0" w:firstLineChars="0"/>
+              <w:rPr>
+                <w:rFonts w:ascii="Arial" w:hAnsi="Arial" w:eastAsia="Arial" w:cs="Arial"/>
+                <w:i w:val="false"/>
+                <w:b w:val="false"/>
+                <w:u w:val="none"/>
+                <w:strike w:val="false"/>
+                <w:sz w:val="20"/>
+                <w:szCs w:val="20"/>
+                <w:color w:val="000000"/>
+              </w:rPr>
+            </w:pPr>
+            <w:r>
+              <w:rPr>
+                <w:rFonts w:ascii="Arial" w:hAnsi="Arial" w:eastAsia="Arial" w:cs="Arial"/>
+                <w:i w:val="false"/>
+                <w:b w:val="false"/>
+                <w:u w:val="none"/>
+                <w:strike w:val="false"/>
+                <w:sz w:val="20"/>
+                <w:szCs w:val="20"/>
+                <w:color w:val="000000"/>
+              </w:rPr>
+              <w:t xml:space="preserve">max</w:t>
+            </w:r>
+          </w:p>
+        </w:tc>
+      </w:tr>
+      <w:tr>
+        <w:trPr>
+          <w:trHeight w:val="612" w:hRule="auto"/>
+        </w:trPr>
+        <w:tc>
+          <w:tcPr>
+            <w:tcBorders>
+              <w:bottom w:val="none" w:sz="0" w:space="0" w:color="000000"/>
+              <w:top w:val="single" w:sz="12" w:space="0" w:color="666666"/>
+              <w:left w:val="none" w:sz="0" w:space="0" w:color="000000"/>
+              <w:right w:val="none" w:sz="0" w:space="0" w:color="000000"/>
+            </w:tcBorders>
+            <w:shd w:val="clear" w:color="auto" w:fill="FFFFFF"/>
+            <w:tcMar>
+              <w:top w:w="0" w:type="dxa"/>
+              <w:bottom w:w="0" w:type="dxa"/>
+              <w:left w:w="0" w:type="dxa"/>
+              <w:right w:w="0" w:type="dxa"/>
+            </w:tcMar>
+            <w:vAlign w:val="top"/>
+          </w:tcPr>
+          <w:p>
+            <w:pPr>
+              <w:pStyle w:val="Normal"/>
+              <w:jc w:val="left"/>
+              <w:pBdr>
+                <w:bottom w:val="none" w:sz="0" w:space="0" w:color="000000"/>
+                <w:top w:val="none" w:sz="0" w:space="0" w:color="000000"/>
+                <w:left w:val="none" w:sz="0" w:space="0" w:color="000000"/>
+                <w:right w:val="none" w:sz="0" w:space="0" w:color="000000"/>
+              </w:pBdr>
+              <w:spacing w:after="100" w:before="100" w:line="240"/>
+              <w:ind w:left="100" w:right="100" w:firstLine="0" w:firstLineChars="0"/>
+              <w:rPr>
+                <w:rFonts w:ascii="Arial" w:hAnsi="Arial" w:eastAsia="Arial" w:cs="Arial"/>
+                <w:i w:val="false"/>
+                <w:b w:val="false"/>
+                <w:u w:val="none"/>
+                <w:strike w:val="false"/>
+                <w:sz w:val="20"/>
+                <w:szCs w:val="20"/>
+                <w:color w:val="000000"/>
+              </w:rPr>
+            </w:pPr>
+            <w:r>
+              <w:rPr>
+                <w:rFonts w:ascii="Arial" w:hAnsi="Arial" w:eastAsia="Arial" w:cs="Arial"/>
+                <w:i w:val="false"/>
+                <w:b w:val="false"/>
+                <w:u w:val="none"/>
+                <w:strike w:val="false"/>
+                <w:sz w:val="20"/>
+                <w:szCs w:val="20"/>
+                <w:color w:val="000000"/>
+              </w:rPr>
+              <w:t xml:space="preserve">Mean overlap</w:t>
+            </w:r>
+          </w:p>
+        </w:tc>
+        <w:tc>
+          <w:tcPr>
+            <w:tcBorders>
+              <w:bottom w:val="none" w:sz="0" w:space="0" w:color="000000"/>
+              <w:top w:val="single" w:sz="12" w:space="0" w:color="666666"/>
+              <w:left w:val="none" w:sz="0" w:space="0" w:color="000000"/>
+              <w:right w:val="none" w:sz="0" w:space="0" w:color="000000"/>
+            </w:tcBorders>
+            <w:shd w:val="clear" w:color="auto" w:fill="FFFFFF"/>
+            <w:tcMar>
+              <w:top w:w="0" w:type="dxa"/>
+              <w:bottom w:w="0" w:type="dxa"/>
+              <w:left w:w="0" w:type="dxa"/>
+              <w:right w:w="0" w:type="dxa"/>
+            </w:tcMar>
+            <w:vAlign w:val="top"/>
+          </w:tcPr>
+          <w:p>
+            <w:pPr>
+              <w:pStyle w:val="Normal"/>
+              <w:jc w:val="left"/>
+              <w:pBdr>
+                <w:bottom w:val="none" w:sz="0" w:space="0" w:color="000000"/>
+                <w:top w:val="none" w:sz="0" w:space="0" w:color="000000"/>
+                <w:left w:val="none" w:sz="0" w:space="0" w:color="000000"/>
+                <w:right w:val="none" w:sz="0" w:space="0" w:color="000000"/>
+              </w:pBdr>
+              <w:spacing w:after="100" w:before="100" w:line="240"/>
+              <w:ind w:left="100" w:right="100" w:firstLine="0" w:firstLineChars="0"/>
+              <w:rPr>
+                <w:rFonts w:ascii="Arial" w:hAnsi="Arial" w:eastAsia="Arial" w:cs="Arial"/>
+                <w:i w:val="false"/>
+                <w:b w:val="false"/>
+                <w:u w:val="none"/>
+                <w:strike w:val="false"/>
+                <w:sz w:val="20"/>
+                <w:szCs w:val="20"/>
+                <w:color w:val="000000"/>
+              </w:rPr>
+            </w:pPr>
+            <w:r>
+              <w:rPr>
+                <w:rFonts w:ascii="Arial" w:hAnsi="Arial" w:eastAsia="Arial" w:cs="Arial"/>
+                <w:i w:val="false"/>
+                <w:b w:val="false"/>
+                <w:u w:val="none"/>
+                <w:strike w:val="false"/>
+                <w:sz w:val="20"/>
+                <w:szCs w:val="20"/>
+                <w:color w:val="000000"/>
+              </w:rPr>
+              <w:t xml:space="preserve">26</w:t>
+            </w:r>
+          </w:p>
+        </w:tc>
+        <w:tc>
+          <w:tcPr>
+            <w:tcBorders>
+              <w:bottom w:val="none" w:sz="0" w:space="0" w:color="000000"/>
+              <w:top w:val="single" w:sz="12" w:space="0" w:color="666666"/>
+              <w:left w:val="none" w:sz="0" w:space="0" w:color="000000"/>
+              <w:right w:val="none" w:sz="0" w:space="0" w:color="000000"/>
+            </w:tcBorders>
+            <w:shd w:val="clear" w:color="auto" w:fill="FFFFFF"/>
+            <w:tcMar>
+              <w:top w:w="0" w:type="dxa"/>
+              <w:bottom w:w="0" w:type="dxa"/>
+              <w:left w:w="0" w:type="dxa"/>
+              <w:right w:w="0" w:type="dxa"/>
+            </w:tcMar>
+            <w:vAlign w:val="top"/>
+          </w:tcPr>
+          <w:p>
+            <w:pPr>
+              <w:pStyle w:val="Normal"/>
+              <w:jc w:val="left"/>
+              <w:pBdr>
+                <w:bottom w:val="none" w:sz="0" w:space="0" w:color="000000"/>
+                <w:top w:val="none" w:sz="0" w:space="0" w:color="000000"/>
+                <w:left w:val="none" w:sz="0" w:space="0" w:color="000000"/>
+                <w:right w:val="none" w:sz="0" w:space="0" w:color="000000"/>
+              </w:pBdr>
+              <w:spacing w:after="100" w:before="100" w:line="240"/>
+              <w:ind w:left="100" w:right="100" w:firstLine="0" w:firstLineChars="0"/>
+              <w:rPr>
+                <w:rFonts w:ascii="Arial" w:hAnsi="Arial" w:eastAsia="Arial" w:cs="Arial"/>
+                <w:i w:val="false"/>
+                <w:b w:val="false"/>
+                <w:u w:val="none"/>
+                <w:strike w:val="false"/>
+                <w:sz w:val="20"/>
+                <w:szCs w:val="20"/>
+                <w:color w:val="000000"/>
+              </w:rPr>
+            </w:pPr>
+            <w:r>
+              <w:rPr>
+                <w:rFonts w:ascii="Arial" w:hAnsi="Arial" w:eastAsia="Arial" w:cs="Arial"/>
+                <w:i w:val="false"/>
+                <w:b w:val="false"/>
+                <w:u w:val="none"/>
+                <w:strike w:val="false"/>
+                <w:sz w:val="20"/>
+                <w:szCs w:val="20"/>
+                <w:color w:val="000000"/>
+              </w:rPr>
+              <w:t xml:space="preserve">0.27</w:t>
+            </w:r>
+          </w:p>
+        </w:tc>
+        <w:tc>
+          <w:tcPr>
+            <w:tcBorders>
+              <w:bottom w:val="none" w:sz="0" w:space="0" w:color="000000"/>
+              <w:top w:val="single" w:sz="12" w:space="0" w:color="666666"/>
+              <w:left w:val="none" w:sz="0" w:space="0" w:color="000000"/>
+              <w:right w:val="none" w:sz="0" w:space="0" w:color="000000"/>
+            </w:tcBorders>
+            <w:shd w:val="clear" w:color="auto" w:fill="FFFFFF"/>
+            <w:tcMar>
+              <w:top w:w="0" w:type="dxa"/>
+              <w:bottom w:w="0" w:type="dxa"/>
+              <w:left w:w="0" w:type="dxa"/>
+              <w:right w:w="0" w:type="dxa"/>
+            </w:tcMar>
+            <w:vAlign w:val="top"/>
+          </w:tcPr>
+          <w:p>
+            <w:pPr>
+              <w:pStyle w:val="Normal"/>
+              <w:jc w:val="left"/>
+              <w:pBdr>
+                <w:bottom w:val="none" w:sz="0" w:space="0" w:color="000000"/>
+                <w:top w:val="none" w:sz="0" w:space="0" w:color="000000"/>
+                <w:left w:val="none" w:sz="0" w:space="0" w:color="000000"/>
+                <w:right w:val="none" w:sz="0" w:space="0" w:color="000000"/>
+              </w:pBdr>
+              <w:spacing w:after="100" w:before="100" w:line="240"/>
+              <w:ind w:left="100" w:right="100" w:firstLine="0" w:firstLineChars="0"/>
+              <w:rPr>
+                <w:rFonts w:ascii="Arial" w:hAnsi="Arial" w:eastAsia="Arial" w:cs="Arial"/>
+                <w:i w:val="false"/>
+                <w:b w:val="false"/>
+                <w:u w:val="none"/>
+                <w:strike w:val="false"/>
+                <w:sz w:val="20"/>
+                <w:szCs w:val="20"/>
+                <w:color w:val="000000"/>
+              </w:rPr>
+            </w:pPr>
+            <w:r>
+              <w:rPr>
+                <w:rFonts w:ascii="Arial" w:hAnsi="Arial" w:eastAsia="Arial" w:cs="Arial"/>
+                <w:i w:val="false"/>
+                <w:b w:val="false"/>
+                <w:u w:val="none"/>
+                <w:strike w:val="false"/>
+                <w:sz w:val="20"/>
+                <w:szCs w:val="20"/>
+                <w:color w:val="000000"/>
+              </w:rPr>
+              <w:t xml:space="preserve">0.26</w:t>
+            </w:r>
+          </w:p>
+        </w:tc>
+        <w:tc>
+          <w:tcPr>
+            <w:tcBorders>
+              <w:bottom w:val="none" w:sz="0" w:space="0" w:color="000000"/>
+              <w:top w:val="single" w:sz="12" w:space="0" w:color="666666"/>
+              <w:left w:val="none" w:sz="0" w:space="0" w:color="000000"/>
+              <w:right w:val="none" w:sz="0" w:space="0" w:color="000000"/>
+            </w:tcBorders>
+            <w:shd w:val="clear" w:color="auto" w:fill="FFFFFF"/>
+            <w:tcMar>
+              <w:top w:w="0" w:type="dxa"/>
+              <w:bottom w:w="0" w:type="dxa"/>
+              <w:left w:w="0" w:type="dxa"/>
+              <w:right w:w="0" w:type="dxa"/>
+            </w:tcMar>
+            <w:vAlign w:val="top"/>
+          </w:tcPr>
+          <w:p>
+            <w:pPr>
+              <w:pStyle w:val="Normal"/>
+              <w:jc w:val="left"/>
+              <w:pBdr>
+                <w:bottom w:val="none" w:sz="0" w:space="0" w:color="000000"/>
+                <w:top w:val="none" w:sz="0" w:space="0" w:color="000000"/>
+                <w:left w:val="none" w:sz="0" w:space="0" w:color="000000"/>
+                <w:right w:val="none" w:sz="0" w:space="0" w:color="000000"/>
+              </w:pBdr>
+              <w:spacing w:after="100" w:before="100" w:line="240"/>
+              <w:ind w:left="100" w:right="100" w:firstLine="0" w:firstLineChars="0"/>
+              <w:rPr>
+                <w:rFonts w:ascii="Arial" w:hAnsi="Arial" w:eastAsia="Arial" w:cs="Arial"/>
+                <w:i w:val="false"/>
+                <w:b w:val="false"/>
+                <w:u w:val="none"/>
+                <w:strike w:val="false"/>
+                <w:sz w:val="20"/>
+                <w:szCs w:val="20"/>
+                <w:color w:val="000000"/>
+              </w:rPr>
+            </w:pPr>
+            <w:r>
+              <w:rPr>
+                <w:rFonts w:ascii="Arial" w:hAnsi="Arial" w:eastAsia="Arial" w:cs="Arial"/>
+                <w:i w:val="false"/>
+                <w:b w:val="false"/>
+                <w:u w:val="none"/>
+                <w:strike w:val="false"/>
+                <w:sz w:val="20"/>
+                <w:szCs w:val="20"/>
+                <w:color w:val="000000"/>
+              </w:rPr>
+              <w:t xml:space="preserve">0.07</w:t>
+            </w:r>
+          </w:p>
+        </w:tc>
+        <w:tc>
+          <w:tcPr>
+            <w:tcBorders>
+              <w:bottom w:val="none" w:sz="0" w:space="0" w:color="000000"/>
+              <w:top w:val="single" w:sz="12" w:space="0" w:color="666666"/>
+              <w:left w:val="none" w:sz="0" w:space="0" w:color="000000"/>
+              <w:right w:val="none" w:sz="0" w:space="0" w:color="000000"/>
+            </w:tcBorders>
+            <w:shd w:val="clear" w:color="auto" w:fill="FFFFFF"/>
+            <w:tcMar>
+              <w:top w:w="0" w:type="dxa"/>
+              <w:bottom w:w="0" w:type="dxa"/>
+              <w:left w:w="0" w:type="dxa"/>
+              <w:right w:w="0" w:type="dxa"/>
+            </w:tcMar>
+            <w:vAlign w:val="top"/>
+          </w:tcPr>
+          <w:p>
+            <w:pPr>
+              <w:pStyle w:val="Normal"/>
+              <w:jc w:val="left"/>
+              <w:pBdr>
+                <w:bottom w:val="none" w:sz="0" w:space="0" w:color="000000"/>
+                <w:top w:val="none" w:sz="0" w:space="0" w:color="000000"/>
+                <w:left w:val="none" w:sz="0" w:space="0" w:color="000000"/>
+                <w:right w:val="none" w:sz="0" w:space="0" w:color="000000"/>
+              </w:pBdr>
+              <w:spacing w:after="100" w:before="100" w:line="240"/>
+              <w:ind w:left="100" w:right="100" w:firstLine="0" w:firstLineChars="0"/>
+              <w:rPr>
+                <w:rFonts w:ascii="Arial" w:hAnsi="Arial" w:eastAsia="Arial" w:cs="Arial"/>
+                <w:i w:val="false"/>
+                <w:b w:val="false"/>
+                <w:u w:val="none"/>
+                <w:strike w:val="false"/>
+                <w:sz w:val="20"/>
+                <w:szCs w:val="20"/>
+                <w:color w:val="000000"/>
+              </w:rPr>
+            </w:pPr>
+            <w:r>
+              <w:rPr>
+                <w:rFonts w:ascii="Arial" w:hAnsi="Arial" w:eastAsia="Arial" w:cs="Arial"/>
+                <w:i w:val="false"/>
+                <w:b w:val="false"/>
+                <w:u w:val="none"/>
+                <w:strike w:val="false"/>
+                <w:sz w:val="20"/>
+                <w:szCs w:val="20"/>
+                <w:color w:val="000000"/>
+              </w:rPr>
+              <w:t xml:space="preserve">0.44</w:t>
+            </w:r>
+          </w:p>
+        </w:tc>
+      </w:tr>
+      <w:tr>
+        <w:trPr>
+          <w:trHeight w:val="612" w:hRule="auto"/>
+        </w:trPr>
+        <w:tc>
+          <w:tcPr>
+            <w:tcBorders>
+              <w:bottom w:val="none" w:sz="0" w:space="0" w:color="000000"/>
+              <w:top w:val="none" w:sz="0" w:space="0" w:color="000000"/>
+              <w:left w:val="none" w:sz="0" w:space="0" w:color="000000"/>
+              <w:right w:val="none" w:sz="0" w:space="0" w:color="000000"/>
+            </w:tcBorders>
+            <w:shd w:val="clear" w:color="auto" w:fill="FFFFFF"/>
+            <w:tcMar>
+              <w:top w:w="0" w:type="dxa"/>
+              <w:bottom w:w="0" w:type="dxa"/>
+              <w:left w:w="0" w:type="dxa"/>
+              <w:right w:w="0" w:type="dxa"/>
+            </w:tcMar>
+            <w:vAlign w:val="top"/>
+          </w:tcPr>
+          <w:p>
+            <w:pPr>
+              <w:pStyle w:val="Normal"/>
+              <w:jc w:val="left"/>
+              <w:pBdr>
+                <w:bottom w:val="none" w:sz="0" w:space="0" w:color="000000"/>
+                <w:top w:val="none" w:sz="0" w:space="0" w:color="000000"/>
+                <w:left w:val="none" w:sz="0" w:space="0" w:color="000000"/>
+                <w:right w:val="none" w:sz="0" w:space="0" w:color="000000"/>
+              </w:pBdr>
+              <w:spacing w:after="100" w:before="100" w:line="240"/>
+              <w:ind w:left="100" w:right="100" w:firstLine="0" w:firstLineChars="0"/>
+              <w:rPr>
+                <w:rFonts w:ascii="Arial" w:hAnsi="Arial" w:eastAsia="Arial" w:cs="Arial"/>
+                <w:i w:val="false"/>
+                <w:b w:val="false"/>
+                <w:u w:val="none"/>
+                <w:strike w:val="false"/>
+                <w:sz w:val="20"/>
+                <w:szCs w:val="20"/>
+                <w:color w:val="000000"/>
+              </w:rPr>
+            </w:pPr>
+            <w:r>
+              <w:rPr>
+                <w:rFonts w:ascii="Arial" w:hAnsi="Arial" w:eastAsia="Arial" w:cs="Arial"/>
+                <w:i w:val="false"/>
+                <w:b w:val="false"/>
+                <w:u w:val="none"/>
+                <w:strike w:val="false"/>
+                <w:sz w:val="20"/>
+                <w:szCs w:val="20"/>
+                <w:color w:val="000000"/>
+              </w:rPr>
+              <w:t xml:space="preserve">Minimum overlap</w:t>
+            </w:r>
+          </w:p>
+        </w:tc>
+        <w:tc>
+          <w:tcPr>
+            <w:tcBorders>
+              <w:bottom w:val="none" w:sz="0" w:space="0" w:color="000000"/>
+              <w:top w:val="none" w:sz="0" w:space="0" w:color="000000"/>
+              <w:left w:val="none" w:sz="0" w:space="0" w:color="000000"/>
+              <w:right w:val="none" w:sz="0" w:space="0" w:color="000000"/>
+            </w:tcBorders>
+            <w:shd w:val="clear" w:color="auto" w:fill="FFFFFF"/>
+            <w:tcMar>
+              <w:top w:w="0" w:type="dxa"/>
+              <w:bottom w:w="0" w:type="dxa"/>
+              <w:left w:w="0" w:type="dxa"/>
+              <w:right w:w="0" w:type="dxa"/>
+            </w:tcMar>
+            <w:vAlign w:val="top"/>
+          </w:tcPr>
+          <w:p>
+            <w:pPr>
+              <w:pStyle w:val="Normal"/>
+              <w:jc w:val="left"/>
+              <w:pBdr>
+                <w:bottom w:val="none" w:sz="0" w:space="0" w:color="000000"/>
+                <w:top w:val="none" w:sz="0" w:space="0" w:color="000000"/>
+                <w:left w:val="none" w:sz="0" w:space="0" w:color="000000"/>
+                <w:right w:val="none" w:sz="0" w:space="0" w:color="000000"/>
+              </w:pBdr>
+              <w:spacing w:after="100" w:before="100" w:line="240"/>
+              <w:ind w:left="100" w:right="100" w:firstLine="0" w:firstLineChars="0"/>
+              <w:rPr>
+                <w:rFonts w:ascii="Arial" w:hAnsi="Arial" w:eastAsia="Arial" w:cs="Arial"/>
+                <w:i w:val="false"/>
+                <w:b w:val="false"/>
+                <w:u w:val="none"/>
+                <w:strike w:val="false"/>
+                <w:sz w:val="20"/>
+                <w:szCs w:val="20"/>
+                <w:color w:val="000000"/>
+              </w:rPr>
+            </w:pPr>
+            <w:r>
+              <w:rPr>
+                <w:rFonts w:ascii="Arial" w:hAnsi="Arial" w:eastAsia="Arial" w:cs="Arial"/>
+                <w:i w:val="false"/>
+                <w:b w:val="false"/>
+                <w:u w:val="none"/>
+                <w:strike w:val="false"/>
+                <w:sz w:val="20"/>
+                <w:szCs w:val="20"/>
+                <w:color w:val="000000"/>
+              </w:rPr>
+              <w:t xml:space="preserve">26</w:t>
+            </w:r>
+          </w:p>
+        </w:tc>
+        <w:tc>
+          <w:tcPr>
+            <w:tcBorders>
+              <w:bottom w:val="none" w:sz="0" w:space="0" w:color="000000"/>
+              <w:top w:val="none" w:sz="0" w:space="0" w:color="000000"/>
+              <w:left w:val="none" w:sz="0" w:space="0" w:color="000000"/>
+              <w:right w:val="none" w:sz="0" w:space="0" w:color="000000"/>
+            </w:tcBorders>
+            <w:shd w:val="clear" w:color="auto" w:fill="FFFFFF"/>
+            <w:tcMar>
+              <w:top w:w="0" w:type="dxa"/>
+              <w:bottom w:w="0" w:type="dxa"/>
+              <w:left w:w="0" w:type="dxa"/>
+              <w:right w:w="0" w:type="dxa"/>
+            </w:tcMar>
+            <w:vAlign w:val="top"/>
+          </w:tcPr>
+          <w:p>
+            <w:pPr>
+              <w:pStyle w:val="Normal"/>
+              <w:jc w:val="left"/>
+              <w:pBdr>
+                <w:bottom w:val="none" w:sz="0" w:space="0" w:color="000000"/>
+                <w:top w:val="none" w:sz="0" w:space="0" w:color="000000"/>
+                <w:left w:val="none" w:sz="0" w:space="0" w:color="000000"/>
+                <w:right w:val="none" w:sz="0" w:space="0" w:color="000000"/>
+              </w:pBdr>
+              <w:spacing w:after="100" w:before="100" w:line="240"/>
+              <w:ind w:left="100" w:right="100" w:firstLine="0" w:firstLineChars="0"/>
+              <w:rPr>
+                <w:rFonts w:ascii="Arial" w:hAnsi="Arial" w:eastAsia="Arial" w:cs="Arial"/>
+                <w:i w:val="false"/>
+                <w:b w:val="false"/>
+                <w:u w:val="none"/>
+                <w:strike w:val="false"/>
+                <w:sz w:val="20"/>
+                <w:szCs w:val="20"/>
+                <w:color w:val="000000"/>
+              </w:rPr>
+            </w:pPr>
+            <w:r>
+              <w:rPr>
+                <w:rFonts w:ascii="Arial" w:hAnsi="Arial" w:eastAsia="Arial" w:cs="Arial"/>
+                <w:i w:val="false"/>
+                <w:b w:val="false"/>
+                <w:u w:val="none"/>
+                <w:strike w:val="false"/>
+                <w:sz w:val="20"/>
+                <w:szCs w:val="20"/>
+                <w:color w:val="000000"/>
+              </w:rPr>
+              <w:t xml:space="preserve">0.09</w:t>
+            </w:r>
+          </w:p>
+        </w:tc>
+        <w:tc>
+          <w:tcPr>
+            <w:tcBorders>
+              <w:bottom w:val="none" w:sz="0" w:space="0" w:color="000000"/>
+              <w:top w:val="none" w:sz="0" w:space="0" w:color="000000"/>
+              <w:left w:val="none" w:sz="0" w:space="0" w:color="000000"/>
+              <w:right w:val="none" w:sz="0" w:space="0" w:color="000000"/>
+            </w:tcBorders>
+            <w:shd w:val="clear" w:color="auto" w:fill="FFFFFF"/>
+            <w:tcMar>
+              <w:top w:w="0" w:type="dxa"/>
+              <w:bottom w:w="0" w:type="dxa"/>
+              <w:left w:w="0" w:type="dxa"/>
+              <w:right w:w="0" w:type="dxa"/>
+            </w:tcMar>
+            <w:vAlign w:val="top"/>
+          </w:tcPr>
+          <w:p>
+            <w:pPr>
+              <w:pStyle w:val="Normal"/>
+              <w:jc w:val="left"/>
+              <w:pBdr>
+                <w:bottom w:val="none" w:sz="0" w:space="0" w:color="000000"/>
+                <w:top w:val="none" w:sz="0" w:space="0" w:color="000000"/>
+                <w:left w:val="none" w:sz="0" w:space="0" w:color="000000"/>
+                <w:right w:val="none" w:sz="0" w:space="0" w:color="000000"/>
+              </w:pBdr>
+              <w:spacing w:after="100" w:before="100" w:line="240"/>
+              <w:ind w:left="100" w:right="100" w:firstLine="0" w:firstLineChars="0"/>
+              <w:rPr>
+                <w:rFonts w:ascii="Arial" w:hAnsi="Arial" w:eastAsia="Arial" w:cs="Arial"/>
+                <w:i w:val="false"/>
+                <w:b w:val="false"/>
+                <w:u w:val="none"/>
+                <w:strike w:val="false"/>
+                <w:sz w:val="20"/>
+                <w:szCs w:val="20"/>
+                <w:color w:val="000000"/>
+              </w:rPr>
+            </w:pPr>
+            <w:r>
+              <w:rPr>
+                <w:rFonts w:ascii="Arial" w:hAnsi="Arial" w:eastAsia="Arial" w:cs="Arial"/>
+                <w:i w:val="false"/>
+                <w:b w:val="false"/>
+                <w:u w:val="none"/>
+                <w:strike w:val="false"/>
+                <w:sz w:val="20"/>
+                <w:szCs w:val="20"/>
+                <w:color w:val="000000"/>
+              </w:rPr>
+              <w:t xml:space="preserve">0.07</w:t>
+            </w:r>
+          </w:p>
+        </w:tc>
+        <w:tc>
+          <w:tcPr>
+            <w:tcBorders>
+              <w:bottom w:val="none" w:sz="0" w:space="0" w:color="000000"/>
+              <w:top w:val="none" w:sz="0" w:space="0" w:color="000000"/>
+              <w:left w:val="none" w:sz="0" w:space="0" w:color="000000"/>
+              <w:right w:val="none" w:sz="0" w:space="0" w:color="000000"/>
+            </w:tcBorders>
+            <w:shd w:val="clear" w:color="auto" w:fill="FFFFFF"/>
+            <w:tcMar>
+              <w:top w:w="0" w:type="dxa"/>
+              <w:bottom w:w="0" w:type="dxa"/>
+              <w:left w:w="0" w:type="dxa"/>
+              <w:right w:w="0" w:type="dxa"/>
+            </w:tcMar>
+            <w:vAlign w:val="top"/>
+          </w:tcPr>
+          <w:p>
+            <w:pPr>
+              <w:pStyle w:val="Normal"/>
+              <w:jc w:val="left"/>
+              <w:pBdr>
+                <w:bottom w:val="none" w:sz="0" w:space="0" w:color="000000"/>
+                <w:top w:val="none" w:sz="0" w:space="0" w:color="000000"/>
+                <w:left w:val="none" w:sz="0" w:space="0" w:color="000000"/>
+                <w:right w:val="none" w:sz="0" w:space="0" w:color="000000"/>
+              </w:pBdr>
+              <w:spacing w:after="100" w:before="100" w:line="240"/>
+              <w:ind w:left="100" w:right="100" w:firstLine="0" w:firstLineChars="0"/>
+              <w:rPr>
+                <w:rFonts w:ascii="Arial" w:hAnsi="Arial" w:eastAsia="Arial" w:cs="Arial"/>
+                <w:i w:val="false"/>
+                <w:b w:val="false"/>
+                <w:u w:val="none"/>
+                <w:strike w:val="false"/>
+                <w:sz w:val="20"/>
+                <w:szCs w:val="20"/>
+                <w:color w:val="000000"/>
+              </w:rPr>
+            </w:pPr>
+            <w:r>
+              <w:rPr>
+                <w:rFonts w:ascii="Arial" w:hAnsi="Arial" w:eastAsia="Arial" w:cs="Arial"/>
+                <w:i w:val="false"/>
+                <w:b w:val="false"/>
+                <w:u w:val="none"/>
+                <w:strike w:val="false"/>
+                <w:sz w:val="20"/>
+                <w:szCs w:val="20"/>
+                <w:color w:val="000000"/>
+              </w:rPr>
+              <w:t xml:space="preserve">0.00</w:t>
+            </w:r>
+          </w:p>
+        </w:tc>
+        <w:tc>
+          <w:tcPr>
+            <w:tcBorders>
+              <w:bottom w:val="none" w:sz="0" w:space="0" w:color="000000"/>
+              <w:top w:val="none" w:sz="0" w:space="0" w:color="000000"/>
+              <w:left w:val="none" w:sz="0" w:space="0" w:color="000000"/>
+              <w:right w:val="none" w:sz="0" w:space="0" w:color="000000"/>
+            </w:tcBorders>
+            <w:shd w:val="clear" w:color="auto" w:fill="FFFFFF"/>
+            <w:tcMar>
+              <w:top w:w="0" w:type="dxa"/>
+              <w:bottom w:w="0" w:type="dxa"/>
+              <w:left w:w="0" w:type="dxa"/>
+              <w:right w:w="0" w:type="dxa"/>
+            </w:tcMar>
+            <w:vAlign w:val="top"/>
+          </w:tcPr>
+          <w:p>
+            <w:pPr>
+              <w:pStyle w:val="Normal"/>
+              <w:jc w:val="left"/>
+              <w:pBdr>
+                <w:bottom w:val="none" w:sz="0" w:space="0" w:color="000000"/>
+                <w:top w:val="none" w:sz="0" w:space="0" w:color="000000"/>
+                <w:left w:val="none" w:sz="0" w:space="0" w:color="000000"/>
+                <w:right w:val="none" w:sz="0" w:space="0" w:color="000000"/>
+              </w:pBdr>
+              <w:spacing w:after="100" w:before="100" w:line="240"/>
+              <w:ind w:left="100" w:right="100" w:firstLine="0" w:firstLineChars="0"/>
+              <w:rPr>
+                <w:rFonts w:ascii="Arial" w:hAnsi="Arial" w:eastAsia="Arial" w:cs="Arial"/>
+                <w:i w:val="false"/>
+                <w:b w:val="false"/>
+                <w:u w:val="none"/>
+                <w:strike w:val="false"/>
+                <w:sz w:val="20"/>
+                <w:szCs w:val="20"/>
+                <w:color w:val="000000"/>
+              </w:rPr>
+            </w:pPr>
+            <w:r>
+              <w:rPr>
+                <w:rFonts w:ascii="Arial" w:hAnsi="Arial" w:eastAsia="Arial" w:cs="Arial"/>
+                <w:i w:val="false"/>
+                <w:b w:val="false"/>
+                <w:u w:val="none"/>
+                <w:strike w:val="false"/>
+                <w:sz w:val="20"/>
+                <w:szCs w:val="20"/>
+                <w:color w:val="000000"/>
+              </w:rPr>
+              <w:t xml:space="preserve">0.30</w:t>
+            </w:r>
+          </w:p>
+        </w:tc>
+      </w:tr>
+      <w:tr>
+        <w:trPr>
+          <w:trHeight w:val="612" w:hRule="auto"/>
+        </w:trPr>
+        <w:tc>
+          <w:tcPr>
+            <w:tcBorders>
+              <w:bottom w:val="single" w:sz="12" w:space="0" w:color="666666"/>
+              <w:top w:val="none" w:sz="0" w:space="0" w:color="000000"/>
+              <w:left w:val="none" w:sz="0" w:space="0" w:color="000000"/>
+              <w:right w:val="none" w:sz="0" w:space="0" w:color="000000"/>
+            </w:tcBorders>
+            <w:shd w:val="clear" w:color="auto" w:fill="FFFFFF"/>
+            <w:tcMar>
+              <w:top w:w="0" w:type="dxa"/>
+              <w:bottom w:w="0" w:type="dxa"/>
+              <w:left w:w="0" w:type="dxa"/>
+              <w:right w:w="0" w:type="dxa"/>
+            </w:tcMar>
+            <w:vAlign w:val="top"/>
+          </w:tcPr>
+          <w:p>
+            <w:pPr>
+              <w:pStyle w:val="Normal"/>
+              <w:jc w:val="left"/>
+              <w:pBdr>
+                <w:bottom w:val="none" w:sz="0" w:space="0" w:color="000000"/>
+                <w:top w:val="none" w:sz="0" w:space="0" w:color="000000"/>
+                <w:left w:val="none" w:sz="0" w:space="0" w:color="000000"/>
+                <w:right w:val="none" w:sz="0" w:space="0" w:color="000000"/>
+              </w:pBdr>
+              <w:spacing w:after="100" w:before="100" w:line="240"/>
+              <w:ind w:left="100" w:right="100" w:firstLine="0" w:firstLineChars="0"/>
+              <w:rPr>
+                <w:rFonts w:ascii="Arial" w:hAnsi="Arial" w:eastAsia="Arial" w:cs="Arial"/>
+                <w:i w:val="false"/>
+                <w:b w:val="false"/>
+                <w:u w:val="none"/>
+                <w:strike w:val="false"/>
+                <w:sz w:val="20"/>
+                <w:szCs w:val="20"/>
+                <w:color w:val="000000"/>
+              </w:rPr>
+            </w:pPr>
+            <w:r>
+              <w:rPr>
+                <w:rFonts w:ascii="Arial" w:hAnsi="Arial" w:eastAsia="Arial" w:cs="Arial"/>
+                <w:i w:val="false"/>
+                <w:b w:val="false"/>
+                <w:u w:val="none"/>
+                <w:strike w:val="false"/>
+                <w:sz w:val="20"/>
+                <w:szCs w:val="20"/>
+                <w:color w:val="000000"/>
+              </w:rPr>
+              <w:t xml:space="preserve">Maximum overlap</w:t>
+            </w:r>
+          </w:p>
+        </w:tc>
+        <w:tc>
+          <w:tcPr>
+            <w:tcBorders>
+              <w:bottom w:val="single" w:sz="12" w:space="0" w:color="666666"/>
+              <w:top w:val="none" w:sz="0" w:space="0" w:color="000000"/>
+              <w:left w:val="none" w:sz="0" w:space="0" w:color="000000"/>
+              <w:right w:val="none" w:sz="0" w:space="0" w:color="000000"/>
+            </w:tcBorders>
+            <w:shd w:val="clear" w:color="auto" w:fill="FFFFFF"/>
+            <w:tcMar>
+              <w:top w:w="0" w:type="dxa"/>
+              <w:bottom w:w="0" w:type="dxa"/>
+              <w:left w:w="0" w:type="dxa"/>
+              <w:right w:w="0" w:type="dxa"/>
+            </w:tcMar>
+            <w:vAlign w:val="top"/>
+          </w:tcPr>
+          <w:p>
+            <w:pPr>
+              <w:pStyle w:val="Normal"/>
+              <w:jc w:val="left"/>
+              <w:pBdr>
+                <w:bottom w:val="none" w:sz="0" w:space="0" w:color="000000"/>
+                <w:top w:val="none" w:sz="0" w:space="0" w:color="000000"/>
+                <w:left w:val="none" w:sz="0" w:space="0" w:color="000000"/>
+                <w:right w:val="none" w:sz="0" w:space="0" w:color="000000"/>
+              </w:pBdr>
+              <w:spacing w:after="100" w:before="100" w:line="240"/>
+              <w:ind w:left="100" w:right="100" w:firstLine="0" w:firstLineChars="0"/>
+              <w:rPr>
+                <w:rFonts w:ascii="Arial" w:hAnsi="Arial" w:eastAsia="Arial" w:cs="Arial"/>
+                <w:i w:val="false"/>
+                <w:b w:val="false"/>
+                <w:u w:val="none"/>
+                <w:strike w:val="false"/>
+                <w:sz w:val="20"/>
+                <w:szCs w:val="20"/>
+                <w:color w:val="000000"/>
+              </w:rPr>
+            </w:pPr>
+            <w:r>
+              <w:rPr>
+                <w:rFonts w:ascii="Arial" w:hAnsi="Arial" w:eastAsia="Arial" w:cs="Arial"/>
+                <w:i w:val="false"/>
+                <w:b w:val="false"/>
+                <w:u w:val="none"/>
+                <w:strike w:val="false"/>
+                <w:sz w:val="20"/>
+                <w:szCs w:val="20"/>
+                <w:color w:val="000000"/>
+              </w:rPr>
+              <w:t xml:space="preserve">30</w:t>
+            </w:r>
+          </w:p>
+        </w:tc>
+        <w:tc>
+          <w:tcPr>
+            <w:tcBorders>
+              <w:bottom w:val="single" w:sz="12" w:space="0" w:color="666666"/>
+              <w:top w:val="none" w:sz="0" w:space="0" w:color="000000"/>
+              <w:left w:val="none" w:sz="0" w:space="0" w:color="000000"/>
+              <w:right w:val="none" w:sz="0" w:space="0" w:color="000000"/>
+            </w:tcBorders>
+            <w:shd w:val="clear" w:color="auto" w:fill="FFFFFF"/>
+            <w:tcMar>
+              <w:top w:w="0" w:type="dxa"/>
+              <w:bottom w:w="0" w:type="dxa"/>
+              <w:left w:w="0" w:type="dxa"/>
+              <w:right w:w="0" w:type="dxa"/>
+            </w:tcMar>
+            <w:vAlign w:val="top"/>
+          </w:tcPr>
+          <w:p>
+            <w:pPr>
+              <w:pStyle w:val="Normal"/>
+              <w:jc w:val="left"/>
+              <w:pBdr>
+                <w:bottom w:val="none" w:sz="0" w:space="0" w:color="000000"/>
+                <w:top w:val="none" w:sz="0" w:space="0" w:color="000000"/>
+                <w:left w:val="none" w:sz="0" w:space="0" w:color="000000"/>
+                <w:right w:val="none" w:sz="0" w:space="0" w:color="000000"/>
+              </w:pBdr>
+              <w:spacing w:after="100" w:before="100" w:line="240"/>
+              <w:ind w:left="100" w:right="100" w:firstLine="0" w:firstLineChars="0"/>
+              <w:rPr>
+                <w:rFonts w:ascii="Arial" w:hAnsi="Arial" w:eastAsia="Arial" w:cs="Arial"/>
+                <w:i w:val="false"/>
+                <w:b w:val="false"/>
+                <w:u w:val="none"/>
+                <w:strike w:val="false"/>
+                <w:sz w:val="20"/>
+                <w:szCs w:val="20"/>
+                <w:color w:val="000000"/>
+              </w:rPr>
+            </w:pPr>
+            <w:r>
+              <w:rPr>
+                <w:rFonts w:ascii="Arial" w:hAnsi="Arial" w:eastAsia="Arial" w:cs="Arial"/>
+                <w:i w:val="false"/>
+                <w:b w:val="false"/>
+                <w:u w:val="none"/>
+                <w:strike w:val="false"/>
+                <w:sz w:val="20"/>
+                <w:szCs w:val="20"/>
+                <w:color w:val="000000"/>
+              </w:rPr>
+              <w:t xml:space="preserve">0.56</w:t>
+            </w:r>
+          </w:p>
+        </w:tc>
+        <w:tc>
+          <w:tcPr>
+            <w:tcBorders>
+              <w:bottom w:val="single" w:sz="12" w:space="0" w:color="666666"/>
+              <w:top w:val="none" w:sz="0" w:space="0" w:color="000000"/>
+              <w:left w:val="none" w:sz="0" w:space="0" w:color="000000"/>
+              <w:right w:val="none" w:sz="0" w:space="0" w:color="000000"/>
+            </w:tcBorders>
+            <w:shd w:val="clear" w:color="auto" w:fill="FFFFFF"/>
+            <w:tcMar>
+              <w:top w:w="0" w:type="dxa"/>
+              <w:bottom w:w="0" w:type="dxa"/>
+              <w:left w:w="0" w:type="dxa"/>
+              <w:right w:w="0" w:type="dxa"/>
+            </w:tcMar>
+            <w:vAlign w:val="top"/>
+          </w:tcPr>
+          <w:p>
+            <w:pPr>
+              <w:pStyle w:val="Normal"/>
+              <w:jc w:val="left"/>
+              <w:pBdr>
+                <w:bottom w:val="none" w:sz="0" w:space="0" w:color="000000"/>
+                <w:top w:val="none" w:sz="0" w:space="0" w:color="000000"/>
+                <w:left w:val="none" w:sz="0" w:space="0" w:color="000000"/>
+                <w:right w:val="none" w:sz="0" w:space="0" w:color="000000"/>
+              </w:pBdr>
+              <w:spacing w:after="100" w:before="100" w:line="240"/>
+              <w:ind w:left="100" w:right="100" w:firstLine="0" w:firstLineChars="0"/>
+              <w:rPr>
+                <w:rFonts w:ascii="Arial" w:hAnsi="Arial" w:eastAsia="Arial" w:cs="Arial"/>
+                <w:i w:val="false"/>
+                <w:b w:val="false"/>
+                <w:u w:val="none"/>
+                <w:strike w:val="false"/>
+                <w:sz w:val="20"/>
+                <w:szCs w:val="20"/>
+                <w:color w:val="000000"/>
+              </w:rPr>
+            </w:pPr>
+            <w:r>
+              <w:rPr>
+                <w:rFonts w:ascii="Arial" w:hAnsi="Arial" w:eastAsia="Arial" w:cs="Arial"/>
+                <w:i w:val="false"/>
+                <w:b w:val="false"/>
+                <w:u w:val="none"/>
+                <w:strike w:val="false"/>
+                <w:sz w:val="20"/>
+                <w:szCs w:val="20"/>
+                <w:color w:val="000000"/>
+              </w:rPr>
+              <w:t xml:space="preserve">0.50</w:t>
+            </w:r>
+          </w:p>
+        </w:tc>
+        <w:tc>
+          <w:tcPr>
+            <w:tcBorders>
+              <w:bottom w:val="single" w:sz="12" w:space="0" w:color="666666"/>
+              <w:top w:val="none" w:sz="0" w:space="0" w:color="000000"/>
+              <w:left w:val="none" w:sz="0" w:space="0" w:color="000000"/>
+              <w:right w:val="none" w:sz="0" w:space="0" w:color="000000"/>
+            </w:tcBorders>
+            <w:shd w:val="clear" w:color="auto" w:fill="FFFFFF"/>
+            <w:tcMar>
+              <w:top w:w="0" w:type="dxa"/>
+              <w:bottom w:w="0" w:type="dxa"/>
+              <w:left w:w="0" w:type="dxa"/>
+              <w:right w:w="0" w:type="dxa"/>
+            </w:tcMar>
+            <w:vAlign w:val="top"/>
+          </w:tcPr>
+          <w:p>
+            <w:pPr>
+              <w:pStyle w:val="Normal"/>
+              <w:jc w:val="left"/>
+              <w:pBdr>
+                <w:bottom w:val="none" w:sz="0" w:space="0" w:color="000000"/>
+                <w:top w:val="none" w:sz="0" w:space="0" w:color="000000"/>
+                <w:left w:val="none" w:sz="0" w:space="0" w:color="000000"/>
+                <w:right w:val="none" w:sz="0" w:space="0" w:color="000000"/>
+              </w:pBdr>
+              <w:spacing w:after="100" w:before="100" w:line="240"/>
+              <w:ind w:left="100" w:right="100" w:firstLine="0" w:firstLineChars="0"/>
+              <w:rPr>
+                <w:rFonts w:ascii="Arial" w:hAnsi="Arial" w:eastAsia="Arial" w:cs="Arial"/>
+                <w:i w:val="false"/>
+                <w:b w:val="false"/>
+                <w:u w:val="none"/>
+                <w:strike w:val="false"/>
+                <w:sz w:val="20"/>
+                <w:szCs w:val="20"/>
+                <w:color w:val="000000"/>
+              </w:rPr>
+            </w:pPr>
+            <w:r>
+              <w:rPr>
+                <w:rFonts w:ascii="Arial" w:hAnsi="Arial" w:eastAsia="Arial" w:cs="Arial"/>
+                <w:i w:val="false"/>
+                <w:b w:val="false"/>
+                <w:u w:val="none"/>
+                <w:strike w:val="false"/>
+                <w:sz w:val="20"/>
+                <w:szCs w:val="20"/>
+                <w:color w:val="000000"/>
+              </w:rPr>
+              <w:t xml:space="preserve">0.13</w:t>
+            </w:r>
+          </w:p>
+        </w:tc>
+        <w:tc>
+          <w:tcPr>
+            <w:tcBorders>
+              <w:bottom w:val="single" w:sz="12" w:space="0" w:color="666666"/>
+              <w:top w:val="none" w:sz="0" w:space="0" w:color="000000"/>
+              <w:left w:val="none" w:sz="0" w:space="0" w:color="000000"/>
+              <w:right w:val="none" w:sz="0" w:space="0" w:color="000000"/>
+            </w:tcBorders>
+            <w:shd w:val="clear" w:color="auto" w:fill="FFFFFF"/>
+            <w:tcMar>
+              <w:top w:w="0" w:type="dxa"/>
+              <w:bottom w:w="0" w:type="dxa"/>
+              <w:left w:w="0" w:type="dxa"/>
+              <w:right w:w="0" w:type="dxa"/>
+            </w:tcMar>
+            <w:vAlign w:val="top"/>
+          </w:tcPr>
+          <w:p>
+            <w:pPr>
+              <w:pStyle w:val="Normal"/>
+              <w:jc w:val="left"/>
+              <w:pBdr>
+                <w:bottom w:val="none" w:sz="0" w:space="0" w:color="000000"/>
+                <w:top w:val="none" w:sz="0" w:space="0" w:color="000000"/>
+                <w:left w:val="none" w:sz="0" w:space="0" w:color="000000"/>
+                <w:right w:val="none" w:sz="0" w:space="0" w:color="000000"/>
+              </w:pBdr>
+              <w:spacing w:after="100" w:before="100" w:line="240"/>
+              <w:ind w:left="100" w:right="100" w:firstLine="0" w:firstLineChars="0"/>
+              <w:rPr>
+                <w:rFonts w:ascii="Arial" w:hAnsi="Arial" w:eastAsia="Arial" w:cs="Arial"/>
+                <w:i w:val="false"/>
+                <w:b w:val="false"/>
+                <w:u w:val="none"/>
+                <w:strike w:val="false"/>
+                <w:sz w:val="20"/>
+                <w:szCs w:val="20"/>
+                <w:color w:val="000000"/>
+              </w:rPr>
+            </w:pPr>
+            <w:r>
+              <w:rPr>
+                <w:rFonts w:ascii="Arial" w:hAnsi="Arial" w:eastAsia="Arial" w:cs="Arial"/>
+                <w:i w:val="false"/>
+                <w:b w:val="false"/>
+                <w:u w:val="none"/>
+                <w:strike w:val="false"/>
+                <w:sz w:val="20"/>
+                <w:szCs w:val="20"/>
+                <w:color w:val="000000"/>
+              </w:rPr>
+              <w:t xml:space="preserve">1.00</w:t>
             </w:r>
           </w:p>
         </w:tc>

</xml_diff>